<commit_message>
Agrega dashboard HTML de predicción de ventas
</commit_message>
<xml_diff>
--- a/Tarea_Prediccion_Ventas_MLNET_ModelBuilder.docx
+++ b/Tarea_Prediccion_Ventas_MLNET_ModelBuilder.docx
@@ -374,8 +374,16 @@
         </w:numPr>
       </w:pPr>
       <w:r>
-        <w:t>Revisar Repo: https://github.com/gmolina75/PrediccionVentas-MLNET-PowerBI</w:t>
-      </w:r>
+        <w:t xml:space="preserve">Revisar Repo: </w:t>
+      </w:r>
+      <w:hyperlink r:id="rId8" w:history="1">
+        <w:r>
+          <w:rPr>
+            <w:rStyle w:val="Hyperlink"/>
+          </w:rPr>
+          <w:t>https://github.com/gmolina75/PrediccionVentas-MLNET-PowerBI</w:t>
+        </w:r>
+      </w:hyperlink>
     </w:p>
     <w:p>
       <w:pPr>
@@ -386,7 +394,42 @@
         </w:numPr>
       </w:pPr>
       <w:r>
-        <w:t>Instalar Visual Studio.net</w:t>
+        <w:t xml:space="preserve">Instalar Visual </w:t>
+      </w:r>
+      <w:proofErr w:type="gramStart"/>
+      <w:r>
+        <w:t>Studio.net</w:t>
+      </w:r>
+      <w:r>
+        <w:t xml:space="preserve">  (</w:t>
+      </w:r>
+      <w:proofErr w:type="gramEnd"/>
+      <w:r>
+        <w:fldChar w:fldCharType="begin"/>
+      </w:r>
+      <w:r>
+        <w:instrText>HYPERLINK "https://docs.google.com/document/d/1XgnTRQ6FcvNWjedVrU0Ez4Eq49GYsSeX/edit?usp=sharing&amp;ouid=113151263569452840243&amp;rtpof=true&amp;sd=true"</w:instrText>
+      </w:r>
+      <w:r>
+        <w:fldChar w:fldCharType="separate"/>
+      </w:r>
+      <w:r>
+        <w:rPr>
+          <w:rStyle w:val="Hyperlink"/>
+        </w:rPr>
+        <w:t xml:space="preserve">Ver Guia de </w:t>
+      </w:r>
+      <w:r>
+        <w:rPr>
+          <w:rStyle w:val="Hyperlink"/>
+        </w:rPr>
+        <w:t>Instalación</w:t>
+      </w:r>
+      <w:r>
+        <w:fldChar w:fldCharType="end"/>
+      </w:r>
+      <w:r>
+        <w:t>)</w:t>
       </w:r>
     </w:p>
     <w:p>
@@ -411,6 +454,9 @@
       <w:r>
         <w:t xml:space="preserve"> </w:t>
       </w:r>
+      <w:r>
+        <w:t>(opcional)</w:t>
+      </w:r>
     </w:p>
     <w:p>
       <w:pPr>
@@ -465,13 +511,27 @@
       <w:r>
         <w:t xml:space="preserve"> con correo institucional</w:t>
       </w:r>
+      <w:r>
+        <w:t xml:space="preserve"> (opcional)</w:t>
+      </w:r>
+    </w:p>
+    <w:p/>
+    <w:p/>
+    <w:p>
+      <w:pPr>
+        <w:pStyle w:val="Heading1"/>
+      </w:pPr>
+      <w:r>
+        <w:lastRenderedPageBreak/>
+        <w:t>3. Competencias a desarrollar</w:t>
+      </w:r>
     </w:p>
     <w:p>
       <w:pPr>
-        <w:pStyle w:val="Heading1"/>
-      </w:pPr>
-      <w:r>
-        <w:t>3. Competencias a desarrollar</w:t>
+        <w:pStyle w:val="ListBullet"/>
+      </w:pPr>
+      <w:r>
+        <w:t>Diseñar un conjunto de datos sintético con estructura realista de ventas.</w:t>
       </w:r>
     </w:p>
     <w:p>
@@ -479,7 +539,7 @@
         <w:pStyle w:val="ListBullet"/>
       </w:pPr>
       <w:r>
-        <w:t>Diseñar un conjunto de datos sintético con estructura realista de ventas.</w:t>
+        <w:t>Comprender el flujo básico de entrenamiento de un modelo predictivo.</w:t>
       </w:r>
     </w:p>
     <w:p>
@@ -487,7 +547,15 @@
         <w:pStyle w:val="ListBullet"/>
       </w:pPr>
       <w:r>
-        <w:t>Comprender el flujo básico de entrenamiento de un modelo predictivo.</w:t>
+        <w:t xml:space="preserve">Utilizar ML.NET Model </w:t>
+      </w:r>
+      <w:proofErr w:type="spellStart"/>
+      <w:r>
+        <w:t>Builder</w:t>
+      </w:r>
+      <w:proofErr w:type="spellEnd"/>
+      <w:r>
+        <w:t xml:space="preserve"> para generar un modelo sin profundizar en programación.</w:t>
       </w:r>
     </w:p>
     <w:p>
@@ -495,16 +563,7 @@
         <w:pStyle w:val="ListBullet"/>
       </w:pPr>
       <w:r>
-        <w:lastRenderedPageBreak/>
-        <w:t xml:space="preserve">Utilizar ML.NET Model </w:t>
-      </w:r>
-      <w:proofErr w:type="spellStart"/>
-      <w:r>
-        <w:t>Builder</w:t>
-      </w:r>
-      <w:proofErr w:type="spellEnd"/>
-      <w:r>
-        <w:t xml:space="preserve"> para generar un modelo sin profundizar en programación.</w:t>
+        <w:t>Comparar ventas reales y ventas predichas.</w:t>
       </w:r>
     </w:p>
     <w:p>
@@ -512,23 +571,31 @@
         <w:pStyle w:val="ListBullet"/>
       </w:pPr>
       <w:r>
-        <w:t>Comparar ventas reales y ventas predichas.</w:t>
+        <w:t>Comunicar resultados mediante gráficos, indicadores y conclusiones de negocio.</w:t>
       </w:r>
     </w:p>
     <w:p>
       <w:pPr>
-        <w:pStyle w:val="ListBullet"/>
-      </w:pPr>
-      <w:r>
-        <w:t>Comunicar resultados mediante gráficos, indicadores y conclusiones de negocio.</w:t>
+        <w:pStyle w:val="Heading1"/>
+      </w:pPr>
+      <w:r>
+        <w:t>4. Instrucciones generales</w:t>
       </w:r>
     </w:p>
     <w:p>
       <w:pPr>
-        <w:pStyle w:val="Heading1"/>
-      </w:pPr>
-      <w:r>
-        <w:t>4. Instrucciones generales</w:t>
+        <w:pStyle w:val="ListNumber"/>
+      </w:pPr>
+      <w:r>
+        <w:t xml:space="preserve">Generar una base de datos sintética de ventas usando un </w:t>
+      </w:r>
+      <w:proofErr w:type="spellStart"/>
+      <w:r>
+        <w:t>prompt</w:t>
+      </w:r>
+      <w:proofErr w:type="spellEnd"/>
+      <w:r>
+        <w:t xml:space="preserve"> de IA.</w:t>
       </w:r>
     </w:p>
     <w:p>
@@ -536,15 +603,7 @@
         <w:pStyle w:val="ListNumber"/>
       </w:pPr>
       <w:r>
-        <w:t xml:space="preserve">Generar una base de datos sintética de ventas usando un </w:t>
-      </w:r>
-      <w:proofErr w:type="spellStart"/>
-      <w:r>
-        <w:t>prompt</w:t>
-      </w:r>
-      <w:proofErr w:type="spellEnd"/>
-      <w:r>
-        <w:t xml:space="preserve"> de IA.</w:t>
+        <w:t>Abrir la data en Excel y revisar que no existan valores vacíos, ventas negativas o errores de formato.</w:t>
       </w:r>
     </w:p>
     <w:p>
@@ -552,7 +611,7 @@
         <w:pStyle w:val="ListNumber"/>
       </w:pPr>
       <w:r>
-        <w:t>Abrir la data en Excel y revisar que no existan valores vacíos, ventas negativas o errores de formato.</w:t>
+        <w:t>Separar la información en datos de entrenamiento y datos de prueba. Para ventas, se recomienda entrenar con los primeros meses y probar con los últimos meses.</w:t>
       </w:r>
     </w:p>
     <w:p>
@@ -560,7 +619,15 @@
         <w:pStyle w:val="ListNumber"/>
       </w:pPr>
       <w:r>
-        <w:t>Separar la información en datos de entrenamiento y datos de prueba. Para ventas, se recomienda entrenar con los primeros meses y probar con los últimos meses.</w:t>
+        <w:t xml:space="preserve">Crear un proyecto en Visual Studio y usar ML.NET Model </w:t>
+      </w:r>
+      <w:proofErr w:type="spellStart"/>
+      <w:r>
+        <w:t>Builder</w:t>
+      </w:r>
+      <w:proofErr w:type="spellEnd"/>
+      <w:r>
+        <w:t xml:space="preserve"> para entrenar un modelo de predicción de valor.</w:t>
       </w:r>
     </w:p>
     <w:p>
@@ -568,15 +635,15 @@
         <w:pStyle w:val="ListNumber"/>
       </w:pPr>
       <w:r>
-        <w:t xml:space="preserve">Crear un proyecto en Visual Studio y usar ML.NET Model </w:t>
+        <w:t xml:space="preserve">Seleccionar la columna </w:t>
       </w:r>
       <w:proofErr w:type="spellStart"/>
       <w:r>
-        <w:t>Builder</w:t>
+        <w:t>total_sales</w:t>
       </w:r>
       <w:proofErr w:type="spellEnd"/>
       <w:r>
-        <w:t xml:space="preserve"> para entrenar un modelo de predicción de valor.</w:t>
+        <w:t xml:space="preserve"> como variable a predecir.</w:t>
       </w:r>
     </w:p>
     <w:p>
@@ -584,15 +651,7 @@
         <w:pStyle w:val="ListNumber"/>
       </w:pPr>
       <w:r>
-        <w:t xml:space="preserve">Seleccionar la columna </w:t>
-      </w:r>
-      <w:proofErr w:type="spellStart"/>
-      <w:r>
-        <w:t>total_sales</w:t>
-      </w:r>
-      <w:proofErr w:type="spellEnd"/>
-      <w:r>
-        <w:t xml:space="preserve"> como variable a predecir.</w:t>
+        <w:t>Revisar las métricas del modelo generado.</w:t>
       </w:r>
     </w:p>
     <w:p>
@@ -600,7 +659,7 @@
         <w:pStyle w:val="ListNumber"/>
       </w:pPr>
       <w:r>
-        <w:t>Revisar las métricas del modelo generado.</w:t>
+        <w:t>Generar un archivo con ventas reales, ventas predichas, diferencia y porcentaje de error.</w:t>
       </w:r>
     </w:p>
     <w:p>
@@ -608,7 +667,15 @@
         <w:pStyle w:val="ListNumber"/>
       </w:pPr>
       <w:r>
-        <w:t>Generar un archivo con ventas reales, ventas predichas, diferencia y porcentaje de error.</w:t>
+        <w:t xml:space="preserve">Construir un </w:t>
+      </w:r>
+      <w:proofErr w:type="spellStart"/>
+      <w:r>
+        <w:t>dashboard</w:t>
+      </w:r>
+      <w:proofErr w:type="spellEnd"/>
+      <w:r>
+        <w:t xml:space="preserve"> en Excel o Power BI.</w:t>
       </w:r>
     </w:p>
     <w:p>
@@ -616,54 +683,41 @@
         <w:pStyle w:val="ListNumber"/>
       </w:pPr>
       <w:r>
-        <w:t xml:space="preserve">Construir un </w:t>
-      </w:r>
-      <w:proofErr w:type="spellStart"/>
-      <w:r>
-        <w:t>dashboard</w:t>
-      </w:r>
-      <w:proofErr w:type="spellEnd"/>
-      <w:r>
-        <w:t xml:space="preserve"> en Excel o Power BI.</w:t>
+        <w:t>Presentar conclusiones de negocio basadas en los resultados obtenidos.</w:t>
       </w:r>
     </w:p>
     <w:p>
       <w:pPr>
-        <w:pStyle w:val="ListNumber"/>
-      </w:pPr>
-      <w:r>
-        <w:t>Presentar conclusiones de negocio basadas en los resultados obtenidos.</w:t>
+        <w:pStyle w:val="Heading1"/>
+      </w:pPr>
+      <w:r>
+        <w:t xml:space="preserve">5. </w:t>
+      </w:r>
+      <w:proofErr w:type="spellStart"/>
+      <w:r>
+        <w:t>Prompt</w:t>
+      </w:r>
+      <w:proofErr w:type="spellEnd"/>
+      <w:r>
+        <w:t xml:space="preserve"> base para generar la data sintética</w:t>
       </w:r>
     </w:p>
+    <w:p/>
     <w:p>
-      <w:pPr>
-        <w:pStyle w:val="Heading1"/>
-      </w:pPr>
-      <w:r>
-        <w:t xml:space="preserve">5. </w:t>
+      <w:r>
+        <w:t xml:space="preserve">El siguiente </w:t>
       </w:r>
       <w:proofErr w:type="spellStart"/>
       <w:r>
-        <w:t>Prompt</w:t>
+        <w:t>prompt</w:t>
       </w:r>
       <w:proofErr w:type="spellEnd"/>
       <w:r>
-        <w:t xml:space="preserve"> base para generar la data sintética</w:t>
+        <w:t xml:space="preserve"> puede ser usado como punto de partida. El estudiante puede mejorarlo, pero debe conservar la estructura mínima de datos solicitada.</w:t>
       </w:r>
     </w:p>
-    <w:p>
-      <w:r>
-        <w:t xml:space="preserve">El siguiente </w:t>
-      </w:r>
-      <w:proofErr w:type="spellStart"/>
-      <w:r>
-        <w:t>prompt</w:t>
-      </w:r>
-      <w:proofErr w:type="spellEnd"/>
-      <w:r>
-        <w:t xml:space="preserve"> puede ser usado como punto de partida. El estudiante puede mejorarlo, pero debe conservar la estructura mínima de datos solicitada.</w:t>
-      </w:r>
-    </w:p>
+    <w:p/>
+    <w:p/>
     <w:tbl>
       <w:tblPr>
         <w:tblW w:w="0" w:type="auto"/>
@@ -807,60 +861,66 @@
                 <w:sz w:val="17"/>
               </w:rPr>
               <w:br/>
-              <w:t>Incluye las siguientes columnas:</w:t>
-            </w:r>
+            </w:r>
+            <w:proofErr w:type="spellStart"/>
             <w:r>
               <w:rPr>
                 <w:rFonts w:ascii="Consolas" w:eastAsia="Consolas" w:hAnsi="Consolas"/>
                 <w:sz w:val="17"/>
-              </w:rPr>
-              <w:br/>
-            </w:r>
-            <w:proofErr w:type="spellStart"/>
+                <w:lang w:val="en-US"/>
+              </w:rPr>
+              <w:t>Incluye</w:t>
+            </w:r>
+            <w:proofErr w:type="spellEnd"/>
             <w:r>
               <w:rPr>
                 <w:rFonts w:ascii="Consolas" w:eastAsia="Consolas" w:hAnsi="Consolas"/>
                 <w:sz w:val="17"/>
-              </w:rPr>
-              <w:t>sale_id</w:t>
-            </w:r>
-            <w:proofErr w:type="spellEnd"/>
+                <w:lang w:val="en-US"/>
+              </w:rPr>
+              <w:t xml:space="preserve"> las </w:t>
+            </w:r>
+            <w:proofErr w:type="spellStart"/>
             <w:r>
               <w:rPr>
                 <w:rFonts w:ascii="Consolas" w:eastAsia="Consolas" w:hAnsi="Consolas"/>
                 <w:sz w:val="17"/>
-              </w:rPr>
-              <w:t xml:space="preserve">, </w:t>
-            </w:r>
-            <w:proofErr w:type="spellStart"/>
+                <w:lang w:val="en-US"/>
+              </w:rPr>
+              <w:t>siguientes</w:t>
+            </w:r>
+            <w:proofErr w:type="spellEnd"/>
             <w:r>
               <w:rPr>
                 <w:rFonts w:ascii="Consolas" w:eastAsia="Consolas" w:hAnsi="Consolas"/>
                 <w:sz w:val="17"/>
-              </w:rPr>
-              <w:t>sale_date</w:t>
-            </w:r>
-            <w:proofErr w:type="spellEnd"/>
+                <w:lang w:val="en-US"/>
+              </w:rPr>
+              <w:t xml:space="preserve"> columnas:</w:t>
+            </w:r>
             <w:r>
               <w:rPr>
                 <w:rFonts w:ascii="Consolas" w:eastAsia="Consolas" w:hAnsi="Consolas"/>
                 <w:sz w:val="17"/>
-              </w:rPr>
-              <w:t xml:space="preserve">, </w:t>
+                <w:lang w:val="en-US"/>
+              </w:rPr>
+              <w:br/>
             </w:r>
             <w:proofErr w:type="spellStart"/>
             <w:r>
               <w:rPr>
                 <w:rFonts w:ascii="Consolas" w:eastAsia="Consolas" w:hAnsi="Consolas"/>
                 <w:sz w:val="17"/>
-              </w:rPr>
-              <w:t>year_number</w:t>
+                <w:lang w:val="en-US"/>
+              </w:rPr>
+              <w:t>sale_id</w:t>
             </w:r>
             <w:proofErr w:type="spellEnd"/>
             <w:r>
               <w:rPr>
                 <w:rFonts w:ascii="Consolas" w:eastAsia="Consolas" w:hAnsi="Consolas"/>
                 <w:sz w:val="17"/>
+                <w:lang w:val="en-US"/>
               </w:rPr>
               <w:t xml:space="preserve">, </w:t>
             </w:r>
@@ -869,14 +929,16 @@
               <w:rPr>
                 <w:rFonts w:ascii="Consolas" w:eastAsia="Consolas" w:hAnsi="Consolas"/>
                 <w:sz w:val="17"/>
-              </w:rPr>
-              <w:t>month_number</w:t>
+                <w:lang w:val="en-US"/>
+              </w:rPr>
+              <w:t>sale_date</w:t>
             </w:r>
             <w:proofErr w:type="spellEnd"/>
             <w:r>
               <w:rPr>
                 <w:rFonts w:ascii="Consolas" w:eastAsia="Consolas" w:hAnsi="Consolas"/>
                 <w:sz w:val="17"/>
+                <w:lang w:val="en-US"/>
               </w:rPr>
               <w:t xml:space="preserve">, </w:t>
             </w:r>
@@ -885,14 +947,16 @@
               <w:rPr>
                 <w:rFonts w:ascii="Consolas" w:eastAsia="Consolas" w:hAnsi="Consolas"/>
                 <w:sz w:val="17"/>
-              </w:rPr>
-              <w:t>day_number</w:t>
+                <w:lang w:val="en-US"/>
+              </w:rPr>
+              <w:t>year_number</w:t>
             </w:r>
             <w:proofErr w:type="spellEnd"/>
             <w:r>
               <w:rPr>
                 <w:rFonts w:ascii="Consolas" w:eastAsia="Consolas" w:hAnsi="Consolas"/>
                 <w:sz w:val="17"/>
+                <w:lang w:val="en-US"/>
               </w:rPr>
               <w:t xml:space="preserve">, </w:t>
             </w:r>
@@ -901,69 +965,78 @@
               <w:rPr>
                 <w:rFonts w:ascii="Consolas" w:eastAsia="Consolas" w:hAnsi="Consolas"/>
                 <w:sz w:val="17"/>
-              </w:rPr>
-              <w:t>day_of_week</w:t>
+                <w:lang w:val="en-US"/>
+              </w:rPr>
+              <w:t>month_number</w:t>
             </w:r>
             <w:proofErr w:type="spellEnd"/>
             <w:r>
               <w:rPr>
                 <w:rFonts w:ascii="Consolas" w:eastAsia="Consolas" w:hAnsi="Consolas"/>
                 <w:sz w:val="17"/>
-              </w:rPr>
-              <w:t>,</w:t>
-            </w:r>
+                <w:lang w:val="en-US"/>
+              </w:rPr>
+              <w:t xml:space="preserve">, </w:t>
+            </w:r>
+            <w:proofErr w:type="spellStart"/>
             <w:r>
               <w:rPr>
                 <w:rFonts w:ascii="Consolas" w:eastAsia="Consolas" w:hAnsi="Consolas"/>
                 <w:sz w:val="17"/>
-              </w:rPr>
-              <w:br/>
-            </w:r>
-            <w:proofErr w:type="spellStart"/>
+                <w:lang w:val="en-US"/>
+              </w:rPr>
+              <w:t>day_number</w:t>
+            </w:r>
+            <w:proofErr w:type="spellEnd"/>
             <w:r>
               <w:rPr>
                 <w:rFonts w:ascii="Consolas" w:eastAsia="Consolas" w:hAnsi="Consolas"/>
                 <w:sz w:val="17"/>
-              </w:rPr>
-              <w:t>customer_code</w:t>
-            </w:r>
-            <w:proofErr w:type="spellEnd"/>
+                <w:lang w:val="en-US"/>
+              </w:rPr>
+              <w:t xml:space="preserve">, </w:t>
+            </w:r>
+            <w:proofErr w:type="spellStart"/>
             <w:r>
               <w:rPr>
                 <w:rFonts w:ascii="Consolas" w:eastAsia="Consolas" w:hAnsi="Consolas"/>
                 <w:sz w:val="17"/>
-              </w:rPr>
-              <w:t xml:space="preserve">, </w:t>
-            </w:r>
-            <w:proofErr w:type="spellStart"/>
+                <w:lang w:val="en-US"/>
+              </w:rPr>
+              <w:t>day_of_week</w:t>
+            </w:r>
+            <w:proofErr w:type="spellEnd"/>
             <w:r>
               <w:rPr>
                 <w:rFonts w:ascii="Consolas" w:eastAsia="Consolas" w:hAnsi="Consolas"/>
                 <w:sz w:val="17"/>
-              </w:rPr>
-              <w:t>customer_name</w:t>
-            </w:r>
-            <w:proofErr w:type="spellEnd"/>
+                <w:lang w:val="en-US"/>
+              </w:rPr>
+              <w:t>,</w:t>
+            </w:r>
             <w:r>
               <w:rPr>
                 <w:rFonts w:ascii="Consolas" w:eastAsia="Consolas" w:hAnsi="Consolas"/>
                 <w:sz w:val="17"/>
-              </w:rPr>
-              <w:t xml:space="preserve">, </w:t>
+                <w:lang w:val="en-US"/>
+              </w:rPr>
+              <w:br/>
             </w:r>
             <w:proofErr w:type="spellStart"/>
             <w:r>
               <w:rPr>
                 <w:rFonts w:ascii="Consolas" w:eastAsia="Consolas" w:hAnsi="Consolas"/>
                 <w:sz w:val="17"/>
-              </w:rPr>
-              <w:t>product_code</w:t>
+                <w:lang w:val="en-US"/>
+              </w:rPr>
+              <w:t>customer_code</w:t>
             </w:r>
             <w:proofErr w:type="spellEnd"/>
             <w:r>
               <w:rPr>
                 <w:rFonts w:ascii="Consolas" w:eastAsia="Consolas" w:hAnsi="Consolas"/>
                 <w:sz w:val="17"/>
+                <w:lang w:val="en-US"/>
               </w:rPr>
               <w:t xml:space="preserve">, </w:t>
             </w:r>
@@ -972,14 +1045,16 @@
               <w:rPr>
                 <w:rFonts w:ascii="Consolas" w:eastAsia="Consolas" w:hAnsi="Consolas"/>
                 <w:sz w:val="17"/>
-              </w:rPr>
-              <w:t>product_name</w:t>
+                <w:lang w:val="en-US"/>
+              </w:rPr>
+              <w:t>customer_name</w:t>
             </w:r>
             <w:proofErr w:type="spellEnd"/>
             <w:r>
               <w:rPr>
                 <w:rFonts w:ascii="Consolas" w:eastAsia="Consolas" w:hAnsi="Consolas"/>
                 <w:sz w:val="17"/>
+                <w:lang w:val="en-US"/>
               </w:rPr>
               <w:t xml:space="preserve">, </w:t>
             </w:r>
@@ -988,69 +1063,78 @@
               <w:rPr>
                 <w:rFonts w:ascii="Consolas" w:eastAsia="Consolas" w:hAnsi="Consolas"/>
                 <w:sz w:val="17"/>
-              </w:rPr>
-              <w:t>category_name</w:t>
+                <w:lang w:val="en-US"/>
+              </w:rPr>
+              <w:t>product_code</w:t>
             </w:r>
             <w:proofErr w:type="spellEnd"/>
             <w:r>
               <w:rPr>
                 <w:rFonts w:ascii="Consolas" w:eastAsia="Consolas" w:hAnsi="Consolas"/>
                 <w:sz w:val="17"/>
-              </w:rPr>
-              <w:t>,</w:t>
-            </w:r>
+                <w:lang w:val="en-US"/>
+              </w:rPr>
+              <w:t xml:space="preserve">, </w:t>
+            </w:r>
+            <w:proofErr w:type="spellStart"/>
             <w:r>
               <w:rPr>
                 <w:rFonts w:ascii="Consolas" w:eastAsia="Consolas" w:hAnsi="Consolas"/>
                 <w:sz w:val="17"/>
-              </w:rPr>
-              <w:br/>
-            </w:r>
-            <w:proofErr w:type="spellStart"/>
+                <w:lang w:val="en-US"/>
+              </w:rPr>
+              <w:t>product_name</w:t>
+            </w:r>
+            <w:proofErr w:type="spellEnd"/>
             <w:r>
               <w:rPr>
                 <w:rFonts w:ascii="Consolas" w:eastAsia="Consolas" w:hAnsi="Consolas"/>
                 <w:sz w:val="17"/>
-              </w:rPr>
-              <w:t>zone_name</w:t>
-            </w:r>
-            <w:proofErr w:type="spellEnd"/>
+                <w:lang w:val="en-US"/>
+              </w:rPr>
+              <w:t xml:space="preserve">, </w:t>
+            </w:r>
+            <w:proofErr w:type="spellStart"/>
             <w:r>
               <w:rPr>
                 <w:rFonts w:ascii="Consolas" w:eastAsia="Consolas" w:hAnsi="Consolas"/>
                 <w:sz w:val="17"/>
-              </w:rPr>
-              <w:t xml:space="preserve">, </w:t>
-            </w:r>
-            <w:proofErr w:type="spellStart"/>
+                <w:lang w:val="en-US"/>
+              </w:rPr>
+              <w:t>category_name</w:t>
+            </w:r>
+            <w:proofErr w:type="spellEnd"/>
             <w:r>
               <w:rPr>
                 <w:rFonts w:ascii="Consolas" w:eastAsia="Consolas" w:hAnsi="Consolas"/>
                 <w:sz w:val="17"/>
-              </w:rPr>
-              <w:t>salesman_name</w:t>
-            </w:r>
-            <w:proofErr w:type="spellEnd"/>
+                <w:lang w:val="en-US"/>
+              </w:rPr>
+              <w:t>,</w:t>
+            </w:r>
             <w:r>
               <w:rPr>
                 <w:rFonts w:ascii="Consolas" w:eastAsia="Consolas" w:hAnsi="Consolas"/>
                 <w:sz w:val="17"/>
-              </w:rPr>
-              <w:t xml:space="preserve">, </w:t>
+                <w:lang w:val="en-US"/>
+              </w:rPr>
+              <w:br/>
             </w:r>
             <w:proofErr w:type="spellStart"/>
             <w:r>
               <w:rPr>
                 <w:rFonts w:ascii="Consolas" w:eastAsia="Consolas" w:hAnsi="Consolas"/>
                 <w:sz w:val="17"/>
-              </w:rPr>
-              <w:t>warehouse_name</w:t>
+                <w:lang w:val="en-US"/>
+              </w:rPr>
+              <w:t>zone_name</w:t>
             </w:r>
             <w:proofErr w:type="spellEnd"/>
             <w:r>
               <w:rPr>
                 <w:rFonts w:ascii="Consolas" w:eastAsia="Consolas" w:hAnsi="Consolas"/>
                 <w:sz w:val="17"/>
+                <w:lang w:val="en-US"/>
               </w:rPr>
               <w:t xml:space="preserve">, </w:t>
             </w:r>
@@ -1059,14 +1143,16 @@
               <w:rPr>
                 <w:rFonts w:ascii="Consolas" w:eastAsia="Consolas" w:hAnsi="Consolas"/>
                 <w:sz w:val="17"/>
-              </w:rPr>
-              <w:t>quantity</w:t>
+                <w:lang w:val="en-US"/>
+              </w:rPr>
+              <w:t>salesman_name</w:t>
             </w:r>
             <w:proofErr w:type="spellEnd"/>
             <w:r>
               <w:rPr>
                 <w:rFonts w:ascii="Consolas" w:eastAsia="Consolas" w:hAnsi="Consolas"/>
                 <w:sz w:val="17"/>
+                <w:lang w:val="en-US"/>
               </w:rPr>
               <w:t xml:space="preserve">, </w:t>
             </w:r>
@@ -1075,75 +1161,108 @@
               <w:rPr>
                 <w:rFonts w:ascii="Consolas" w:eastAsia="Consolas" w:hAnsi="Consolas"/>
                 <w:sz w:val="17"/>
-              </w:rPr>
-              <w:t>unit_price</w:t>
+                <w:lang w:val="en-US"/>
+              </w:rPr>
+              <w:t>warehouse_name</w:t>
             </w:r>
             <w:proofErr w:type="spellEnd"/>
             <w:r>
               <w:rPr>
                 <w:rFonts w:ascii="Consolas" w:eastAsia="Consolas" w:hAnsi="Consolas"/>
                 <w:sz w:val="17"/>
-              </w:rPr>
-              <w:t>,</w:t>
-            </w:r>
+                <w:lang w:val="en-US"/>
+              </w:rPr>
+              <w:t xml:space="preserve">, quantity, </w:t>
+            </w:r>
+            <w:proofErr w:type="spellStart"/>
             <w:r>
               <w:rPr>
                 <w:rFonts w:ascii="Consolas" w:eastAsia="Consolas" w:hAnsi="Consolas"/>
                 <w:sz w:val="17"/>
-              </w:rPr>
-              <w:br/>
-            </w:r>
-            <w:proofErr w:type="spellStart"/>
+                <w:lang w:val="en-US"/>
+              </w:rPr>
+              <w:t>unit_price</w:t>
+            </w:r>
+            <w:proofErr w:type="spellEnd"/>
             <w:r>
               <w:rPr>
                 <w:rFonts w:ascii="Consolas" w:eastAsia="Consolas" w:hAnsi="Consolas"/>
                 <w:sz w:val="17"/>
-              </w:rPr>
-              <w:t>discount_percentage</w:t>
-            </w:r>
-            <w:proofErr w:type="spellEnd"/>
+                <w:lang w:val="en-US"/>
+              </w:rPr>
+              <w:t>,</w:t>
+            </w:r>
             <w:r>
               <w:rPr>
                 <w:rFonts w:ascii="Consolas" w:eastAsia="Consolas" w:hAnsi="Consolas"/>
                 <w:sz w:val="17"/>
-              </w:rPr>
-              <w:t xml:space="preserve">, </w:t>
+                <w:lang w:val="en-US"/>
+              </w:rPr>
+              <w:br/>
             </w:r>
             <w:proofErr w:type="spellStart"/>
             <w:r>
               <w:rPr>
                 <w:rFonts w:ascii="Consolas" w:eastAsia="Consolas" w:hAnsi="Consolas"/>
                 <w:sz w:val="17"/>
-              </w:rPr>
-              <w:t>total_sales</w:t>
+                <w:lang w:val="en-US"/>
+              </w:rPr>
+              <w:t>discount_percentage</w:t>
             </w:r>
             <w:proofErr w:type="spellEnd"/>
             <w:r>
               <w:rPr>
                 <w:rFonts w:ascii="Consolas" w:eastAsia="Consolas" w:hAnsi="Consolas"/>
                 <w:sz w:val="17"/>
-              </w:rPr>
-              <w:t>.</w:t>
-            </w:r>
+                <w:lang w:val="en-US"/>
+              </w:rPr>
+              <w:t xml:space="preserve">, </w:t>
+            </w:r>
+            <w:proofErr w:type="spellStart"/>
             <w:r>
               <w:rPr>
                 <w:rFonts w:ascii="Consolas" w:eastAsia="Consolas" w:hAnsi="Consolas"/>
                 <w:sz w:val="17"/>
-              </w:rPr>
-              <w:br/>
-            </w:r>
+                <w:lang w:val="en-US"/>
+              </w:rPr>
+              <w:t>total_sales</w:t>
+            </w:r>
+            <w:proofErr w:type="spellEnd"/>
             <w:r>
               <w:rPr>
                 <w:rFonts w:ascii="Consolas" w:eastAsia="Consolas" w:hAnsi="Consolas"/>
                 <w:sz w:val="17"/>
-              </w:rPr>
-              <w:br/>
-              <w:t>Reglas:</w:t>
+                <w:lang w:val="en-US"/>
+              </w:rPr>
+              <w:t>.</w:t>
             </w:r>
             <w:r>
               <w:rPr>
                 <w:rFonts w:ascii="Consolas" w:eastAsia="Consolas" w:hAnsi="Consolas"/>
                 <w:sz w:val="17"/>
+                <w:lang w:val="en-US"/>
+              </w:rPr>
+              <w:br/>
+            </w:r>
+            <w:r>
+              <w:rPr>
+                <w:rFonts w:ascii="Consolas" w:eastAsia="Consolas" w:hAnsi="Consolas"/>
+                <w:sz w:val="17"/>
+                <w:lang w:val="en-US"/>
+              </w:rPr>
+              <w:br/>
+            </w:r>
+            <w:r>
+              <w:rPr>
+                <w:rFonts w:ascii="Consolas" w:eastAsia="Consolas" w:hAnsi="Consolas"/>
+                <w:sz w:val="17"/>
+              </w:rPr>
+              <w:t>Reglas:</w:t>
+            </w:r>
+            <w:r>
+              <w:rPr>
+                <w:rFonts w:ascii="Consolas" w:eastAsia="Consolas" w:hAnsi="Consolas"/>
+                <w:sz w:val="17"/>
               </w:rPr>
               <w:br/>
               <w:t xml:space="preserve">1. La columna </w:t>
@@ -1194,116 +1313,160 @@
                 <w:sz w:val="17"/>
               </w:rPr>
               <w:br/>
-              <w:t xml:space="preserve">3. Las columnas </w:t>
-            </w:r>
-            <w:proofErr w:type="spellStart"/>
+            </w:r>
             <w:r>
               <w:rPr>
                 <w:rFonts w:ascii="Consolas" w:eastAsia="Consolas" w:hAnsi="Consolas"/>
                 <w:sz w:val="17"/>
-              </w:rPr>
-              <w:t>quantity</w:t>
-            </w:r>
-            <w:proofErr w:type="spellEnd"/>
+                <w:lang w:val="en-US"/>
+              </w:rPr>
+              <w:t xml:space="preserve">3. Las columnas quantity, </w:t>
+            </w:r>
+            <w:proofErr w:type="spellStart"/>
             <w:r>
               <w:rPr>
                 <w:rFonts w:ascii="Consolas" w:eastAsia="Consolas" w:hAnsi="Consolas"/>
                 <w:sz w:val="17"/>
-              </w:rPr>
-              <w:t xml:space="preserve">, </w:t>
-            </w:r>
-            <w:proofErr w:type="spellStart"/>
+                <w:lang w:val="en-US"/>
+              </w:rPr>
+              <w:t>unit_price</w:t>
+            </w:r>
+            <w:proofErr w:type="spellEnd"/>
             <w:r>
               <w:rPr>
                 <w:rFonts w:ascii="Consolas" w:eastAsia="Consolas" w:hAnsi="Consolas"/>
                 <w:sz w:val="17"/>
-              </w:rPr>
-              <w:t>unit_price</w:t>
-            </w:r>
-            <w:proofErr w:type="spellEnd"/>
+                <w:lang w:val="en-US"/>
+              </w:rPr>
+              <w:t xml:space="preserve">, </w:t>
+            </w:r>
+            <w:proofErr w:type="spellStart"/>
             <w:r>
               <w:rPr>
                 <w:rFonts w:ascii="Consolas" w:eastAsia="Consolas" w:hAnsi="Consolas"/>
                 <w:sz w:val="17"/>
-              </w:rPr>
-              <w:t xml:space="preserve">, </w:t>
-            </w:r>
-            <w:proofErr w:type="spellStart"/>
+                <w:lang w:val="en-US"/>
+              </w:rPr>
+              <w:t>discount_percentage</w:t>
+            </w:r>
+            <w:proofErr w:type="spellEnd"/>
             <w:r>
               <w:rPr>
                 <w:rFonts w:ascii="Consolas" w:eastAsia="Consolas" w:hAnsi="Consolas"/>
                 <w:sz w:val="17"/>
-              </w:rPr>
-              <w:t>discount_percentage</w:t>
-            </w:r>
-            <w:proofErr w:type="spellEnd"/>
+                <w:lang w:val="en-US"/>
+              </w:rPr>
+              <w:t xml:space="preserve">, </w:t>
+            </w:r>
+            <w:proofErr w:type="spellStart"/>
             <w:r>
               <w:rPr>
                 <w:rFonts w:ascii="Consolas" w:eastAsia="Consolas" w:hAnsi="Consolas"/>
                 <w:sz w:val="17"/>
-              </w:rPr>
-              <w:t xml:space="preserve">, </w:t>
-            </w:r>
-            <w:proofErr w:type="spellStart"/>
+                <w:lang w:val="en-US"/>
+              </w:rPr>
+              <w:t>month_number</w:t>
+            </w:r>
+            <w:proofErr w:type="spellEnd"/>
             <w:r>
               <w:rPr>
                 <w:rFonts w:ascii="Consolas" w:eastAsia="Consolas" w:hAnsi="Consolas"/>
                 <w:sz w:val="17"/>
-              </w:rPr>
-              <w:t>month_number</w:t>
-            </w:r>
-            <w:proofErr w:type="spellEnd"/>
+                <w:lang w:val="en-US"/>
+              </w:rPr>
+              <w:t xml:space="preserve"> y </w:t>
+            </w:r>
+            <w:proofErr w:type="spellStart"/>
             <w:r>
               <w:rPr>
                 <w:rFonts w:ascii="Consolas" w:eastAsia="Consolas" w:hAnsi="Consolas"/>
                 <w:sz w:val="17"/>
-              </w:rPr>
-              <w:t xml:space="preserve"> y </w:t>
-            </w:r>
-            <w:proofErr w:type="spellStart"/>
+                <w:lang w:val="en-US"/>
+              </w:rPr>
+              <w:t>day_of_week</w:t>
+            </w:r>
+            <w:proofErr w:type="spellEnd"/>
             <w:r>
               <w:rPr>
                 <w:rFonts w:ascii="Consolas" w:eastAsia="Consolas" w:hAnsi="Consolas"/>
                 <w:sz w:val="17"/>
-              </w:rPr>
-              <w:t>day_of_week</w:t>
-            </w:r>
-            <w:proofErr w:type="spellEnd"/>
+                <w:lang w:val="en-US"/>
+              </w:rPr>
+              <w:t xml:space="preserve"> </w:t>
+            </w:r>
+            <w:proofErr w:type="spellStart"/>
             <w:r>
               <w:rPr>
                 <w:rFonts w:ascii="Consolas" w:eastAsia="Consolas" w:hAnsi="Consolas"/>
                 <w:sz w:val="17"/>
-              </w:rPr>
-              <w:t xml:space="preserve"> deben influir en </w:t>
-            </w:r>
-            <w:proofErr w:type="spellStart"/>
+                <w:lang w:val="en-US"/>
+              </w:rPr>
+              <w:t>deben</w:t>
+            </w:r>
+            <w:proofErr w:type="spellEnd"/>
             <w:r>
               <w:rPr>
                 <w:rFonts w:ascii="Consolas" w:eastAsia="Consolas" w:hAnsi="Consolas"/>
                 <w:sz w:val="17"/>
-              </w:rPr>
-              <w:t>total_sales</w:t>
-            </w:r>
-            <w:proofErr w:type="spellEnd"/>
+                <w:lang w:val="en-US"/>
+              </w:rPr>
+              <w:t xml:space="preserve"> </w:t>
+            </w:r>
+            <w:proofErr w:type="spellStart"/>
             <w:r>
               <w:rPr>
                 <w:rFonts w:ascii="Consolas" w:eastAsia="Consolas" w:hAnsi="Consolas"/>
                 <w:sz w:val="17"/>
-              </w:rPr>
-              <w:t>.</w:t>
-            </w:r>
+                <w:lang w:val="en-US"/>
+              </w:rPr>
+              <w:t>influir</w:t>
+            </w:r>
+            <w:proofErr w:type="spellEnd"/>
             <w:r>
               <w:rPr>
                 <w:rFonts w:ascii="Consolas" w:eastAsia="Consolas" w:hAnsi="Consolas"/>
                 <w:sz w:val="17"/>
-              </w:rPr>
-              <w:br/>
-              <w:t>4. Las ventas deben mostrar estacionalidad: más ventas en noviembre y diciembre.</w:t>
-            </w:r>
+                <w:lang w:val="en-US"/>
+              </w:rPr>
+              <w:t xml:space="preserve"> en </w:t>
+            </w:r>
+            <w:proofErr w:type="spellStart"/>
             <w:r>
               <w:rPr>
                 <w:rFonts w:ascii="Consolas" w:eastAsia="Consolas" w:hAnsi="Consolas"/>
                 <w:sz w:val="17"/>
+                <w:lang w:val="en-US"/>
+              </w:rPr>
+              <w:t>total_sales</w:t>
+            </w:r>
+            <w:proofErr w:type="spellEnd"/>
+            <w:r>
+              <w:rPr>
+                <w:rFonts w:ascii="Consolas" w:eastAsia="Consolas" w:hAnsi="Consolas"/>
+                <w:sz w:val="17"/>
+                <w:lang w:val="en-US"/>
+              </w:rPr>
+              <w:t>.</w:t>
+            </w:r>
+            <w:r>
+              <w:rPr>
+                <w:rFonts w:ascii="Consolas" w:eastAsia="Consolas" w:hAnsi="Consolas"/>
+                <w:sz w:val="17"/>
+                <w:lang w:val="en-US"/>
+              </w:rPr>
+              <w:br/>
+            </w:r>
+            <w:r>
+              <w:rPr>
+                <w:rFonts w:ascii="Consolas" w:eastAsia="Consolas" w:hAnsi="Consolas"/>
+                <w:sz w:val="17"/>
+              </w:rPr>
+              <w:t>4. Las ventas deben mostrar estacionalidad: más ventas en noviembre y diciembre.</w:t>
+            </w:r>
+            <w:r>
+              <w:rPr>
+                <w:rFonts w:ascii="Consolas" w:eastAsia="Consolas" w:hAnsi="Consolas"/>
+                <w:sz w:val="17"/>
               </w:rPr>
               <w:br/>
               <w:t>5. Las ventas deben ser mayores en Guayaquil y Quito.</w:t>
@@ -1314,6 +1477,13 @@
                 <w:sz w:val="17"/>
               </w:rPr>
               <w:br/>
+            </w:r>
+            <w:r>
+              <w:rPr>
+                <w:rFonts w:ascii="Consolas" w:eastAsia="Consolas" w:hAnsi="Consolas"/>
+                <w:sz w:val="17"/>
+              </w:rPr>
+              <w:lastRenderedPageBreak/>
               <w:t>6. Algunos productos deben tener mayor demanda que otros.</w:t>
             </w:r>
             <w:r>
@@ -1446,7 +1616,6 @@
         <w:pStyle w:val="Heading1"/>
       </w:pPr>
       <w:r>
-        <w:lastRenderedPageBreak/>
         <w:t>6. Estructura mínima del archivo de ventas</w:t>
       </w:r>
     </w:p>
@@ -2517,6 +2686,1061 @@
       </w:tr>
     </w:tbl>
     <w:p/>
+    <w:p>
+      <w:pPr>
+        <w:pStyle w:val="Heading1"/>
+      </w:pPr>
+    </w:p>
+    <w:p>
+      <w:pPr>
+        <w:pStyle w:val="Heading1"/>
+        <w:ind w:left="720"/>
+      </w:pPr>
+      <w:r>
+        <w:t>7.</w:t>
+      </w:r>
+      <w:r>
+        <w:t>1. Abrir el proyecto</w:t>
+      </w:r>
+    </w:p>
+    <w:p>
+      <w:pPr>
+        <w:rPr>
+          <w:lang w:val="es-ES"/>
+        </w:rPr>
+      </w:pPr>
+      <w:r>
+        <w:rPr>
+          <w:lang w:val="es-ES"/>
+        </w:rPr>
+        <w:t>Abre Visual Studio 2026.</w:t>
+      </w:r>
+    </w:p>
+    <w:p>
+      <w:pPr>
+        <w:rPr>
+          <w:lang w:val="es-ES"/>
+        </w:rPr>
+      </w:pPr>
+      <w:r>
+        <w:rPr>
+          <w:lang w:val="es-ES"/>
+        </w:rPr>
+        <w:t xml:space="preserve">Haz clic en Abrir un proyecto o solución y </w:t>
+      </w:r>
+      <w:r>
+        <w:rPr>
+          <w:lang w:val="es-ES"/>
+        </w:rPr>
+        <w:t>ponle nombre`</w:t>
+      </w:r>
+      <w:r>
+        <w:rPr>
+          <w:lang w:val="es-ES"/>
+        </w:rPr>
+        <w:t xml:space="preserve"> </w:t>
+      </w:r>
+      <w:proofErr w:type="spellStart"/>
+      <w:r>
+        <w:rPr>
+          <w:lang w:val="es-ES"/>
+        </w:rPr>
+        <w:t>SalesPredictionApp.csproj</w:t>
+      </w:r>
+      <w:proofErr w:type="spellEnd"/>
+      <w:r>
+        <w:rPr>
+          <w:lang w:val="es-ES"/>
+        </w:rPr>
+        <w:t xml:space="preserve"> </w:t>
+      </w:r>
+      <w:proofErr w:type="gramStart"/>
+      <w:r>
+        <w:rPr>
+          <w:lang w:val="es-ES"/>
+        </w:rPr>
+        <w:t xml:space="preserve">y </w:t>
+      </w:r>
+      <w:r>
+        <w:rPr>
+          <w:lang w:val="es-ES"/>
+        </w:rPr>
+        <w:t xml:space="preserve"> crear</w:t>
+      </w:r>
+      <w:proofErr w:type="gramEnd"/>
+      <w:r>
+        <w:rPr>
+          <w:lang w:val="es-ES"/>
+        </w:rPr>
+        <w:t xml:space="preserve"> la carpeta </w:t>
+      </w:r>
+      <w:proofErr w:type="spellStart"/>
+      <w:r>
+        <w:rPr>
+          <w:lang w:val="es-ES"/>
+        </w:rPr>
+        <w:t>SalesPredictionApp</w:t>
+      </w:r>
+      <w:proofErr w:type="spellEnd"/>
+      <w:r>
+        <w:rPr>
+          <w:lang w:val="es-ES"/>
+        </w:rPr>
+        <w:t>.</w:t>
+      </w:r>
+    </w:p>
+    <w:p>
+      <w:pPr>
+        <w:pStyle w:val="Heading1"/>
+        <w:ind w:left="720"/>
+      </w:pPr>
+      <w:r>
+        <w:t xml:space="preserve">2. Agregar el Modelo de Machine </w:t>
+      </w:r>
+      <w:proofErr w:type="spellStart"/>
+      <w:r>
+        <w:t>Learning</w:t>
+      </w:r>
+      <w:proofErr w:type="spellEnd"/>
+    </w:p>
+    <w:p>
+      <w:pPr>
+        <w:rPr>
+          <w:lang w:val="es-ES"/>
+        </w:rPr>
+      </w:pPr>
+      <w:r>
+        <w:rPr>
+          <w:lang w:val="es-ES"/>
+        </w:rPr>
+        <w:t xml:space="preserve">En el panel del Explorador de Soluciones (generalmente a la derecha), haz clic derecho sobre el proyecto </w:t>
+      </w:r>
+      <w:proofErr w:type="spellStart"/>
+      <w:r>
+        <w:rPr>
+          <w:lang w:val="es-ES"/>
+        </w:rPr>
+        <w:t>SalesPredictionApp</w:t>
+      </w:r>
+      <w:proofErr w:type="spellEnd"/>
+      <w:r>
+        <w:rPr>
+          <w:lang w:val="es-ES"/>
+        </w:rPr>
+        <w:t>.</w:t>
+      </w:r>
+    </w:p>
+    <w:p>
+      <w:pPr>
+        <w:rPr>
+          <w:lang w:val="en-US"/>
+        </w:rPr>
+      </w:pPr>
+      <w:proofErr w:type="spellStart"/>
+      <w:r>
+        <w:rPr>
+          <w:lang w:val="en-US"/>
+        </w:rPr>
+        <w:t>Selecciona</w:t>
+      </w:r>
+      <w:proofErr w:type="spellEnd"/>
+      <w:r>
+        <w:rPr>
+          <w:lang w:val="en-US"/>
+        </w:rPr>
+        <w:t xml:space="preserve"> </w:t>
+      </w:r>
+      <w:proofErr w:type="spellStart"/>
+      <w:r>
+        <w:rPr>
+          <w:lang w:val="en-US"/>
+        </w:rPr>
+        <w:t>Agregar</w:t>
+      </w:r>
+      <w:proofErr w:type="spellEnd"/>
+      <w:r>
+        <w:rPr>
+          <w:lang w:val="en-US"/>
+        </w:rPr>
+        <w:t xml:space="preserve"> &gt; Modelo de Machine Learning... (o Add &gt; Machine Learning Model).</w:t>
+      </w:r>
+    </w:p>
+    <w:p>
+      <w:pPr>
+        <w:rPr>
+          <w:lang w:val="es-ES"/>
+        </w:rPr>
+      </w:pPr>
+      <w:r>
+        <w:rPr>
+          <w:lang w:val="es-ES"/>
+        </w:rPr>
+        <w:t xml:space="preserve">Visual Studio te pedirá que le asignes un nombre al modelo. Puedes llamarlo </w:t>
+      </w:r>
+      <w:proofErr w:type="spellStart"/>
+      <w:r>
+        <w:rPr>
+          <w:lang w:val="es-ES"/>
+        </w:rPr>
+        <w:t>SalesModel.mbconfig</w:t>
+      </w:r>
+      <w:proofErr w:type="spellEnd"/>
+      <w:r>
+        <w:rPr>
+          <w:lang w:val="es-ES"/>
+        </w:rPr>
+        <w:t xml:space="preserve"> y darle a Agregar.</w:t>
+      </w:r>
+    </w:p>
+    <w:p>
+      <w:pPr>
+        <w:rPr>
+          <w:lang w:val="es-ES"/>
+        </w:rPr>
+      </w:pPr>
+    </w:p>
+    <w:p>
+      <w:pPr>
+        <w:rPr>
+          <w:lang w:val="es-ES"/>
+        </w:rPr>
+      </w:pPr>
+      <w:r>
+        <w:rPr>
+          <w:lang w:val="es-ES"/>
+        </w:rPr>
+        <w:drawing>
+          <wp:inline distT="0" distB="0" distL="0" distR="0" wp14:anchorId="78B25E5C" wp14:editId="78C3C70D">
+            <wp:extent cx="6400800" cy="2183130"/>
+            <wp:effectExtent l="0" t="0" r="0" b="7620"/>
+            <wp:docPr id="118158471" name="Picture 1"/>
+            <wp:cNvGraphicFramePr>
+              <a:graphicFrameLocks xmlns:a="http://schemas.openxmlformats.org/drawingml/2006/main" noChangeAspect="1"/>
+            </wp:cNvGraphicFramePr>
+            <a:graphic xmlns:a="http://schemas.openxmlformats.org/drawingml/2006/main">
+              <a:graphicData uri="http://schemas.openxmlformats.org/drawingml/2006/picture">
+                <pic:pic xmlns:pic="http://schemas.openxmlformats.org/drawingml/2006/picture">
+                  <pic:nvPicPr>
+                    <pic:cNvPr id="118158471" name=""/>
+                    <pic:cNvPicPr/>
+                  </pic:nvPicPr>
+                  <pic:blipFill>
+                    <a:blip r:embed="rId9"/>
+                    <a:stretch>
+                      <a:fillRect/>
+                    </a:stretch>
+                  </pic:blipFill>
+                  <pic:spPr>
+                    <a:xfrm>
+                      <a:off x="0" y="0"/>
+                      <a:ext cx="6400800" cy="2183130"/>
+                    </a:xfrm>
+                    <a:prstGeom prst="rect">
+                      <a:avLst/>
+                    </a:prstGeom>
+                  </pic:spPr>
+                </pic:pic>
+              </a:graphicData>
+            </a:graphic>
+          </wp:inline>
+        </w:drawing>
+      </w:r>
+    </w:p>
+    <w:p>
+      <w:pPr>
+        <w:pStyle w:val="Heading1"/>
+        <w:ind w:left="720"/>
+      </w:pPr>
+      <w:r>
+        <w:t>3. Elegir el Escenario (</w:t>
+      </w:r>
+      <w:proofErr w:type="spellStart"/>
+      <w:r>
+        <w:t>Scenario</w:t>
+      </w:r>
+      <w:proofErr w:type="spellEnd"/>
+      <w:r>
+        <w:t>)</w:t>
+      </w:r>
+    </w:p>
+    <w:p/>
+    <w:p>
+      <w:pPr>
+        <w:rPr>
+          <w:lang w:val="es-ES"/>
+        </w:rPr>
+      </w:pPr>
+      <w:r>
+        <w:rPr>
+          <w:lang w:val="es-ES"/>
+        </w:rPr>
+        <w:t xml:space="preserve">Se abrirá la interfaz del Model </w:t>
+      </w:r>
+      <w:proofErr w:type="spellStart"/>
+      <w:r>
+        <w:rPr>
+          <w:lang w:val="es-ES"/>
+        </w:rPr>
+        <w:t>Builder</w:t>
+      </w:r>
+      <w:proofErr w:type="spellEnd"/>
+      <w:r>
+        <w:rPr>
+          <w:lang w:val="es-ES"/>
+        </w:rPr>
+        <w:t>.</w:t>
+      </w:r>
+    </w:p>
+    <w:p>
+      <w:pPr>
+        <w:rPr>
+          <w:lang w:val="es-ES"/>
+        </w:rPr>
+      </w:pPr>
+      <w:r>
+        <w:rPr>
+          <w:lang w:val="es-ES"/>
+        </w:rPr>
+        <w:t>En la pantalla de escenarios, selecciona Predicción de valor (</w:t>
+      </w:r>
+      <w:proofErr w:type="spellStart"/>
+      <w:r>
+        <w:rPr>
+          <w:lang w:val="es-ES"/>
+        </w:rPr>
+        <w:t>Value</w:t>
+      </w:r>
+      <w:proofErr w:type="spellEnd"/>
+      <w:r>
+        <w:rPr>
+          <w:lang w:val="es-ES"/>
+        </w:rPr>
+        <w:t xml:space="preserve"> </w:t>
+      </w:r>
+      <w:proofErr w:type="spellStart"/>
+      <w:r>
+        <w:rPr>
+          <w:lang w:val="es-ES"/>
+        </w:rPr>
+        <w:t>Prediction</w:t>
+      </w:r>
+      <w:proofErr w:type="spellEnd"/>
+      <w:r>
+        <w:rPr>
+          <w:lang w:val="es-ES"/>
+        </w:rPr>
+        <w:t xml:space="preserve"> / Regresión). Esto se debe a que queremos predecir un valor numérico continuo (el total de las ventas).</w:t>
+      </w:r>
+    </w:p>
+    <w:p>
+      <w:pPr>
+        <w:rPr>
+          <w:lang w:val="es-ES"/>
+        </w:rPr>
+      </w:pPr>
+    </w:p>
+    <w:p>
+      <w:pPr>
+        <w:rPr>
+          <w:lang w:val="es-ES"/>
+        </w:rPr>
+      </w:pPr>
+      <w:r>
+        <w:rPr>
+          <w:noProof/>
+        </w:rPr>
+        <w:lastRenderedPageBreak/>
+        <w:drawing>
+          <wp:inline distT="0" distB="0" distL="0" distR="0" wp14:anchorId="023153AC" wp14:editId="1CB62CD2">
+            <wp:extent cx="6400800" cy="3989705"/>
+            <wp:effectExtent l="0" t="0" r="0" b="0"/>
+            <wp:docPr id="2010313360" name="Picture 1"/>
+            <wp:cNvGraphicFramePr>
+              <a:graphicFrameLocks xmlns:a="http://schemas.openxmlformats.org/drawingml/2006/main" noChangeAspect="1"/>
+            </wp:cNvGraphicFramePr>
+            <a:graphic xmlns:a="http://schemas.openxmlformats.org/drawingml/2006/main">
+              <a:graphicData uri="http://schemas.openxmlformats.org/drawingml/2006/picture">
+                <pic:pic xmlns:pic="http://schemas.openxmlformats.org/drawingml/2006/picture">
+                  <pic:nvPicPr>
+                    <pic:cNvPr id="2010313360" name=""/>
+                    <pic:cNvPicPr/>
+                  </pic:nvPicPr>
+                  <pic:blipFill>
+                    <a:blip r:embed="rId10"/>
+                    <a:stretch>
+                      <a:fillRect/>
+                    </a:stretch>
+                  </pic:blipFill>
+                  <pic:spPr>
+                    <a:xfrm>
+                      <a:off x="0" y="0"/>
+                      <a:ext cx="6400800" cy="3989705"/>
+                    </a:xfrm>
+                    <a:prstGeom prst="rect">
+                      <a:avLst/>
+                    </a:prstGeom>
+                  </pic:spPr>
+                </pic:pic>
+              </a:graphicData>
+            </a:graphic>
+          </wp:inline>
+        </w:drawing>
+      </w:r>
+    </w:p>
+    <w:p>
+      <w:pPr>
+        <w:pStyle w:val="Heading1"/>
+        <w:ind w:left="720"/>
+      </w:pPr>
+      <w:r>
+        <w:t>4. Entorno de Entrenamiento (</w:t>
+      </w:r>
+      <w:proofErr w:type="spellStart"/>
+      <w:r>
+        <w:t>Environment</w:t>
+      </w:r>
+      <w:proofErr w:type="spellEnd"/>
+      <w:r>
+        <w:t>)</w:t>
+      </w:r>
+    </w:p>
+    <w:p>
+      <w:pPr>
+        <w:rPr>
+          <w:lang w:val="es-ES"/>
+        </w:rPr>
+      </w:pPr>
+      <w:r>
+        <w:rPr>
+          <w:lang w:val="es-ES"/>
+        </w:rPr>
+        <w:t>Selecciona Local (CPU). El entrenamiento se realizará usando los recursos de tu propia computadora.</w:t>
+      </w:r>
+    </w:p>
+    <w:p>
+      <w:pPr>
+        <w:rPr>
+          <w:lang w:val="es-ES"/>
+        </w:rPr>
+      </w:pPr>
+    </w:p>
+    <w:p>
+      <w:pPr>
+        <w:rPr>
+          <w:lang w:val="es-ES"/>
+        </w:rPr>
+      </w:pPr>
+      <w:r>
+        <w:rPr>
+          <w:noProof/>
+        </w:rPr>
+        <w:lastRenderedPageBreak/>
+        <w:drawing>
+          <wp:inline distT="0" distB="0" distL="0" distR="0" wp14:anchorId="56E33DFD" wp14:editId="66CDF9EF">
+            <wp:extent cx="6096313" cy="2997354"/>
+            <wp:effectExtent l="0" t="0" r="0" b="0"/>
+            <wp:docPr id="1732849850" name="Picture 1"/>
+            <wp:cNvGraphicFramePr>
+              <a:graphicFrameLocks xmlns:a="http://schemas.openxmlformats.org/drawingml/2006/main" noChangeAspect="1"/>
+            </wp:cNvGraphicFramePr>
+            <a:graphic xmlns:a="http://schemas.openxmlformats.org/drawingml/2006/main">
+              <a:graphicData uri="http://schemas.openxmlformats.org/drawingml/2006/picture">
+                <pic:pic xmlns:pic="http://schemas.openxmlformats.org/drawingml/2006/picture">
+                  <pic:nvPicPr>
+                    <pic:cNvPr id="1732849850" name=""/>
+                    <pic:cNvPicPr/>
+                  </pic:nvPicPr>
+                  <pic:blipFill>
+                    <a:blip r:embed="rId11"/>
+                    <a:stretch>
+                      <a:fillRect/>
+                    </a:stretch>
+                  </pic:blipFill>
+                  <pic:spPr>
+                    <a:xfrm>
+                      <a:off x="0" y="0"/>
+                      <a:ext cx="6096313" cy="2997354"/>
+                    </a:xfrm>
+                    <a:prstGeom prst="rect">
+                      <a:avLst/>
+                    </a:prstGeom>
+                  </pic:spPr>
+                </pic:pic>
+              </a:graphicData>
+            </a:graphic>
+          </wp:inline>
+        </w:drawing>
+      </w:r>
+    </w:p>
+    <w:p>
+      <w:pPr>
+        <w:pStyle w:val="Heading1"/>
+        <w:ind w:left="720"/>
+      </w:pPr>
+      <w:r>
+        <w:t>5. Cargar los Datos (Data)</w:t>
+      </w:r>
+    </w:p>
+    <w:p>
+      <w:pPr>
+        <w:rPr>
+          <w:lang w:val="es-ES"/>
+        </w:rPr>
+      </w:pPr>
+      <w:r>
+        <w:rPr>
+          <w:lang w:val="es-ES"/>
+        </w:rPr>
+        <w:t>En tipo de entrada selecciona Archivo (File).</w:t>
+      </w:r>
+    </w:p>
+    <w:p>
+      <w:pPr>
+        <w:rPr>
+          <w:lang w:val="es-ES"/>
+        </w:rPr>
+      </w:pPr>
+      <w:r>
+        <w:rPr>
+          <w:lang w:val="es-ES"/>
+        </w:rPr>
+        <w:t>Haz clic en Examinar (</w:t>
+      </w:r>
+      <w:proofErr w:type="spellStart"/>
+      <w:r>
+        <w:rPr>
+          <w:lang w:val="es-ES"/>
+        </w:rPr>
+        <w:t>Browse</w:t>
+      </w:r>
+      <w:proofErr w:type="spellEnd"/>
+      <w:r>
+        <w:rPr>
+          <w:lang w:val="es-ES"/>
+        </w:rPr>
+        <w:t>) y selecciona el archivo ventas_sinteticas_2025.csv que generamos en el paso anterior.</w:t>
+      </w:r>
+    </w:p>
+    <w:p>
+      <w:pPr>
+        <w:rPr>
+          <w:lang w:val="es-ES"/>
+        </w:rPr>
+      </w:pPr>
+      <w:r>
+        <w:rPr>
+          <w:lang w:val="es-ES"/>
+        </w:rPr>
+        <w:t xml:space="preserve">El Model </w:t>
+      </w:r>
+      <w:proofErr w:type="spellStart"/>
+      <w:r>
+        <w:rPr>
+          <w:lang w:val="es-ES"/>
+        </w:rPr>
+        <w:t>Builder</w:t>
+      </w:r>
+      <w:proofErr w:type="spellEnd"/>
+      <w:r>
+        <w:rPr>
+          <w:lang w:val="es-ES"/>
+        </w:rPr>
+        <w:t xml:space="preserve"> cargará una vista previa de las columnas.</w:t>
+      </w:r>
+    </w:p>
+    <w:p>
+      <w:pPr>
+        <w:rPr>
+          <w:lang w:val="es-ES"/>
+        </w:rPr>
+      </w:pPr>
+      <w:r>
+        <w:rPr>
+          <w:lang w:val="es-ES"/>
+        </w:rPr>
+        <w:t xml:space="preserve">En el menú desplegable "Columna que se va a predecir (Label)", selecciona la columna </w:t>
+      </w:r>
+      <w:proofErr w:type="spellStart"/>
+      <w:r>
+        <w:rPr>
+          <w:lang w:val="es-ES"/>
+        </w:rPr>
+        <w:t>total_sales</w:t>
+      </w:r>
+      <w:proofErr w:type="spellEnd"/>
+      <w:r>
+        <w:rPr>
+          <w:lang w:val="es-ES"/>
+        </w:rPr>
+        <w:t>.</w:t>
+      </w:r>
+    </w:p>
+    <w:p>
+      <w:pPr>
+        <w:rPr>
+          <w:lang w:val="es-ES"/>
+        </w:rPr>
+      </w:pPr>
+      <w:r>
+        <w:rPr>
+          <w:noProof/>
+        </w:rPr>
+        <w:drawing>
+          <wp:inline distT="0" distB="0" distL="0" distR="0" wp14:anchorId="1585B7AF" wp14:editId="782BA919">
+            <wp:extent cx="6400800" cy="2867660"/>
+            <wp:effectExtent l="0" t="0" r="0" b="8890"/>
+            <wp:docPr id="957879107" name="Picture 1"/>
+            <wp:cNvGraphicFramePr>
+              <a:graphicFrameLocks xmlns:a="http://schemas.openxmlformats.org/drawingml/2006/main" noChangeAspect="1"/>
+            </wp:cNvGraphicFramePr>
+            <a:graphic xmlns:a="http://schemas.openxmlformats.org/drawingml/2006/main">
+              <a:graphicData uri="http://schemas.openxmlformats.org/drawingml/2006/picture">
+                <pic:pic xmlns:pic="http://schemas.openxmlformats.org/drawingml/2006/picture">
+                  <pic:nvPicPr>
+                    <pic:cNvPr id="957879107" name=""/>
+                    <pic:cNvPicPr/>
+                  </pic:nvPicPr>
+                  <pic:blipFill>
+                    <a:blip r:embed="rId12"/>
+                    <a:stretch>
+                      <a:fillRect/>
+                    </a:stretch>
+                  </pic:blipFill>
+                  <pic:spPr>
+                    <a:xfrm>
+                      <a:off x="0" y="0"/>
+                      <a:ext cx="6400800" cy="2867660"/>
+                    </a:xfrm>
+                    <a:prstGeom prst="rect">
+                      <a:avLst/>
+                    </a:prstGeom>
+                  </pic:spPr>
+                </pic:pic>
+              </a:graphicData>
+            </a:graphic>
+          </wp:inline>
+        </w:drawing>
+      </w:r>
+    </w:p>
+    <w:p>
+      <w:pPr>
+        <w:rPr>
+          <w:lang w:val="es-ES"/>
+        </w:rPr>
+      </w:pPr>
+    </w:p>
+    <w:p>
+      <w:pPr>
+        <w:pStyle w:val="Heading1"/>
+        <w:ind w:left="720"/>
+      </w:pPr>
+      <w:r>
+        <w:lastRenderedPageBreak/>
+        <w:t>6. Entrenar el Modelo (Train)</w:t>
+      </w:r>
+    </w:p>
+    <w:p>
+      <w:pPr>
+        <w:rPr>
+          <w:lang w:val="es-ES"/>
+        </w:rPr>
+      </w:pPr>
+      <w:r>
+        <w:rPr>
+          <w:lang w:val="es-ES"/>
+        </w:rPr>
+        <w:t>Pasa a la siguiente pestaña y configura el tiempo de entrenamiento. Para 3,000 registros, dejar 30 a 60 segundos suele ser suficiente.</w:t>
+      </w:r>
+    </w:p>
+    <w:p>
+      <w:pPr>
+        <w:rPr>
+          <w:lang w:val="es-ES"/>
+        </w:rPr>
+      </w:pPr>
+      <w:r>
+        <w:rPr>
+          <w:lang w:val="es-ES"/>
+        </w:rPr>
+        <w:t>Haz clic en Empezar a entrenar.</w:t>
+      </w:r>
+    </w:p>
+    <w:p>
+      <w:pPr>
+        <w:rPr>
+          <w:lang w:val="es-ES"/>
+        </w:rPr>
+      </w:pPr>
+      <w:r>
+        <w:rPr>
+          <w:lang w:val="es-ES"/>
+        </w:rPr>
+        <w:t xml:space="preserve">ML.NET probará internamente varios algoritmos de regresión (como </w:t>
+      </w:r>
+      <w:proofErr w:type="spellStart"/>
+      <w:r>
+        <w:rPr>
+          <w:lang w:val="es-ES"/>
+        </w:rPr>
+        <w:t>LightGBM</w:t>
+      </w:r>
+      <w:proofErr w:type="spellEnd"/>
+      <w:r>
+        <w:rPr>
+          <w:lang w:val="es-ES"/>
+        </w:rPr>
+        <w:t xml:space="preserve">, </w:t>
+      </w:r>
+      <w:proofErr w:type="spellStart"/>
+      <w:r>
+        <w:rPr>
+          <w:lang w:val="es-ES"/>
+        </w:rPr>
+        <w:t>FastTree</w:t>
+      </w:r>
+      <w:proofErr w:type="spellEnd"/>
+      <w:r>
+        <w:rPr>
+          <w:lang w:val="es-ES"/>
+        </w:rPr>
+        <w:t xml:space="preserve">, </w:t>
+      </w:r>
+      <w:proofErr w:type="spellStart"/>
+      <w:r>
+        <w:rPr>
+          <w:lang w:val="es-ES"/>
+        </w:rPr>
+        <w:t>LbfgsPoissonRegression</w:t>
+      </w:r>
+      <w:proofErr w:type="spellEnd"/>
+      <w:r>
+        <w:rPr>
+          <w:lang w:val="es-ES"/>
+        </w:rPr>
+        <w:t>, etc.) y escogerá automáticamente el que tenga mejor rendimiento.</w:t>
+      </w:r>
+    </w:p>
+    <w:p>
+      <w:pPr>
+        <w:rPr>
+          <w:lang w:val="es-ES"/>
+        </w:rPr>
+      </w:pPr>
+    </w:p>
+    <w:p>
+      <w:pPr>
+        <w:rPr>
+          <w:lang w:val="es-ES"/>
+        </w:rPr>
+      </w:pPr>
+      <w:r>
+        <w:rPr>
+          <w:noProof/>
+        </w:rPr>
+        <w:drawing>
+          <wp:inline distT="0" distB="0" distL="0" distR="0" wp14:anchorId="21A3DF2D" wp14:editId="26B59232">
+            <wp:extent cx="4769095" cy="3219615"/>
+            <wp:effectExtent l="0" t="0" r="0" b="0"/>
+            <wp:docPr id="1280646154" name="Picture 1"/>
+            <wp:cNvGraphicFramePr>
+              <a:graphicFrameLocks xmlns:a="http://schemas.openxmlformats.org/drawingml/2006/main" noChangeAspect="1"/>
+            </wp:cNvGraphicFramePr>
+            <a:graphic xmlns:a="http://schemas.openxmlformats.org/drawingml/2006/main">
+              <a:graphicData uri="http://schemas.openxmlformats.org/drawingml/2006/picture">
+                <pic:pic xmlns:pic="http://schemas.openxmlformats.org/drawingml/2006/picture">
+                  <pic:nvPicPr>
+                    <pic:cNvPr id="1280646154" name=""/>
+                    <pic:cNvPicPr/>
+                  </pic:nvPicPr>
+                  <pic:blipFill>
+                    <a:blip r:embed="rId13"/>
+                    <a:stretch>
+                      <a:fillRect/>
+                    </a:stretch>
+                  </pic:blipFill>
+                  <pic:spPr>
+                    <a:xfrm>
+                      <a:off x="0" y="0"/>
+                      <a:ext cx="4769095" cy="3219615"/>
+                    </a:xfrm>
+                    <a:prstGeom prst="rect">
+                      <a:avLst/>
+                    </a:prstGeom>
+                  </pic:spPr>
+                </pic:pic>
+              </a:graphicData>
+            </a:graphic>
+          </wp:inline>
+        </w:drawing>
+      </w:r>
+    </w:p>
+    <w:p>
+      <w:pPr>
+        <w:rPr>
+          <w:lang w:val="es-ES"/>
+        </w:rPr>
+      </w:pPr>
+    </w:p>
+    <w:p>
+      <w:pPr>
+        <w:pStyle w:val="Heading1"/>
+        <w:ind w:left="720"/>
+      </w:pPr>
+      <w:r>
+        <w:t>7. Evaluar (</w:t>
+      </w:r>
+      <w:proofErr w:type="spellStart"/>
+      <w:r>
+        <w:t>Evaluate</w:t>
+      </w:r>
+      <w:proofErr w:type="spellEnd"/>
+      <w:r>
+        <w:t>)</w:t>
+      </w:r>
+    </w:p>
+    <w:p>
+      <w:pPr>
+        <w:rPr>
+          <w:lang w:val="es-ES"/>
+        </w:rPr>
+      </w:pPr>
+      <w:r>
+        <w:rPr>
+          <w:lang w:val="es-ES"/>
+        </w:rPr>
+        <w:t>Cuando termine, verás la pestaña de Evaluación. Aquí es donde los estudiantes deben tomar las capturas de pantalla para la tarea.</w:t>
+      </w:r>
+    </w:p>
+    <w:p>
+      <w:pPr>
+        <w:rPr>
+          <w:lang w:val="es-ES"/>
+        </w:rPr>
+      </w:pPr>
+      <w:r>
+        <w:rPr>
+          <w:lang w:val="es-ES"/>
+        </w:rPr>
+        <w:t>Las métricas clave que deben revisar son:</w:t>
+      </w:r>
+    </w:p>
+    <w:p>
+      <w:pPr>
+        <w:rPr>
+          <w:lang w:val="es-ES"/>
+        </w:rPr>
+      </w:pPr>
+      <w:r>
+        <w:rPr>
+          <w:lang w:val="es-ES"/>
+        </w:rPr>
+        <w:t>R-cuadrado (R-</w:t>
+      </w:r>
+      <w:proofErr w:type="spellStart"/>
+      <w:r>
+        <w:rPr>
+          <w:lang w:val="es-ES"/>
+        </w:rPr>
+        <w:t>Squared</w:t>
+      </w:r>
+      <w:proofErr w:type="spellEnd"/>
+      <w:r>
+        <w:rPr>
+          <w:lang w:val="es-ES"/>
+        </w:rPr>
+        <w:t>): Mide la precisión general (mientras más cercano a 1, mejor). Debería ser alto ya que nuestra data sintética sigue reglas lógicas fuertes.</w:t>
+      </w:r>
+    </w:p>
+    <w:p>
+      <w:pPr>
+        <w:rPr>
+          <w:lang w:val="es-ES"/>
+        </w:rPr>
+      </w:pPr>
+      <w:r>
+        <w:rPr>
+          <w:lang w:val="es-ES"/>
+        </w:rPr>
+        <w:t>Error cuadrático medio (</w:t>
+      </w:r>
+      <w:proofErr w:type="spellStart"/>
+      <w:r>
+        <w:rPr>
+          <w:lang w:val="es-ES"/>
+        </w:rPr>
+        <w:t>RSquared</w:t>
+      </w:r>
+      <w:proofErr w:type="spellEnd"/>
+      <w:r>
+        <w:rPr>
+          <w:lang w:val="es-ES"/>
+        </w:rPr>
+        <w:t xml:space="preserve"> / RMSE): Mide la desviación de las predicciones en la moneda del problema.</w:t>
+      </w:r>
+    </w:p>
+    <w:p>
+      <w:pPr>
+        <w:rPr>
+          <w:lang w:val="es-ES"/>
+        </w:rPr>
+      </w:pPr>
+      <w:r>
+        <w:rPr>
+          <w:noProof/>
+        </w:rPr>
+        <w:lastRenderedPageBreak/>
+        <w:drawing>
+          <wp:inline distT="0" distB="0" distL="0" distR="0" wp14:anchorId="25467BCB" wp14:editId="3FCD8E5F">
+            <wp:extent cx="6400800" cy="2908935"/>
+            <wp:effectExtent l="0" t="0" r="0" b="5715"/>
+            <wp:docPr id="1007156165" name="Picture 1"/>
+            <wp:cNvGraphicFramePr>
+              <a:graphicFrameLocks xmlns:a="http://schemas.openxmlformats.org/drawingml/2006/main" noChangeAspect="1"/>
+            </wp:cNvGraphicFramePr>
+            <a:graphic xmlns:a="http://schemas.openxmlformats.org/drawingml/2006/main">
+              <a:graphicData uri="http://schemas.openxmlformats.org/drawingml/2006/picture">
+                <pic:pic xmlns:pic="http://schemas.openxmlformats.org/drawingml/2006/picture">
+                  <pic:nvPicPr>
+                    <pic:cNvPr id="1007156165" name=""/>
+                    <pic:cNvPicPr/>
+                  </pic:nvPicPr>
+                  <pic:blipFill>
+                    <a:blip r:embed="rId14"/>
+                    <a:stretch>
+                      <a:fillRect/>
+                    </a:stretch>
+                  </pic:blipFill>
+                  <pic:spPr>
+                    <a:xfrm>
+                      <a:off x="0" y="0"/>
+                      <a:ext cx="6400800" cy="2908935"/>
+                    </a:xfrm>
+                    <a:prstGeom prst="rect">
+                      <a:avLst/>
+                    </a:prstGeom>
+                  </pic:spPr>
+                </pic:pic>
+              </a:graphicData>
+            </a:graphic>
+          </wp:inline>
+        </w:drawing>
+      </w:r>
+    </w:p>
+    <w:p>
+      <w:pPr>
+        <w:pStyle w:val="Heading1"/>
+        <w:ind w:left="720"/>
+      </w:pPr>
+      <w:r>
+        <w:t>8. Usar el Modelo (Consume)</w:t>
+      </w:r>
+    </w:p>
+    <w:p>
+      <w:pPr>
+        <w:rPr>
+          <w:lang w:val="es-ES"/>
+        </w:rPr>
+      </w:pPr>
+      <w:r>
+        <w:rPr>
+          <w:lang w:val="es-ES"/>
+        </w:rPr>
+        <w:t>En la pestaña Consumir, Visual Studio te mostrará un bloque de código C# listo para usarse.</w:t>
+      </w:r>
+    </w:p>
+    <w:p>
+      <w:pPr>
+        <w:rPr>
+          <w:lang w:val="es-ES"/>
+        </w:rPr>
+      </w:pPr>
+      <w:r>
+        <w:rPr>
+          <w:lang w:val="es-ES"/>
+        </w:rPr>
+        <w:t xml:space="preserve">Visual Studio automáticamente agregará un par de archivos a tu proyecto (ej. </w:t>
+      </w:r>
+      <w:proofErr w:type="spellStart"/>
+      <w:r>
+        <w:rPr>
+          <w:lang w:val="es-ES"/>
+        </w:rPr>
+        <w:t>SalesModel.consumption.cs</w:t>
+      </w:r>
+      <w:proofErr w:type="spellEnd"/>
+      <w:r>
+        <w:rPr>
+          <w:lang w:val="es-ES"/>
+        </w:rPr>
+        <w:t xml:space="preserve"> y </w:t>
+      </w:r>
+      <w:proofErr w:type="spellStart"/>
+      <w:r>
+        <w:rPr>
+          <w:lang w:val="es-ES"/>
+        </w:rPr>
+        <w:t>SalesModel.training.cs</w:t>
+      </w:r>
+      <w:proofErr w:type="spellEnd"/>
+      <w:r>
+        <w:rPr>
+          <w:lang w:val="es-ES"/>
+        </w:rPr>
+        <w:t>).</w:t>
+      </w:r>
+    </w:p>
+    <w:p>
+      <w:pPr>
+        <w:rPr>
+          <w:lang w:val="es-ES"/>
+        </w:rPr>
+      </w:pPr>
+      <w:r>
+        <w:rPr>
+          <w:lang w:val="es-ES"/>
+        </w:rPr>
+        <w:t xml:space="preserve">Puedes copiar el bloque de código de ejemplo que te da la herramienta, pegarlo en tu archivo </w:t>
+      </w:r>
+      <w:proofErr w:type="spellStart"/>
+      <w:r>
+        <w:rPr>
+          <w:lang w:val="es-ES"/>
+        </w:rPr>
+        <w:t>Program.cs</w:t>
+      </w:r>
+      <w:proofErr w:type="spellEnd"/>
+      <w:r>
+        <w:rPr>
+          <w:lang w:val="es-ES"/>
+        </w:rPr>
+        <w:t xml:space="preserve"> y modificar los valores para hacer una prueba manual rápida, o generar el archivo de salida con todo el listado de ventas (Requisito #8 de la tarea).</w:t>
+      </w:r>
+    </w:p>
+    <w:p>
+      <w:pPr>
+        <w:rPr>
+          <w:lang w:val="es-ES"/>
+        </w:rPr>
+      </w:pPr>
+    </w:p>
+    <w:p/>
+    <w:p/>
+    <w:p/>
+    <w:p/>
+    <w:p/>
+    <w:p/>
+    <w:p/>
+    <w:p/>
+    <w:p>
+      <w:pPr>
+        <w:pStyle w:val="Heading1"/>
+      </w:pPr>
+    </w:p>
+    <w:p>
+      <w:pPr>
+        <w:pStyle w:val="Heading1"/>
+      </w:pPr>
+    </w:p>
     <w:p>
       <w:pPr>
         <w:pStyle w:val="Heading1"/>
@@ -2758,7 +3982,6 @@
               <w:rPr>
                 <w:sz w:val="14"/>
               </w:rPr>
-              <w:lastRenderedPageBreak/>
               <w:t>2025-11-01</w:t>
             </w:r>
           </w:p>
@@ -2895,19 +4118,20 @@
     <w:p>
       <w:pPr>
         <w:pStyle w:val="Heading1"/>
-      </w:pPr>
-      <w:r>
-        <w:t xml:space="preserve">9. </w:t>
-      </w:r>
-      <w:proofErr w:type="spellStart"/>
-      <w:r>
-        <w:t>Dashboard</w:t>
-      </w:r>
-      <w:proofErr w:type="spellEnd"/>
-      <w:r>
-        <w:t xml:space="preserve"> en Power BI</w:t>
-      </w:r>
-      <w:r>
+        <w:rPr>
+          <w:lang w:val="en-US"/>
+        </w:rPr>
+      </w:pPr>
+      <w:r>
+        <w:rPr>
+          <w:lang w:val="en-US"/>
+        </w:rPr>
+        <w:t>9. Dashboard en Power BI</w:t>
+      </w:r>
+      <w:r>
+        <w:rPr>
+          <w:lang w:val="en-US"/>
+        </w:rPr>
         <w:t xml:space="preserve"> o Looker</w:t>
       </w:r>
     </w:p>
@@ -2980,352 +4204,40 @@
         <w:t>Conclusiones sobre oportunidades, riesgos y recomendaciones comerciales.</w:t>
       </w:r>
     </w:p>
+    <w:p/>
     <w:p>
       <w:pPr>
         <w:pStyle w:val="Heading1"/>
       </w:pPr>
       <w:r>
-        <w:t xml:space="preserve">10. Uso opcional de </w:t>
-      </w:r>
-      <w:proofErr w:type="spellStart"/>
-      <w:r>
-        <w:t>Supabase</w:t>
-      </w:r>
-      <w:proofErr w:type="spellEnd"/>
+        <w:t>1</w:t>
+      </w:r>
+      <w:r>
+        <w:t>0</w:t>
+      </w:r>
+      <w:r>
+        <w:t>. Entregables de la tarea</w:t>
+      </w:r>
     </w:p>
     <w:p>
-      <w:r>
-        <w:t xml:space="preserve">De forma opcional, los grupos pueden almacenar la data sintética y las predicciones en </w:t>
-      </w:r>
+      <w:pPr>
+        <w:pStyle w:val="ListBullet"/>
+      </w:pPr>
       <w:proofErr w:type="spellStart"/>
       <w:r>
-        <w:t>Supabase</w:t>
+        <w:t>Prompt</w:t>
       </w:r>
       <w:proofErr w:type="spellEnd"/>
       <w:r>
-        <w:t>, usando una base PostgreSQL en la nube. Esta opción es recomendada para grupos que deseen presentar una solución más cercana a un entorno real de datos.</w:t>
-      </w:r>
-    </w:p>
-    <w:tbl>
-      <w:tblPr>
-        <w:tblW w:w="0" w:type="auto"/>
-        <w:jc w:val="center"/>
-        <w:tblLook w:val="04A0" w:firstRow="1" w:lastRow="0" w:firstColumn="1" w:lastColumn="0" w:noHBand="0" w:noVBand="1"/>
-      </w:tblPr>
-      <w:tblGrid>
-        <w:gridCol w:w="2971"/>
-        <w:gridCol w:w="3506"/>
-        <w:gridCol w:w="3819"/>
-      </w:tblGrid>
-      <w:tr>
-        <w:trPr>
-          <w:tblHeader/>
-          <w:jc w:val="center"/>
-        </w:trPr>
-        <w:tc>
-          <w:tcPr>
-            <w:tcW w:w="1728" w:type="dxa"/>
-            <w:shd w:val="clear" w:color="auto" w:fill="1F4E79"/>
-            <w:vAlign w:val="center"/>
-          </w:tcPr>
-          <w:p>
-            <w:r>
-              <w:rPr>
-                <w:b/>
-                <w:color w:val="FFFFFF"/>
-                <w:sz w:val="18"/>
-              </w:rPr>
-              <w:t>Nivel</w:t>
-            </w:r>
-          </w:p>
-        </w:tc>
-        <w:tc>
-          <w:tcPr>
-            <w:tcW w:w="4032" w:type="dxa"/>
-            <w:shd w:val="clear" w:color="auto" w:fill="1F4E79"/>
-            <w:vAlign w:val="center"/>
-          </w:tcPr>
-          <w:p>
-            <w:r>
-              <w:rPr>
-                <w:b/>
-                <w:color w:val="FFFFFF"/>
-                <w:sz w:val="18"/>
-              </w:rPr>
-              <w:t>Flujo</w:t>
-            </w:r>
-          </w:p>
-        </w:tc>
-        <w:tc>
-          <w:tcPr>
-            <w:tcW w:w="4320" w:type="dxa"/>
-            <w:shd w:val="clear" w:color="auto" w:fill="1F4E79"/>
-            <w:vAlign w:val="center"/>
-          </w:tcPr>
-          <w:p>
-            <w:r>
-              <w:rPr>
-                <w:b/>
-                <w:color w:val="FFFFFF"/>
-                <w:sz w:val="18"/>
-              </w:rPr>
-              <w:t>Recomendado para</w:t>
-            </w:r>
-          </w:p>
-        </w:tc>
-      </w:tr>
-      <w:tr>
-        <w:trPr>
-          <w:jc w:val="center"/>
-        </w:trPr>
-        <w:tc>
-          <w:tcPr>
-            <w:tcW w:w="3360" w:type="dxa"/>
-            <w:vAlign w:val="center"/>
-          </w:tcPr>
-          <w:p>
-            <w:r>
-              <w:rPr>
-                <w:b/>
-                <w:color w:val="1F4E79"/>
-                <w:sz w:val="18"/>
-              </w:rPr>
-              <w:t>Básico</w:t>
-            </w:r>
-          </w:p>
-        </w:tc>
-        <w:tc>
-          <w:tcPr>
-            <w:tcW w:w="3360" w:type="dxa"/>
-            <w:vAlign w:val="center"/>
-          </w:tcPr>
-          <w:p>
-            <w:r>
-              <w:rPr>
-                <w:sz w:val="18"/>
-              </w:rPr>
-              <w:t xml:space="preserve">CSV generado con </w:t>
-            </w:r>
-            <w:proofErr w:type="spellStart"/>
-            <w:r>
-              <w:rPr>
-                <w:sz w:val="18"/>
-              </w:rPr>
-              <w:t>prompt</w:t>
-            </w:r>
-            <w:proofErr w:type="spellEnd"/>
-            <w:r>
-              <w:rPr>
-                <w:sz w:val="18"/>
-              </w:rPr>
-              <w:t xml:space="preserve"> &gt; ML.NET Model </w:t>
-            </w:r>
-            <w:proofErr w:type="spellStart"/>
-            <w:r>
-              <w:rPr>
-                <w:sz w:val="18"/>
-              </w:rPr>
-              <w:t>Builder</w:t>
-            </w:r>
-            <w:proofErr w:type="spellEnd"/>
-            <w:r>
-              <w:rPr>
-                <w:sz w:val="18"/>
-              </w:rPr>
-              <w:t xml:space="preserve"> &gt; Excel</w:t>
-            </w:r>
-          </w:p>
-        </w:tc>
-        <w:tc>
-          <w:tcPr>
-            <w:tcW w:w="3360" w:type="dxa"/>
-            <w:vAlign w:val="center"/>
-          </w:tcPr>
-          <w:p>
-            <w:r>
-              <w:rPr>
-                <w:sz w:val="18"/>
-              </w:rPr>
-              <w:t>Estudiantes que priorizan comprender el flujo general.</w:t>
-            </w:r>
-          </w:p>
-        </w:tc>
-      </w:tr>
-      <w:tr>
-        <w:trPr>
-          <w:jc w:val="center"/>
-        </w:trPr>
-        <w:tc>
-          <w:tcPr>
-            <w:tcW w:w="3360" w:type="dxa"/>
-            <w:vAlign w:val="center"/>
-          </w:tcPr>
-          <w:p>
-            <w:r>
-              <w:rPr>
-                <w:b/>
-                <w:color w:val="1F4E79"/>
-                <w:sz w:val="18"/>
-              </w:rPr>
-              <w:t>Intermedio</w:t>
-            </w:r>
-          </w:p>
-        </w:tc>
-        <w:tc>
-          <w:tcPr>
-            <w:tcW w:w="3360" w:type="dxa"/>
-            <w:vAlign w:val="center"/>
-          </w:tcPr>
-          <w:p>
-            <w:r>
-              <w:rPr>
-                <w:sz w:val="18"/>
-              </w:rPr>
-              <w:t xml:space="preserve">CSV &gt; ML.NET Model </w:t>
-            </w:r>
-            <w:proofErr w:type="spellStart"/>
-            <w:r>
-              <w:rPr>
-                <w:sz w:val="18"/>
-              </w:rPr>
-              <w:t>Builder</w:t>
-            </w:r>
-            <w:proofErr w:type="spellEnd"/>
-            <w:r>
-              <w:rPr>
-                <w:sz w:val="18"/>
-              </w:rPr>
-              <w:t xml:space="preserve"> &gt; Power BI</w:t>
-            </w:r>
-          </w:p>
-        </w:tc>
-        <w:tc>
-          <w:tcPr>
-            <w:tcW w:w="3360" w:type="dxa"/>
-            <w:vAlign w:val="center"/>
-          </w:tcPr>
-          <w:p>
-            <w:r>
-              <w:rPr>
-                <w:sz w:val="18"/>
-              </w:rPr>
-              <w:t xml:space="preserve">Estudiantes que desean un </w:t>
-            </w:r>
-            <w:proofErr w:type="spellStart"/>
-            <w:r>
-              <w:rPr>
-                <w:sz w:val="18"/>
-              </w:rPr>
-              <w:t>dashboard</w:t>
-            </w:r>
-            <w:proofErr w:type="spellEnd"/>
-            <w:r>
-              <w:rPr>
-                <w:sz w:val="18"/>
-              </w:rPr>
-              <w:t xml:space="preserve"> más profesional.</w:t>
-            </w:r>
-          </w:p>
-        </w:tc>
-      </w:tr>
-      <w:tr>
-        <w:trPr>
-          <w:jc w:val="center"/>
-        </w:trPr>
-        <w:tc>
-          <w:tcPr>
-            <w:tcW w:w="3360" w:type="dxa"/>
-            <w:vAlign w:val="center"/>
-          </w:tcPr>
-          <w:p>
-            <w:r>
-              <w:rPr>
-                <w:b/>
-                <w:color w:val="1F4E79"/>
-                <w:sz w:val="18"/>
-              </w:rPr>
-              <w:t>Avanzado</w:t>
-            </w:r>
-          </w:p>
-        </w:tc>
-        <w:tc>
-          <w:tcPr>
-            <w:tcW w:w="3360" w:type="dxa"/>
-            <w:vAlign w:val="center"/>
-          </w:tcPr>
-          <w:p>
-            <w:r>
-              <w:rPr>
-                <w:sz w:val="18"/>
-              </w:rPr>
-              <w:t xml:space="preserve">CSV &gt; </w:t>
-            </w:r>
-            <w:proofErr w:type="spellStart"/>
-            <w:r>
-              <w:rPr>
-                <w:sz w:val="18"/>
-              </w:rPr>
-              <w:t>Supabase</w:t>
-            </w:r>
-            <w:proofErr w:type="spellEnd"/>
-            <w:r>
-              <w:rPr>
-                <w:sz w:val="18"/>
-              </w:rPr>
-              <w:t xml:space="preserve"> &gt; ML.NET &gt; </w:t>
-            </w:r>
-            <w:proofErr w:type="spellStart"/>
-            <w:r>
-              <w:rPr>
-                <w:sz w:val="18"/>
-              </w:rPr>
-              <w:t>Supabase</w:t>
-            </w:r>
-            <w:proofErr w:type="spellEnd"/>
-            <w:r>
-              <w:rPr>
-                <w:sz w:val="18"/>
-              </w:rPr>
-              <w:t xml:space="preserve"> &gt; Power BI</w:t>
-            </w:r>
-          </w:p>
-        </w:tc>
-        <w:tc>
-          <w:tcPr>
-            <w:tcW w:w="3360" w:type="dxa"/>
-            <w:vAlign w:val="center"/>
-          </w:tcPr>
-          <w:p>
-            <w:r>
-              <w:rPr>
-                <w:sz w:val="18"/>
-              </w:rPr>
-              <w:t>Estudiantes con mayor dominio técnico o interés en bases de datos en la nube.</w:t>
-            </w:r>
-          </w:p>
-        </w:tc>
-      </w:tr>
-    </w:tbl>
-    <w:p/>
-    <w:p>
-      <w:pPr>
-        <w:pStyle w:val="Heading1"/>
-      </w:pPr>
-      <w:r>
-        <w:t>11. Entregables de la tarea</w:t>
+        <w:t xml:space="preserve"> utilizado para generar la data sintética.</w:t>
       </w:r>
     </w:p>
     <w:p>
       <w:pPr>
         <w:pStyle w:val="ListBullet"/>
       </w:pPr>
-      <w:proofErr w:type="spellStart"/>
-      <w:r>
-        <w:t>Prompt</w:t>
-      </w:r>
-      <w:proofErr w:type="spellEnd"/>
-      <w:r>
-        <w:t xml:space="preserve"> utilizado para generar la data sintética.</w:t>
+      <w:r>
+        <w:t>Archivo CSV o Excel con la base de ventas generada.</w:t>
       </w:r>
     </w:p>
     <w:p>
@@ -3333,7 +4245,15 @@
         <w:pStyle w:val="ListBullet"/>
       </w:pPr>
       <w:r>
-        <w:t>Archivo CSV o Excel con la base de ventas generada.</w:t>
+        <w:t xml:space="preserve">Capturas del proceso de entrenamiento en ML.NET Model </w:t>
+      </w:r>
+      <w:proofErr w:type="spellStart"/>
+      <w:r>
+        <w:t>Builder</w:t>
+      </w:r>
+      <w:proofErr w:type="spellEnd"/>
+      <w:r>
+        <w:t>.</w:t>
       </w:r>
     </w:p>
     <w:p>
@@ -3341,15 +4261,7 @@
         <w:pStyle w:val="ListBullet"/>
       </w:pPr>
       <w:r>
-        <w:t xml:space="preserve">Capturas del proceso de entrenamiento en ML.NET Model </w:t>
-      </w:r>
-      <w:proofErr w:type="spellStart"/>
-      <w:r>
-        <w:t>Builder</w:t>
-      </w:r>
-      <w:proofErr w:type="spellEnd"/>
-      <w:r>
-        <w:t>.</w:t>
+        <w:t>Captura de las métricas del modelo.</w:t>
       </w:r>
     </w:p>
     <w:p>
@@ -3357,28 +4269,63 @@
         <w:pStyle w:val="ListBullet"/>
       </w:pPr>
       <w:r>
-        <w:t>Captura de las métricas del modelo.</w:t>
+        <w:t>Archivo Excel con ventas reales, ventas predichas y error.</w:t>
       </w:r>
     </w:p>
     <w:p>
       <w:pPr>
         <w:pStyle w:val="ListBullet"/>
-      </w:pPr>
-      <w:r>
-        <w:t>Archivo Excel con ventas reales, ventas predichas y error.</w:t>
+        <w:rPr>
+          <w:lang w:val="en-US"/>
+        </w:rPr>
+      </w:pPr>
+      <w:r>
+        <w:rPr>
+          <w:lang w:val="en-US"/>
+        </w:rPr>
+        <w:t>Dashboard en</w:t>
+      </w:r>
+      <w:r>
+        <w:rPr>
+          <w:lang w:val="en-US"/>
+        </w:rPr>
+        <w:t xml:space="preserve"> </w:t>
+      </w:r>
+      <w:proofErr w:type="gramStart"/>
+      <w:r>
+        <w:rPr>
+          <w:lang w:val="en-US"/>
+        </w:rPr>
+        <w:t>Html ,</w:t>
+      </w:r>
+      <w:proofErr w:type="gramEnd"/>
+      <w:r>
+        <w:rPr>
+          <w:lang w:val="en-US"/>
+        </w:rPr>
+        <w:t xml:space="preserve"> Excel </w:t>
+      </w:r>
+      <w:proofErr w:type="gramStart"/>
+      <w:r>
+        <w:rPr>
+          <w:lang w:val="en-US"/>
+        </w:rPr>
+        <w:t>o Power</w:t>
+      </w:r>
+      <w:proofErr w:type="gramEnd"/>
+      <w:r>
+        <w:rPr>
+          <w:lang w:val="en-US"/>
+        </w:rPr>
+        <w:t xml:space="preserve"> BI.</w:t>
       </w:r>
     </w:p>
     <w:p>
       <w:pPr>
         <w:pStyle w:val="ListBullet"/>
       </w:pPr>
-      <w:proofErr w:type="spellStart"/>
-      <w:r>
-        <w:t>Dashboard</w:t>
-      </w:r>
-      <w:proofErr w:type="spellEnd"/>
-      <w:r>
-        <w:t xml:space="preserve"> en Excel o Power BI.</w:t>
+      <w:r>
+        <w:t>Documento breve de conclusiones y recomendaciones.</w:t>
       </w:r>
     </w:p>
     <w:p>
@@ -3386,23 +4333,29 @@
         <w:pStyle w:val="ListBullet"/>
       </w:pPr>
       <w:r>
-        <w:t>Documento breve de conclusiones y recomendaciones.</w:t>
+        <w:t>Presentación corta de resultados.</w:t>
       </w:r>
     </w:p>
     <w:p>
       <w:pPr>
-        <w:pStyle w:val="ListBullet"/>
-      </w:pPr>
-      <w:r>
-        <w:t>Presentación corta de resultados, si el docente lo solicita.</w:t>
+        <w:pStyle w:val="Heading1"/>
+      </w:pPr>
+      <w:r>
+        <w:t>1</w:t>
+      </w:r>
+      <w:r>
+        <w:t>1</w:t>
+      </w:r>
+      <w:r>
+        <w:t>. Preguntas guía para el análisis</w:t>
       </w:r>
     </w:p>
     <w:p>
       <w:pPr>
-        <w:pStyle w:val="Heading1"/>
-      </w:pPr>
-      <w:r>
-        <w:t>12. Preguntas guía para el análisis</w:t>
+        <w:pStyle w:val="ListBullet"/>
+      </w:pPr>
+      <w:r>
+        <w:t>¿Qué productos presentan mayor venta estimada?</w:t>
       </w:r>
     </w:p>
     <w:p>
@@ -3410,7 +4363,7 @@
         <w:pStyle w:val="ListBullet"/>
       </w:pPr>
       <w:r>
-        <w:t>¿Qué productos presentan mayor venta estimada?</w:t>
+        <w:t>¿Qué zonas muestran mejor comportamiento comercial?</w:t>
       </w:r>
     </w:p>
     <w:p>
@@ -3418,8 +4371,7 @@
         <w:pStyle w:val="ListBullet"/>
       </w:pPr>
       <w:r>
-        <w:lastRenderedPageBreak/>
-        <w:t>¿Qué zonas muestran mejor comportamiento comercial?</w:t>
+        <w:t>¿En qué meses se observan mayores ventas?</w:t>
       </w:r>
     </w:p>
     <w:p>
@@ -3427,7 +4379,7 @@
         <w:pStyle w:val="ListBullet"/>
       </w:pPr>
       <w:r>
-        <w:t>¿En qué meses se observan mayores ventas?</w:t>
+        <w:t>¿Qué tan diferente es la venta predicha frente a la venta real?</w:t>
       </w:r>
     </w:p>
     <w:p>
@@ -3435,7 +4387,7 @@
         <w:pStyle w:val="ListBullet"/>
       </w:pPr>
       <w:r>
-        <w:t>¿Qué tan diferente es la venta predicha frente a la venta real?</w:t>
+        <w:t>¿Qué productos o zonas presentan mayor error de predicción?</w:t>
       </w:r>
     </w:p>
     <w:p>
@@ -3443,7 +4395,16 @@
         <w:pStyle w:val="ListBullet"/>
       </w:pPr>
       <w:r>
-        <w:t>¿Qué productos o zonas presentan mayor error de predicción?</w:t>
+        <w:lastRenderedPageBreak/>
+        <w:t xml:space="preserve">¿Qué decisiones podría tomar la empresa con base en el </w:t>
+      </w:r>
+      <w:proofErr w:type="spellStart"/>
+      <w:r>
+        <w:t>dashboard</w:t>
+      </w:r>
+      <w:proofErr w:type="spellEnd"/>
+      <w:r>
+        <w:t>?</w:t>
       </w:r>
     </w:p>
     <w:p>
@@ -3451,31 +4412,21 @@
         <w:pStyle w:val="ListBullet"/>
       </w:pPr>
       <w:r>
-        <w:t xml:space="preserve">¿Qué decisiones podría tomar la empresa con base en el </w:t>
-      </w:r>
-      <w:proofErr w:type="spellStart"/>
-      <w:r>
-        <w:t>dashboard</w:t>
-      </w:r>
-      <w:proofErr w:type="spellEnd"/>
-      <w:r>
-        <w:t>?</w:t>
+        <w:t>¿Qué limitaciones tiene trabajar con datos sintéticos?</w:t>
       </w:r>
     </w:p>
     <w:p>
       <w:pPr>
-        <w:pStyle w:val="ListBullet"/>
-      </w:pPr>
-      <w:r>
-        <w:t>¿Qué limitaciones tiene trabajar con datos sintéticos?</w:t>
-      </w:r>
-    </w:p>
-    <w:p>
-      <w:pPr>
         <w:pStyle w:val="Heading1"/>
       </w:pPr>
       <w:r>
-        <w:t>13. Rúbrica de evaluación</w:t>
+        <w:t>1</w:t>
+      </w:r>
+      <w:r>
+        <w:t>2</w:t>
+      </w:r>
+      <w:r>
+        <w:t>. Rúbrica de evaluación</w:t>
       </w:r>
     </w:p>
     <w:tbl>
@@ -3995,7 +4946,13 @@
         <w:pStyle w:val="Heading1"/>
       </w:pPr>
       <w:r>
-        <w:t>14. Formato de entrega</w:t>
+        <w:t>1</w:t>
+      </w:r>
+      <w:r>
+        <w:t>3</w:t>
+      </w:r>
+      <w:r>
+        <w:t>. Formato de entrega</w:t>
       </w:r>
     </w:p>
     <w:p>
@@ -4059,7 +5016,13 @@
         <w:pStyle w:val="Heading1"/>
       </w:pPr>
       <w:r>
-        <w:t>15. Resumen para publicar en plataforma</w:t>
+        <w:t>1</w:t>
+      </w:r>
+      <w:r>
+        <w:t>4</w:t>
+      </w:r>
+      <w:r>
+        <w:t>. Resumen para publicar en plataforma</w:t>
       </w:r>
     </w:p>
     <w:tbl>
@@ -4149,8 +5112,8 @@
     </w:tbl>
     <w:p/>
     <w:sectPr>
-      <w:headerReference w:type="default" r:id="rId8"/>
-      <w:footerReference w:type="default" r:id="rId9"/>
+      <w:headerReference w:type="default" r:id="rId15"/>
+      <w:footerReference w:type="default" r:id="rId16"/>
       <w:pgSz w:w="12240" w:h="15840"/>
       <w:pgMar w:top="936" w:right="1080" w:bottom="936" w:left="1080" w:header="720" w:footer="720" w:gutter="0"/>
       <w:cols w:space="720"/>
@@ -4315,33 +5278,13 @@
           <w:pPr>
             <w:pStyle w:val="Header"/>
             <w:jc w:val="right"/>
-            <w:rPr>
-              <w:lang w:val="es-ES"/>
-            </w:rPr>
           </w:pPr>
           <w:r>
             <w:rPr>
               <w:color w:val="666666"/>
               <w:sz w:val="16"/>
-              <w:lang w:val="es-ES"/>
             </w:rPr>
-            <w:t xml:space="preserve">Actividad académica </w:t>
-          </w:r>
-          <w:r>
-            <w:rPr>
-              <w:color w:val="666666"/>
-              <w:sz w:val="16"/>
-              <w:lang w:val="es-ES"/>
-            </w:rPr>
-            <w:t>Inteligencia de Negocios</w:t>
-          </w:r>
-          <w:r>
-            <w:rPr>
-              <w:color w:val="666666"/>
-              <w:sz w:val="16"/>
-              <w:lang w:val="es-ES"/>
-            </w:rPr>
-            <w:t xml:space="preserve"> </w:t>
+            <w:t xml:space="preserve">Actividad académica Inteligencia de Negocios </w:t>
           </w:r>
         </w:p>
         <w:p>
@@ -4363,7 +5306,6 @@
               <w:color w:val="000000"/>
               <w:sz w:val="24"/>
               <w:szCs w:val="24"/>
-              <w:lang w:val="es-ES"/>
             </w:rPr>
           </w:pPr>
         </w:p>
@@ -4628,14 +5570,12 @@
               <w:color w:val="000000"/>
               <w:sz w:val="14"/>
               <w:szCs w:val="14"/>
-              <w:lang w:val="es-ES"/>
             </w:rPr>
           </w:pPr>
           <w:r>
             <w:rPr>
               <w:color w:val="666666"/>
               <w:sz w:val="16"/>
-              <w:lang w:val="es-ES"/>
             </w:rPr>
             <w:t>Predicción de ventas con IA, ML.NET y BI</w:t>
           </w:r>
@@ -4865,9 +5805,6 @@
     <w:pPr>
       <w:pStyle w:val="Header"/>
       <w:jc w:val="right"/>
-      <w:rPr>
-        <w:lang w:val="es-ES"/>
-      </w:rPr>
     </w:pPr>
   </w:p>
 </w:hdr>
@@ -16547,6 +17484,29 @@
       </w:tcPr>
     </w:tblStylePr>
   </w:style>
+  <w:style w:type="character" w:styleId="Hyperlink">
+    <w:name w:val="Hyperlink"/>
+    <w:basedOn w:val="DefaultParagraphFont"/>
+    <w:uiPriority w:val="99"/>
+    <w:unhideWhenUsed/>
+    <w:rsid w:val="00B946B6"/>
+    <w:rPr>
+      <w:color w:val="0000FF" w:themeColor="hyperlink"/>
+      <w:u w:val="single"/>
+    </w:rPr>
+  </w:style>
+  <w:style w:type="character" w:styleId="UnresolvedMention">
+    <w:name w:val="Unresolved Mention"/>
+    <w:basedOn w:val="DefaultParagraphFont"/>
+    <w:uiPriority w:val="99"/>
+    <w:semiHidden/>
+    <w:unhideWhenUsed/>
+    <w:rsid w:val="00B946B6"/>
+    <w:rPr>
+      <w:color w:val="605E5C"/>
+      <w:shd w:val="clear" w:color="auto" w:fill="E1DFDD"/>
+    </w:rPr>
+  </w:style>
 </w:styles>
 </file>
 

</xml_diff>

<commit_message>
fix: corrige referencias NuGet en train2/SalesPredictionApp
</commit_message>
<xml_diff>
--- a/Tarea_Prediccion_Ventas_MLNET_ModelBuilder.docx
+++ b/Tarea_Prediccion_Ventas_MLNET_ModelBuilder.docx
@@ -25,25 +25,7 @@
           <w:color w:val="1F4E79"/>
           <w:sz w:val="38"/>
         </w:rPr>
-        <w:t xml:space="preserve">Predicción de ventas con datos sintéticos, ML.NET Model </w:t>
-      </w:r>
-      <w:proofErr w:type="spellStart"/>
-      <w:r>
-        <w:rPr>
-          <w:b/>
-          <w:color w:val="1F4E79"/>
-          <w:sz w:val="38"/>
-        </w:rPr>
-        <w:t>Builder</w:t>
-      </w:r>
-      <w:proofErr w:type="spellEnd"/>
-      <w:r>
-        <w:rPr>
-          <w:b/>
-          <w:color w:val="1F4E79"/>
-          <w:sz w:val="38"/>
-        </w:rPr>
-        <w:t xml:space="preserve"> y visualización BI</w:t>
+        <w:t>Predicción de ventas con datos sintéticos, ML.NET Model Builder y visualización BI</w:t>
       </w:r>
     </w:p>
     <w:p/>
@@ -157,21 +139,7 @@
               <w:rPr>
                 <w:sz w:val="18"/>
               </w:rPr>
-              <w:t xml:space="preserve">IA generativa, Excel, Visual Studio, ML.NET Model </w:t>
-            </w:r>
-            <w:proofErr w:type="spellStart"/>
-            <w:r>
-              <w:rPr>
-                <w:sz w:val="18"/>
-              </w:rPr>
-              <w:t>Builder</w:t>
-            </w:r>
-            <w:proofErr w:type="spellEnd"/>
-            <w:r>
-              <w:rPr>
-                <w:sz w:val="18"/>
-              </w:rPr>
-              <w:t>, Power BI opcional</w:t>
+              <w:t>IA generativa, Excel, Visual Studio, ML.NET Model Builder, Power BI opcional</w:t>
             </w:r>
           </w:p>
         </w:tc>
@@ -206,16 +174,8 @@
               <w:rPr>
                 <w:sz w:val="18"/>
               </w:rPr>
-              <w:t xml:space="preserve">Data sintética, modelo entrenado visualmente, archivo de predicciones y </w:t>
+              <w:t>Data sintética, modelo entrenado visualmente, archivo de predicciones y dashboard</w:t>
             </w:r>
-            <w:proofErr w:type="spellStart"/>
-            <w:r>
-              <w:rPr>
-                <w:sz w:val="18"/>
-              </w:rPr>
-              <w:t>dashboard</w:t>
-            </w:r>
-            <w:proofErr w:type="spellEnd"/>
           </w:p>
         </w:tc>
       </w:tr>
@@ -248,21 +208,7 @@
               <w:rPr>
                 <w:sz w:val="18"/>
               </w:rPr>
-              <w:t xml:space="preserve">El estudiante aplicará un flujo completo de analítica predictiva: crear datos sintéticos de ventas, entrenar visualmente un modelo con ML.NET Model </w:t>
-            </w:r>
-            <w:proofErr w:type="spellStart"/>
-            <w:r>
-              <w:rPr>
-                <w:sz w:val="18"/>
-              </w:rPr>
-              <w:t>Builder</w:t>
-            </w:r>
-            <w:proofErr w:type="spellEnd"/>
-            <w:r>
-              <w:rPr>
-                <w:sz w:val="18"/>
-              </w:rPr>
-              <w:t xml:space="preserve"> y presentar los resultados mediante Power BI, priorizando el análisis de negocio sobre la programación avanzada.</w:t>
+              <w:t>El estudiante aplicará un flujo completo de analítica predictiva: crear datos sintéticos de ventas, entrenar visualmente un modelo con ML.NET Model Builder y presentar los resultados mediante Power BI, priorizando el análisis de negocio sobre la programación avanzada.</w:t>
             </w:r>
           </w:p>
         </w:tc>
@@ -284,23 +230,7 @@
     </w:p>
     <w:p>
       <w:r>
-        <w:t xml:space="preserve">Como no se utilizarán datos reales de una empresa, cada estudiante o grupo deberá generar una base de datos sintética de ventas usando un </w:t>
-      </w:r>
-      <w:proofErr w:type="spellStart"/>
-      <w:r>
-        <w:t>prompt</w:t>
-      </w:r>
-      <w:proofErr w:type="spellEnd"/>
-      <w:r>
-        <w:t xml:space="preserve"> de inteligencia artificial. Luego deberá entrenar un modelo predictivo de manera visual con ML.NET Model </w:t>
-      </w:r>
-      <w:proofErr w:type="spellStart"/>
-      <w:r>
-        <w:t>Builder</w:t>
-      </w:r>
-      <w:proofErr w:type="spellEnd"/>
-      <w:r>
-        <w:t xml:space="preserve"> y finalmente construir un tablero de análisis en Power BI.</w:t>
+        <w:t>Como no se utilizarán datos reales de una empresa, cada estudiante o grupo deberá generar una base de datos sintética de ventas usando un prompt de inteligencia artificial. Luego deberá entrenar un modelo predictivo de manera visual con ML.NET Model Builder y finalmente construir un tablero de análisis en Power BI.</w:t>
       </w:r>
     </w:p>
     <w:p>
@@ -313,15 +243,7 @@
     </w:p>
     <w:p>
       <w:r>
-        <w:t xml:space="preserve">Desarrollar una actividad práctica de predicción de ventas utilizando datos sintéticos, herramientas de Machine </w:t>
-      </w:r>
-      <w:proofErr w:type="spellStart"/>
-      <w:r>
-        <w:t>Learning</w:t>
-      </w:r>
-      <w:proofErr w:type="spellEnd"/>
-      <w:r>
-        <w:t xml:space="preserve"> de bajo código y visualización BI, con el fin de comprender cómo los datos pueden apoyar la toma de decisiones empresariales.</w:t>
+        <w:t>Desarrollar una actividad práctica de predicción de ventas utilizando datos sintéticos, herramientas de Machine Learning de bajo código y visualización BI, con el fin de comprender cómo los datos pueden apoyar la toma de decisiones empresariales.</w:t>
       </w:r>
     </w:p>
     <w:p/>
@@ -354,15 +276,7 @@
         <w:t>a</w:t>
       </w:r>
       <w:r>
-        <w:t xml:space="preserve"> cuenta en </w:t>
-      </w:r>
-      <w:proofErr w:type="spellStart"/>
-      <w:r>
-        <w:t>github</w:t>
-      </w:r>
-      <w:proofErr w:type="spellEnd"/>
-      <w:r>
-        <w:t xml:space="preserve"> con correo institucional</w:t>
+        <w:t xml:space="preserve"> cuenta en github con correo institucional</w:t>
       </w:r>
     </w:p>
     <w:p>
@@ -394,40 +308,25 @@
         </w:numPr>
       </w:pPr>
       <w:r>
-        <w:t xml:space="preserve">Instalar Visual </w:t>
-      </w:r>
-      <w:proofErr w:type="gramStart"/>
-      <w:r>
-        <w:t>Studio.net</w:t>
+        <w:t>Instalar Visual Studio.net</w:t>
       </w:r>
       <w:r>
         <w:t xml:space="preserve">  (</w:t>
       </w:r>
-      <w:proofErr w:type="gramEnd"/>
-      <w:r>
-        <w:fldChar w:fldCharType="begin"/>
-      </w:r>
-      <w:r>
-        <w:instrText>HYPERLINK "https://docs.google.com/document/d/1XgnTRQ6FcvNWjedVrU0Ez4Eq49GYsSeX/edit?usp=sharing&amp;ouid=113151263569452840243&amp;rtpof=true&amp;sd=true"</w:instrText>
-      </w:r>
-      <w:r>
-        <w:fldChar w:fldCharType="separate"/>
-      </w:r>
-      <w:r>
-        <w:rPr>
-          <w:rStyle w:val="Hyperlink"/>
-        </w:rPr>
-        <w:t xml:space="preserve">Ver Guia de </w:t>
-      </w:r>
-      <w:r>
-        <w:rPr>
-          <w:rStyle w:val="Hyperlink"/>
-        </w:rPr>
-        <w:t>Instalación</w:t>
-      </w:r>
-      <w:r>
-        <w:fldChar w:fldCharType="end"/>
-      </w:r>
+      <w:hyperlink r:id="rId9" w:history="1">
+        <w:r>
+          <w:rPr>
+            <w:rStyle w:val="Hyperlink"/>
+          </w:rPr>
+          <w:t xml:space="preserve">Ver Guia de </w:t>
+        </w:r>
+        <w:r>
+          <w:rPr>
+            <w:rStyle w:val="Hyperlink"/>
+          </w:rPr>
+          <w:t>Instalación</w:t>
+        </w:r>
+      </w:hyperlink>
       <w:r>
         <w:t>)</w:t>
       </w:r>
@@ -446,13 +345,8 @@
       <w:r>
         <w:t xml:space="preserve">Google </w:t>
       </w:r>
-      <w:proofErr w:type="spellStart"/>
       <w:r>
-        <w:t>Antigravity</w:t>
-      </w:r>
-      <w:proofErr w:type="spellEnd"/>
-      <w:r>
-        <w:t xml:space="preserve"> </w:t>
+        <w:t xml:space="preserve">Antigravity </w:t>
       </w:r>
       <w:r>
         <w:t>(opcional)</w:t>
@@ -547,15 +441,7 @@
         <w:pStyle w:val="ListBullet"/>
       </w:pPr>
       <w:r>
-        <w:t xml:space="preserve">Utilizar ML.NET Model </w:t>
-      </w:r>
-      <w:proofErr w:type="spellStart"/>
-      <w:r>
-        <w:t>Builder</w:t>
-      </w:r>
-      <w:proofErr w:type="spellEnd"/>
-      <w:r>
-        <w:t xml:space="preserve"> para generar un modelo sin profundizar en programación.</w:t>
+        <w:t>Utilizar ML.NET Model Builder para generar un modelo sin profundizar en programación.</w:t>
       </w:r>
     </w:p>
     <w:p>
@@ -587,15 +473,7 @@
         <w:pStyle w:val="ListNumber"/>
       </w:pPr>
       <w:r>
-        <w:t xml:space="preserve">Generar una base de datos sintética de ventas usando un </w:t>
-      </w:r>
-      <w:proofErr w:type="spellStart"/>
-      <w:r>
-        <w:t>prompt</w:t>
-      </w:r>
-      <w:proofErr w:type="spellEnd"/>
-      <w:r>
-        <w:t xml:space="preserve"> de IA.</w:t>
+        <w:t>Generar una base de datos sintética de ventas usando un prompt de IA.</w:t>
       </w:r>
     </w:p>
     <w:p>
@@ -619,15 +497,7 @@
         <w:pStyle w:val="ListNumber"/>
       </w:pPr>
       <w:r>
-        <w:t xml:space="preserve">Crear un proyecto en Visual Studio y usar ML.NET Model </w:t>
-      </w:r>
-      <w:proofErr w:type="spellStart"/>
-      <w:r>
-        <w:t>Builder</w:t>
-      </w:r>
-      <w:proofErr w:type="spellEnd"/>
-      <w:r>
-        <w:t xml:space="preserve"> para entrenar un modelo de predicción de valor.</w:t>
+        <w:t>Crear un proyecto en Visual Studio y usar ML.NET Model Builder para entrenar un modelo de predicción de valor.</w:t>
       </w:r>
     </w:p>
     <w:p>
@@ -635,15 +505,7 @@
         <w:pStyle w:val="ListNumber"/>
       </w:pPr>
       <w:r>
-        <w:t xml:space="preserve">Seleccionar la columna </w:t>
-      </w:r>
-      <w:proofErr w:type="spellStart"/>
-      <w:r>
-        <w:t>total_sales</w:t>
-      </w:r>
-      <w:proofErr w:type="spellEnd"/>
-      <w:r>
-        <w:t xml:space="preserve"> como variable a predecir.</w:t>
+        <w:t>Seleccionar la columna total_sales como variable a predecir.</w:t>
       </w:r>
     </w:p>
     <w:p>
@@ -667,15 +529,7 @@
         <w:pStyle w:val="ListNumber"/>
       </w:pPr>
       <w:r>
-        <w:t xml:space="preserve">Construir un </w:t>
-      </w:r>
-      <w:proofErr w:type="spellStart"/>
-      <w:r>
-        <w:t>dashboard</w:t>
-      </w:r>
-      <w:proofErr w:type="spellEnd"/>
-      <w:r>
-        <w:t xml:space="preserve"> en Excel o Power BI.</w:t>
+        <w:t>Construir un dashboard en Excel o Power BI.</w:t>
       </w:r>
     </w:p>
     <w:p>
@@ -691,29 +545,13 @@
         <w:pStyle w:val="Heading1"/>
       </w:pPr>
       <w:r>
-        <w:t xml:space="preserve">5. </w:t>
-      </w:r>
-      <w:proofErr w:type="spellStart"/>
-      <w:r>
-        <w:t>Prompt</w:t>
-      </w:r>
-      <w:proofErr w:type="spellEnd"/>
-      <w:r>
-        <w:t xml:space="preserve"> base para generar la data sintética</w:t>
+        <w:t>5. Prompt base para generar la data sintética</w:t>
       </w:r>
     </w:p>
     <w:p/>
     <w:p>
       <w:r>
-        <w:t xml:space="preserve">El siguiente </w:t>
-      </w:r>
-      <w:proofErr w:type="spellStart"/>
-      <w:r>
-        <w:t>prompt</w:t>
-      </w:r>
-      <w:proofErr w:type="spellEnd"/>
-      <w:r>
-        <w:t xml:space="preserve"> puede ser usado como punto de partida. El estudiante puede mejorarlo, pero debe conservar la estructura mínima de datos solicitada.</w:t>
+        <w:t>El siguiente prompt puede ser usado como punto de partida. El estudiante puede mejorarlo, pero debe conservar la estructura mínima de datos solicitada.</w:t>
       </w:r>
     </w:p>
     <w:p/>
@@ -745,23 +583,7 @@
                 <w:rFonts w:ascii="Consolas" w:eastAsia="Consolas" w:hAnsi="Consolas"/>
                 <w:sz w:val="17"/>
               </w:rPr>
-              <w:t xml:space="preserve">Actúa como un analista de datos especializado en Machine </w:t>
-            </w:r>
-            <w:proofErr w:type="spellStart"/>
-            <w:r>
-              <w:rPr>
-                <w:rFonts w:ascii="Consolas" w:eastAsia="Consolas" w:hAnsi="Consolas"/>
-                <w:sz w:val="17"/>
-              </w:rPr>
-              <w:t>Learning</w:t>
-            </w:r>
-            <w:proofErr w:type="spellEnd"/>
-            <w:r>
-              <w:rPr>
-                <w:rFonts w:ascii="Consolas" w:eastAsia="Consolas" w:hAnsi="Consolas"/>
-                <w:sz w:val="17"/>
-              </w:rPr>
-              <w:t xml:space="preserve"> aplicado a ventas.</w:t>
+              <w:t>Actúa como un analista de datos especializado en Machine Learning aplicado a ventas.</w:t>
             </w:r>
             <w:r>
               <w:rPr>
@@ -791,39 +613,7 @@
                 <w:sz w:val="17"/>
               </w:rPr>
               <w:br/>
-              <w:t xml:space="preserve">El archivo será usado en ML.NET Model </w:t>
-            </w:r>
-            <w:proofErr w:type="spellStart"/>
-            <w:r>
-              <w:rPr>
-                <w:rFonts w:ascii="Consolas" w:eastAsia="Consolas" w:hAnsi="Consolas"/>
-                <w:sz w:val="17"/>
-              </w:rPr>
-              <w:t>Builder</w:t>
-            </w:r>
-            <w:proofErr w:type="spellEnd"/>
-            <w:r>
-              <w:rPr>
-                <w:rFonts w:ascii="Consolas" w:eastAsia="Consolas" w:hAnsi="Consolas"/>
-                <w:sz w:val="17"/>
-              </w:rPr>
-              <w:t xml:space="preserve"> para entrenar un modelo de regresión que prediga la columna </w:t>
-            </w:r>
-            <w:proofErr w:type="spellStart"/>
-            <w:r>
-              <w:rPr>
-                <w:rFonts w:ascii="Consolas" w:eastAsia="Consolas" w:hAnsi="Consolas"/>
-                <w:sz w:val="17"/>
-              </w:rPr>
-              <w:t>total_sales</w:t>
-            </w:r>
-            <w:proofErr w:type="spellEnd"/>
-            <w:r>
-              <w:rPr>
-                <w:rFonts w:ascii="Consolas" w:eastAsia="Consolas" w:hAnsi="Consolas"/>
-                <w:sz w:val="17"/>
-              </w:rPr>
-              <w:t>.</w:t>
+              <w:t>El archivo será usado en ML.NET Model Builder para entrenar un modelo de regresión que prediga la columna total_sales.</w:t>
             </w:r>
             <w:r>
               <w:rPr>
@@ -862,41 +652,13 @@
               </w:rPr>
               <w:br/>
             </w:r>
-            <w:proofErr w:type="spellStart"/>
             <w:r>
               <w:rPr>
                 <w:rFonts w:ascii="Consolas" w:eastAsia="Consolas" w:hAnsi="Consolas"/>
                 <w:sz w:val="17"/>
                 <w:lang w:val="en-US"/>
               </w:rPr>
-              <w:t>Incluye</w:t>
-            </w:r>
-            <w:proofErr w:type="spellEnd"/>
-            <w:r>
-              <w:rPr>
-                <w:rFonts w:ascii="Consolas" w:eastAsia="Consolas" w:hAnsi="Consolas"/>
-                <w:sz w:val="17"/>
-                <w:lang w:val="en-US"/>
-              </w:rPr>
-              <w:t xml:space="preserve"> las </w:t>
-            </w:r>
-            <w:proofErr w:type="spellStart"/>
-            <w:r>
-              <w:rPr>
-                <w:rFonts w:ascii="Consolas" w:eastAsia="Consolas" w:hAnsi="Consolas"/>
-                <w:sz w:val="17"/>
-                <w:lang w:val="en-US"/>
-              </w:rPr>
-              <w:t>siguientes</w:t>
-            </w:r>
-            <w:proofErr w:type="spellEnd"/>
-            <w:r>
-              <w:rPr>
-                <w:rFonts w:ascii="Consolas" w:eastAsia="Consolas" w:hAnsi="Consolas"/>
-                <w:sz w:val="17"/>
-                <w:lang w:val="en-US"/>
-              </w:rPr>
-              <w:t xml:space="preserve"> columnas:</w:t>
+              <w:t>Incluye las siguientes columnas:</w:t>
             </w:r>
             <w:r>
               <w:rPr>
@@ -905,114 +667,7 @@
                 <w:lang w:val="en-US"/>
               </w:rPr>
               <w:br/>
-            </w:r>
-            <w:proofErr w:type="spellStart"/>
-            <w:r>
-              <w:rPr>
-                <w:rFonts w:ascii="Consolas" w:eastAsia="Consolas" w:hAnsi="Consolas"/>
-                <w:sz w:val="17"/>
-                <w:lang w:val="en-US"/>
-              </w:rPr>
-              <w:t>sale_id</w:t>
-            </w:r>
-            <w:proofErr w:type="spellEnd"/>
-            <w:r>
-              <w:rPr>
-                <w:rFonts w:ascii="Consolas" w:eastAsia="Consolas" w:hAnsi="Consolas"/>
-                <w:sz w:val="17"/>
-                <w:lang w:val="en-US"/>
-              </w:rPr>
-              <w:t xml:space="preserve">, </w:t>
-            </w:r>
-            <w:proofErr w:type="spellStart"/>
-            <w:r>
-              <w:rPr>
-                <w:rFonts w:ascii="Consolas" w:eastAsia="Consolas" w:hAnsi="Consolas"/>
-                <w:sz w:val="17"/>
-                <w:lang w:val="en-US"/>
-              </w:rPr>
-              <w:t>sale_date</w:t>
-            </w:r>
-            <w:proofErr w:type="spellEnd"/>
-            <w:r>
-              <w:rPr>
-                <w:rFonts w:ascii="Consolas" w:eastAsia="Consolas" w:hAnsi="Consolas"/>
-                <w:sz w:val="17"/>
-                <w:lang w:val="en-US"/>
-              </w:rPr>
-              <w:t xml:space="preserve">, </w:t>
-            </w:r>
-            <w:proofErr w:type="spellStart"/>
-            <w:r>
-              <w:rPr>
-                <w:rFonts w:ascii="Consolas" w:eastAsia="Consolas" w:hAnsi="Consolas"/>
-                <w:sz w:val="17"/>
-                <w:lang w:val="en-US"/>
-              </w:rPr>
-              <w:t>year_number</w:t>
-            </w:r>
-            <w:proofErr w:type="spellEnd"/>
-            <w:r>
-              <w:rPr>
-                <w:rFonts w:ascii="Consolas" w:eastAsia="Consolas" w:hAnsi="Consolas"/>
-                <w:sz w:val="17"/>
-                <w:lang w:val="en-US"/>
-              </w:rPr>
-              <w:t xml:space="preserve">, </w:t>
-            </w:r>
-            <w:proofErr w:type="spellStart"/>
-            <w:r>
-              <w:rPr>
-                <w:rFonts w:ascii="Consolas" w:eastAsia="Consolas" w:hAnsi="Consolas"/>
-                <w:sz w:val="17"/>
-                <w:lang w:val="en-US"/>
-              </w:rPr>
-              <w:t>month_number</w:t>
-            </w:r>
-            <w:proofErr w:type="spellEnd"/>
-            <w:r>
-              <w:rPr>
-                <w:rFonts w:ascii="Consolas" w:eastAsia="Consolas" w:hAnsi="Consolas"/>
-                <w:sz w:val="17"/>
-                <w:lang w:val="en-US"/>
-              </w:rPr>
-              <w:t xml:space="preserve">, </w:t>
-            </w:r>
-            <w:proofErr w:type="spellStart"/>
-            <w:r>
-              <w:rPr>
-                <w:rFonts w:ascii="Consolas" w:eastAsia="Consolas" w:hAnsi="Consolas"/>
-                <w:sz w:val="17"/>
-                <w:lang w:val="en-US"/>
-              </w:rPr>
-              <w:t>day_number</w:t>
-            </w:r>
-            <w:proofErr w:type="spellEnd"/>
-            <w:r>
-              <w:rPr>
-                <w:rFonts w:ascii="Consolas" w:eastAsia="Consolas" w:hAnsi="Consolas"/>
-                <w:sz w:val="17"/>
-                <w:lang w:val="en-US"/>
-              </w:rPr>
-              <w:t xml:space="preserve">, </w:t>
-            </w:r>
-            <w:proofErr w:type="spellStart"/>
-            <w:r>
-              <w:rPr>
-                <w:rFonts w:ascii="Consolas" w:eastAsia="Consolas" w:hAnsi="Consolas"/>
-                <w:sz w:val="17"/>
-                <w:lang w:val="en-US"/>
-              </w:rPr>
-              <w:t>day_of_week</w:t>
-            </w:r>
-            <w:proofErr w:type="spellEnd"/>
-            <w:r>
-              <w:rPr>
-                <w:rFonts w:ascii="Consolas" w:eastAsia="Consolas" w:hAnsi="Consolas"/>
-                <w:sz w:val="17"/>
-                <w:lang w:val="en-US"/>
-              </w:rPr>
-              <w:t>,</w:t>
+              <w:t>sale_id, sale_date, year_number, month_number, day_number, day_of_week,</w:t>
             </w:r>
             <w:r>
               <w:rPr>
@@ -1021,96 +676,7 @@
                 <w:lang w:val="en-US"/>
               </w:rPr>
               <w:br/>
-            </w:r>
-            <w:proofErr w:type="spellStart"/>
-            <w:r>
-              <w:rPr>
-                <w:rFonts w:ascii="Consolas" w:eastAsia="Consolas" w:hAnsi="Consolas"/>
-                <w:sz w:val="17"/>
-                <w:lang w:val="en-US"/>
-              </w:rPr>
-              <w:t>customer_code</w:t>
-            </w:r>
-            <w:proofErr w:type="spellEnd"/>
-            <w:r>
-              <w:rPr>
-                <w:rFonts w:ascii="Consolas" w:eastAsia="Consolas" w:hAnsi="Consolas"/>
-                <w:sz w:val="17"/>
-                <w:lang w:val="en-US"/>
-              </w:rPr>
-              <w:t xml:space="preserve">, </w:t>
-            </w:r>
-            <w:proofErr w:type="spellStart"/>
-            <w:r>
-              <w:rPr>
-                <w:rFonts w:ascii="Consolas" w:eastAsia="Consolas" w:hAnsi="Consolas"/>
-                <w:sz w:val="17"/>
-                <w:lang w:val="en-US"/>
-              </w:rPr>
-              <w:t>customer_name</w:t>
-            </w:r>
-            <w:proofErr w:type="spellEnd"/>
-            <w:r>
-              <w:rPr>
-                <w:rFonts w:ascii="Consolas" w:eastAsia="Consolas" w:hAnsi="Consolas"/>
-                <w:sz w:val="17"/>
-                <w:lang w:val="en-US"/>
-              </w:rPr>
-              <w:t xml:space="preserve">, </w:t>
-            </w:r>
-            <w:proofErr w:type="spellStart"/>
-            <w:r>
-              <w:rPr>
-                <w:rFonts w:ascii="Consolas" w:eastAsia="Consolas" w:hAnsi="Consolas"/>
-                <w:sz w:val="17"/>
-                <w:lang w:val="en-US"/>
-              </w:rPr>
-              <w:t>product_code</w:t>
-            </w:r>
-            <w:proofErr w:type="spellEnd"/>
-            <w:r>
-              <w:rPr>
-                <w:rFonts w:ascii="Consolas" w:eastAsia="Consolas" w:hAnsi="Consolas"/>
-                <w:sz w:val="17"/>
-                <w:lang w:val="en-US"/>
-              </w:rPr>
-              <w:t xml:space="preserve">, </w:t>
-            </w:r>
-            <w:proofErr w:type="spellStart"/>
-            <w:r>
-              <w:rPr>
-                <w:rFonts w:ascii="Consolas" w:eastAsia="Consolas" w:hAnsi="Consolas"/>
-                <w:sz w:val="17"/>
-                <w:lang w:val="en-US"/>
-              </w:rPr>
-              <w:t>product_name</w:t>
-            </w:r>
-            <w:proofErr w:type="spellEnd"/>
-            <w:r>
-              <w:rPr>
-                <w:rFonts w:ascii="Consolas" w:eastAsia="Consolas" w:hAnsi="Consolas"/>
-                <w:sz w:val="17"/>
-                <w:lang w:val="en-US"/>
-              </w:rPr>
-              <w:t xml:space="preserve">, </w:t>
-            </w:r>
-            <w:proofErr w:type="spellStart"/>
-            <w:r>
-              <w:rPr>
-                <w:rFonts w:ascii="Consolas" w:eastAsia="Consolas" w:hAnsi="Consolas"/>
-                <w:sz w:val="17"/>
-                <w:lang w:val="en-US"/>
-              </w:rPr>
-              <w:t>category_name</w:t>
-            </w:r>
-            <w:proofErr w:type="spellEnd"/>
-            <w:r>
-              <w:rPr>
-                <w:rFonts w:ascii="Consolas" w:eastAsia="Consolas" w:hAnsi="Consolas"/>
-                <w:sz w:val="17"/>
-                <w:lang w:val="en-US"/>
-              </w:rPr>
-              <w:t>,</w:t>
+              <w:t>customer_code, customer_name, product_code, product_name, category_name,</w:t>
             </w:r>
             <w:r>
               <w:rPr>
@@ -1119,78 +685,7 @@
                 <w:lang w:val="en-US"/>
               </w:rPr>
               <w:br/>
-            </w:r>
-            <w:proofErr w:type="spellStart"/>
-            <w:r>
-              <w:rPr>
-                <w:rFonts w:ascii="Consolas" w:eastAsia="Consolas" w:hAnsi="Consolas"/>
-                <w:sz w:val="17"/>
-                <w:lang w:val="en-US"/>
-              </w:rPr>
-              <w:t>zone_name</w:t>
-            </w:r>
-            <w:proofErr w:type="spellEnd"/>
-            <w:r>
-              <w:rPr>
-                <w:rFonts w:ascii="Consolas" w:eastAsia="Consolas" w:hAnsi="Consolas"/>
-                <w:sz w:val="17"/>
-                <w:lang w:val="en-US"/>
-              </w:rPr>
-              <w:t xml:space="preserve">, </w:t>
-            </w:r>
-            <w:proofErr w:type="spellStart"/>
-            <w:r>
-              <w:rPr>
-                <w:rFonts w:ascii="Consolas" w:eastAsia="Consolas" w:hAnsi="Consolas"/>
-                <w:sz w:val="17"/>
-                <w:lang w:val="en-US"/>
-              </w:rPr>
-              <w:t>salesman_name</w:t>
-            </w:r>
-            <w:proofErr w:type="spellEnd"/>
-            <w:r>
-              <w:rPr>
-                <w:rFonts w:ascii="Consolas" w:eastAsia="Consolas" w:hAnsi="Consolas"/>
-                <w:sz w:val="17"/>
-                <w:lang w:val="en-US"/>
-              </w:rPr>
-              <w:t xml:space="preserve">, </w:t>
-            </w:r>
-            <w:proofErr w:type="spellStart"/>
-            <w:r>
-              <w:rPr>
-                <w:rFonts w:ascii="Consolas" w:eastAsia="Consolas" w:hAnsi="Consolas"/>
-                <w:sz w:val="17"/>
-                <w:lang w:val="en-US"/>
-              </w:rPr>
-              <w:t>warehouse_name</w:t>
-            </w:r>
-            <w:proofErr w:type="spellEnd"/>
-            <w:r>
-              <w:rPr>
-                <w:rFonts w:ascii="Consolas" w:eastAsia="Consolas" w:hAnsi="Consolas"/>
-                <w:sz w:val="17"/>
-                <w:lang w:val="en-US"/>
-              </w:rPr>
-              <w:t xml:space="preserve">, quantity, </w:t>
-            </w:r>
-            <w:proofErr w:type="spellStart"/>
-            <w:r>
-              <w:rPr>
-                <w:rFonts w:ascii="Consolas" w:eastAsia="Consolas" w:hAnsi="Consolas"/>
-                <w:sz w:val="17"/>
-                <w:lang w:val="en-US"/>
-              </w:rPr>
-              <w:t>unit_price</w:t>
-            </w:r>
-            <w:proofErr w:type="spellEnd"/>
-            <w:r>
-              <w:rPr>
-                <w:rFonts w:ascii="Consolas" w:eastAsia="Consolas" w:hAnsi="Consolas"/>
-                <w:sz w:val="17"/>
-                <w:lang w:val="en-US"/>
-              </w:rPr>
-              <w:t>,</w:t>
+              <w:t>zone_name, salesman_name, warehouse_name, quantity, unit_price,</w:t>
             </w:r>
             <w:r>
               <w:rPr>
@@ -1199,42 +694,7 @@
                 <w:lang w:val="en-US"/>
               </w:rPr>
               <w:br/>
-            </w:r>
-            <w:proofErr w:type="spellStart"/>
-            <w:r>
-              <w:rPr>
-                <w:rFonts w:ascii="Consolas" w:eastAsia="Consolas" w:hAnsi="Consolas"/>
-                <w:sz w:val="17"/>
-                <w:lang w:val="en-US"/>
-              </w:rPr>
-              <w:t>discount_percentage</w:t>
-            </w:r>
-            <w:proofErr w:type="spellEnd"/>
-            <w:r>
-              <w:rPr>
-                <w:rFonts w:ascii="Consolas" w:eastAsia="Consolas" w:hAnsi="Consolas"/>
-                <w:sz w:val="17"/>
-                <w:lang w:val="en-US"/>
-              </w:rPr>
-              <w:t xml:space="preserve">, </w:t>
-            </w:r>
-            <w:proofErr w:type="spellStart"/>
-            <w:r>
-              <w:rPr>
-                <w:rFonts w:ascii="Consolas" w:eastAsia="Consolas" w:hAnsi="Consolas"/>
-                <w:sz w:val="17"/>
-                <w:lang w:val="en-US"/>
-              </w:rPr>
-              <w:t>total_sales</w:t>
-            </w:r>
-            <w:proofErr w:type="spellEnd"/>
-            <w:r>
-              <w:rPr>
-                <w:rFonts w:ascii="Consolas" w:eastAsia="Consolas" w:hAnsi="Consolas"/>
-                <w:sz w:val="17"/>
-                <w:lang w:val="en-US"/>
-              </w:rPr>
-              <w:t>.</w:t>
+              <w:t>discount_percentage, total_sales.</w:t>
             </w:r>
             <w:r>
               <w:rPr>
@@ -1265,39 +725,7 @@
                 <w:sz w:val="17"/>
               </w:rPr>
               <w:br/>
-              <w:t xml:space="preserve">1. La columna </w:t>
-            </w:r>
-            <w:proofErr w:type="spellStart"/>
-            <w:r>
-              <w:rPr>
-                <w:rFonts w:ascii="Consolas" w:eastAsia="Consolas" w:hAnsi="Consolas"/>
-                <w:sz w:val="17"/>
-              </w:rPr>
-              <w:t>total_sales</w:t>
-            </w:r>
-            <w:proofErr w:type="spellEnd"/>
-            <w:r>
-              <w:rPr>
-                <w:rFonts w:ascii="Consolas" w:eastAsia="Consolas" w:hAnsi="Consolas"/>
-                <w:sz w:val="17"/>
-              </w:rPr>
-              <w:t xml:space="preserve"> será </w:t>
-            </w:r>
-            <w:proofErr w:type="gramStart"/>
-            <w:r>
-              <w:rPr>
-                <w:rFonts w:ascii="Consolas" w:eastAsia="Consolas" w:hAnsi="Consolas"/>
-                <w:sz w:val="17"/>
-              </w:rPr>
-              <w:t>la variable a predecir</w:t>
-            </w:r>
-            <w:proofErr w:type="gramEnd"/>
-            <w:r>
-              <w:rPr>
-                <w:rFonts w:ascii="Consolas" w:eastAsia="Consolas" w:hAnsi="Consolas"/>
-                <w:sz w:val="17"/>
-              </w:rPr>
-              <w:t>.</w:t>
+              <w:t>1. La columna total_sales será la variable a predecir.</w:t>
             </w:r>
             <w:r>
               <w:rPr>
@@ -1320,133 +748,7 @@
                 <w:sz w:val="17"/>
                 <w:lang w:val="en-US"/>
               </w:rPr>
-              <w:t xml:space="preserve">3. Las columnas quantity, </w:t>
-            </w:r>
-            <w:proofErr w:type="spellStart"/>
-            <w:r>
-              <w:rPr>
-                <w:rFonts w:ascii="Consolas" w:eastAsia="Consolas" w:hAnsi="Consolas"/>
-                <w:sz w:val="17"/>
-                <w:lang w:val="en-US"/>
-              </w:rPr>
-              <w:t>unit_price</w:t>
-            </w:r>
-            <w:proofErr w:type="spellEnd"/>
-            <w:r>
-              <w:rPr>
-                <w:rFonts w:ascii="Consolas" w:eastAsia="Consolas" w:hAnsi="Consolas"/>
-                <w:sz w:val="17"/>
-                <w:lang w:val="en-US"/>
-              </w:rPr>
-              <w:t xml:space="preserve">, </w:t>
-            </w:r>
-            <w:proofErr w:type="spellStart"/>
-            <w:r>
-              <w:rPr>
-                <w:rFonts w:ascii="Consolas" w:eastAsia="Consolas" w:hAnsi="Consolas"/>
-                <w:sz w:val="17"/>
-                <w:lang w:val="en-US"/>
-              </w:rPr>
-              <w:t>discount_percentage</w:t>
-            </w:r>
-            <w:proofErr w:type="spellEnd"/>
-            <w:r>
-              <w:rPr>
-                <w:rFonts w:ascii="Consolas" w:eastAsia="Consolas" w:hAnsi="Consolas"/>
-                <w:sz w:val="17"/>
-                <w:lang w:val="en-US"/>
-              </w:rPr>
-              <w:t xml:space="preserve">, </w:t>
-            </w:r>
-            <w:proofErr w:type="spellStart"/>
-            <w:r>
-              <w:rPr>
-                <w:rFonts w:ascii="Consolas" w:eastAsia="Consolas" w:hAnsi="Consolas"/>
-                <w:sz w:val="17"/>
-                <w:lang w:val="en-US"/>
-              </w:rPr>
-              <w:t>month_number</w:t>
-            </w:r>
-            <w:proofErr w:type="spellEnd"/>
-            <w:r>
-              <w:rPr>
-                <w:rFonts w:ascii="Consolas" w:eastAsia="Consolas" w:hAnsi="Consolas"/>
-                <w:sz w:val="17"/>
-                <w:lang w:val="en-US"/>
-              </w:rPr>
-              <w:t xml:space="preserve"> y </w:t>
-            </w:r>
-            <w:proofErr w:type="spellStart"/>
-            <w:r>
-              <w:rPr>
-                <w:rFonts w:ascii="Consolas" w:eastAsia="Consolas" w:hAnsi="Consolas"/>
-                <w:sz w:val="17"/>
-                <w:lang w:val="en-US"/>
-              </w:rPr>
-              <w:t>day_of_week</w:t>
-            </w:r>
-            <w:proofErr w:type="spellEnd"/>
-            <w:r>
-              <w:rPr>
-                <w:rFonts w:ascii="Consolas" w:eastAsia="Consolas" w:hAnsi="Consolas"/>
-                <w:sz w:val="17"/>
-                <w:lang w:val="en-US"/>
-              </w:rPr>
-              <w:t xml:space="preserve"> </w:t>
-            </w:r>
-            <w:proofErr w:type="spellStart"/>
-            <w:r>
-              <w:rPr>
-                <w:rFonts w:ascii="Consolas" w:eastAsia="Consolas" w:hAnsi="Consolas"/>
-                <w:sz w:val="17"/>
-                <w:lang w:val="en-US"/>
-              </w:rPr>
-              <w:t>deben</w:t>
-            </w:r>
-            <w:proofErr w:type="spellEnd"/>
-            <w:r>
-              <w:rPr>
-                <w:rFonts w:ascii="Consolas" w:eastAsia="Consolas" w:hAnsi="Consolas"/>
-                <w:sz w:val="17"/>
-                <w:lang w:val="en-US"/>
-              </w:rPr>
-              <w:t xml:space="preserve"> </w:t>
-            </w:r>
-            <w:proofErr w:type="spellStart"/>
-            <w:r>
-              <w:rPr>
-                <w:rFonts w:ascii="Consolas" w:eastAsia="Consolas" w:hAnsi="Consolas"/>
-                <w:sz w:val="17"/>
-                <w:lang w:val="en-US"/>
-              </w:rPr>
-              <w:t>influir</w:t>
-            </w:r>
-            <w:proofErr w:type="spellEnd"/>
-            <w:r>
-              <w:rPr>
-                <w:rFonts w:ascii="Consolas" w:eastAsia="Consolas" w:hAnsi="Consolas"/>
-                <w:sz w:val="17"/>
-                <w:lang w:val="en-US"/>
-              </w:rPr>
-              <w:t xml:space="preserve"> en </w:t>
-            </w:r>
-            <w:proofErr w:type="spellStart"/>
-            <w:r>
-              <w:rPr>
-                <w:rFonts w:ascii="Consolas" w:eastAsia="Consolas" w:hAnsi="Consolas"/>
-                <w:sz w:val="17"/>
-                <w:lang w:val="en-US"/>
-              </w:rPr>
-              <w:t>total_sales</w:t>
-            </w:r>
-            <w:proofErr w:type="spellEnd"/>
-            <w:r>
-              <w:rPr>
-                <w:rFonts w:ascii="Consolas" w:eastAsia="Consolas" w:hAnsi="Consolas"/>
-                <w:sz w:val="17"/>
-                <w:lang w:val="en-US"/>
-              </w:rPr>
-              <w:t>.</w:t>
+              <w:t>3. Las columnas quantity, unit_price, discount_percentage, month_number y day_of_week deben influir en total_sales.</w:t>
             </w:r>
             <w:r>
               <w:rPr>
@@ -1516,71 +818,7 @@
                 <w:sz w:val="17"/>
               </w:rPr>
               <w:br/>
-              <w:t xml:space="preserve">10. Calcula </w:t>
-            </w:r>
-            <w:proofErr w:type="spellStart"/>
-            <w:r>
-              <w:rPr>
-                <w:rFonts w:ascii="Consolas" w:eastAsia="Consolas" w:hAnsi="Consolas"/>
-                <w:sz w:val="17"/>
-              </w:rPr>
-              <w:t>total_sales</w:t>
-            </w:r>
-            <w:proofErr w:type="spellEnd"/>
-            <w:r>
-              <w:rPr>
-                <w:rFonts w:ascii="Consolas" w:eastAsia="Consolas" w:hAnsi="Consolas"/>
-                <w:sz w:val="17"/>
-              </w:rPr>
-              <w:t xml:space="preserve"> como: </w:t>
-            </w:r>
-            <w:proofErr w:type="spellStart"/>
-            <w:r>
-              <w:rPr>
-                <w:rFonts w:ascii="Consolas" w:eastAsia="Consolas" w:hAnsi="Consolas"/>
-                <w:sz w:val="17"/>
-              </w:rPr>
-              <w:t>quantity</w:t>
-            </w:r>
-            <w:proofErr w:type="spellEnd"/>
-            <w:r>
-              <w:rPr>
-                <w:rFonts w:ascii="Consolas" w:eastAsia="Consolas" w:hAnsi="Consolas"/>
-                <w:sz w:val="17"/>
-              </w:rPr>
-              <w:t xml:space="preserve"> * </w:t>
-            </w:r>
-            <w:proofErr w:type="spellStart"/>
-            <w:r>
-              <w:rPr>
-                <w:rFonts w:ascii="Consolas" w:eastAsia="Consolas" w:hAnsi="Consolas"/>
-                <w:sz w:val="17"/>
-              </w:rPr>
-              <w:t>unit_price</w:t>
-            </w:r>
-            <w:proofErr w:type="spellEnd"/>
-            <w:r>
-              <w:rPr>
-                <w:rFonts w:ascii="Consolas" w:eastAsia="Consolas" w:hAnsi="Consolas"/>
-                <w:sz w:val="17"/>
-              </w:rPr>
-              <w:t xml:space="preserve"> * (1 - </w:t>
-            </w:r>
-            <w:proofErr w:type="spellStart"/>
-            <w:r>
-              <w:rPr>
-                <w:rFonts w:ascii="Consolas" w:eastAsia="Consolas" w:hAnsi="Consolas"/>
-                <w:sz w:val="17"/>
-              </w:rPr>
-              <w:t>discount_percentage</w:t>
-            </w:r>
-            <w:proofErr w:type="spellEnd"/>
-            <w:r>
-              <w:rPr>
-                <w:rFonts w:ascii="Consolas" w:eastAsia="Consolas" w:hAnsi="Consolas"/>
-                <w:sz w:val="17"/>
-              </w:rPr>
-              <w:t xml:space="preserve"> / 100).</w:t>
+              <w:t>10. Calcula total_sales como: quantity * unit_price * (1 - discount_percentage / 100).</w:t>
             </w:r>
             <w:r>
               <w:rPr>
@@ -1588,23 +826,7 @@
                 <w:sz w:val="17"/>
               </w:rPr>
               <w:br/>
-              <w:t xml:space="preserve">11. Entrega el resultado como CSV listo para abrir en Excel y usar en ML.NET Model </w:t>
-            </w:r>
-            <w:proofErr w:type="spellStart"/>
-            <w:r>
-              <w:rPr>
-                <w:rFonts w:ascii="Consolas" w:eastAsia="Consolas" w:hAnsi="Consolas"/>
-                <w:sz w:val="17"/>
-              </w:rPr>
-              <w:t>Builder</w:t>
-            </w:r>
-            <w:proofErr w:type="spellEnd"/>
-            <w:r>
-              <w:rPr>
-                <w:rFonts w:ascii="Consolas" w:eastAsia="Consolas" w:hAnsi="Consolas"/>
-                <w:sz w:val="17"/>
-              </w:rPr>
-              <w:t>.</w:t>
+              <w:t>11. Entrega el resultado como CSV listo para abrir en Excel y usar en ML.NET Model Builder.</w:t>
             </w:r>
           </w:p>
         </w:tc>
@@ -1679,7 +901,6 @@
             <w:vAlign w:val="center"/>
           </w:tcPr>
           <w:p>
-            <w:proofErr w:type="spellStart"/>
             <w:r>
               <w:rPr>
                 <w:b/>
@@ -1688,7 +909,6 @@
               </w:rPr>
               <w:t>sale_id</w:t>
             </w:r>
-            <w:proofErr w:type="spellEnd"/>
           </w:p>
         </w:tc>
         <w:tc>
@@ -1716,7 +936,6 @@
             <w:vAlign w:val="center"/>
           </w:tcPr>
           <w:p>
-            <w:proofErr w:type="spellStart"/>
             <w:r>
               <w:rPr>
                 <w:b/>
@@ -1725,7 +944,6 @@
               </w:rPr>
               <w:t>sale_date</w:t>
             </w:r>
-            <w:proofErr w:type="spellEnd"/>
           </w:p>
         </w:tc>
         <w:tc>
@@ -1753,7 +971,6 @@
             <w:vAlign w:val="center"/>
           </w:tcPr>
           <w:p>
-            <w:proofErr w:type="spellStart"/>
             <w:r>
               <w:rPr>
                 <w:b/>
@@ -1762,7 +979,6 @@
               </w:rPr>
               <w:t>product_name</w:t>
             </w:r>
-            <w:proofErr w:type="spellEnd"/>
           </w:p>
         </w:tc>
         <w:tc>
@@ -1790,7 +1006,6 @@
             <w:vAlign w:val="center"/>
           </w:tcPr>
           <w:p>
-            <w:proofErr w:type="spellStart"/>
             <w:r>
               <w:rPr>
                 <w:b/>
@@ -1799,7 +1014,6 @@
               </w:rPr>
               <w:t>category_name</w:t>
             </w:r>
-            <w:proofErr w:type="spellEnd"/>
           </w:p>
         </w:tc>
         <w:tc>
@@ -1827,7 +1041,6 @@
             <w:vAlign w:val="center"/>
           </w:tcPr>
           <w:p>
-            <w:proofErr w:type="spellStart"/>
             <w:r>
               <w:rPr>
                 <w:b/>
@@ -1836,7 +1049,6 @@
               </w:rPr>
               <w:t>zone_name</w:t>
             </w:r>
-            <w:proofErr w:type="spellEnd"/>
           </w:p>
         </w:tc>
         <w:tc>
@@ -1864,7 +1076,6 @@
             <w:vAlign w:val="center"/>
           </w:tcPr>
           <w:p>
-            <w:proofErr w:type="spellStart"/>
             <w:r>
               <w:rPr>
                 <w:b/>
@@ -1873,7 +1084,6 @@
               </w:rPr>
               <w:t>salesman_name</w:t>
             </w:r>
-            <w:proofErr w:type="spellEnd"/>
           </w:p>
         </w:tc>
         <w:tc>
@@ -1901,7 +1111,6 @@
             <w:vAlign w:val="center"/>
           </w:tcPr>
           <w:p>
-            <w:proofErr w:type="spellStart"/>
             <w:r>
               <w:rPr>
                 <w:b/>
@@ -1910,7 +1119,6 @@
               </w:rPr>
               <w:t>warehouse_name</w:t>
             </w:r>
-            <w:proofErr w:type="spellEnd"/>
           </w:p>
         </w:tc>
         <w:tc>
@@ -1938,7 +1146,6 @@
             <w:vAlign w:val="center"/>
           </w:tcPr>
           <w:p>
-            <w:proofErr w:type="spellStart"/>
             <w:r>
               <w:rPr>
                 <w:b/>
@@ -1947,7 +1154,6 @@
               </w:rPr>
               <w:t>quantity</w:t>
             </w:r>
-            <w:proofErr w:type="spellEnd"/>
           </w:p>
         </w:tc>
         <w:tc>
@@ -1975,7 +1181,6 @@
             <w:vAlign w:val="center"/>
           </w:tcPr>
           <w:p>
-            <w:proofErr w:type="spellStart"/>
             <w:r>
               <w:rPr>
                 <w:b/>
@@ -1984,7 +1189,6 @@
               </w:rPr>
               <w:t>unit_price</w:t>
             </w:r>
-            <w:proofErr w:type="spellEnd"/>
           </w:p>
         </w:tc>
         <w:tc>
@@ -2012,7 +1216,6 @@
             <w:vAlign w:val="center"/>
           </w:tcPr>
           <w:p>
-            <w:proofErr w:type="spellStart"/>
             <w:r>
               <w:rPr>
                 <w:b/>
@@ -2021,7 +1224,6 @@
               </w:rPr>
               <w:t>discount_percentage</w:t>
             </w:r>
-            <w:proofErr w:type="spellEnd"/>
           </w:p>
         </w:tc>
         <w:tc>
@@ -2049,7 +1251,6 @@
             <w:vAlign w:val="center"/>
           </w:tcPr>
           <w:p>
-            <w:proofErr w:type="spellStart"/>
             <w:r>
               <w:rPr>
                 <w:b/>
@@ -2058,7 +1259,6 @@
               </w:rPr>
               <w:t>total_sales</w:t>
             </w:r>
-            <w:proofErr w:type="spellEnd"/>
           </w:p>
         </w:tc>
         <w:tc>
@@ -2071,16 +1271,8 @@
               <w:rPr>
                 <w:sz w:val="18"/>
               </w:rPr>
-              <w:t xml:space="preserve">Valor total de venta. Será </w:t>
+              <w:t>Valor total de venta. Será la variable a predecir</w:t>
             </w:r>
-            <w:proofErr w:type="gramStart"/>
-            <w:r>
-              <w:rPr>
-                <w:sz w:val="18"/>
-              </w:rPr>
-              <w:t>la variable a predecir</w:t>
-            </w:r>
-            <w:proofErr w:type="gramEnd"/>
           </w:p>
         </w:tc>
       </w:tr>
@@ -2091,25 +1283,12 @@
         <w:pStyle w:val="Heading1"/>
       </w:pPr>
       <w:r>
-        <w:t xml:space="preserve">7. Entrenamiento visual con ML.NET Model </w:t>
+        <w:t>7. Entrenamiento visual con ML.NET Model Builder</w:t>
       </w:r>
-      <w:proofErr w:type="spellStart"/>
-      <w:r>
-        <w:t>Builder</w:t>
-      </w:r>
-      <w:proofErr w:type="spellEnd"/>
     </w:p>
     <w:p>
       <w:r>
-        <w:t xml:space="preserve">En esta actividad no se busca que el estudiante programe manualmente el algoritmo. El modelo se debe generar visualmente usando ML.NET Model </w:t>
-      </w:r>
-      <w:proofErr w:type="spellStart"/>
-      <w:r>
-        <w:t>Builder</w:t>
-      </w:r>
-      <w:proofErr w:type="spellEnd"/>
-      <w:r>
-        <w:t xml:space="preserve"> dentro de Visual Studio.</w:t>
+        <w:t>En esta actividad no se busca que el estudiante programe manualmente el algoritmo. El modelo se debe generar visualmente usando ML.NET Model Builder dentro de Visual Studio.</w:t>
       </w:r>
     </w:p>
     <w:tbl>
@@ -2275,21 +1454,7 @@
               <w:rPr>
                 <w:sz w:val="18"/>
               </w:rPr>
-              <w:t xml:space="preserve">Clic derecho sobre el proyecto y seleccionar Add &gt; Machine </w:t>
-            </w:r>
-            <w:proofErr w:type="spellStart"/>
-            <w:r>
-              <w:rPr>
-                <w:sz w:val="18"/>
-              </w:rPr>
-              <w:t>Learning</w:t>
-            </w:r>
-            <w:proofErr w:type="spellEnd"/>
-            <w:r>
-              <w:rPr>
-                <w:sz w:val="18"/>
-              </w:rPr>
-              <w:t xml:space="preserve"> Model.</w:t>
+              <w:t>Clic derecho sobre el proyecto y seleccionar Add &gt; Machine Learning Model.</w:t>
             </w:r>
           </w:p>
         </w:tc>
@@ -2339,35 +1504,7 @@
               <w:rPr>
                 <w:sz w:val="18"/>
               </w:rPr>
-              <w:t xml:space="preserve">Seleccionar </w:t>
-            </w:r>
-            <w:proofErr w:type="spellStart"/>
-            <w:r>
-              <w:rPr>
-                <w:sz w:val="18"/>
-              </w:rPr>
-              <w:t>Value</w:t>
-            </w:r>
-            <w:proofErr w:type="spellEnd"/>
-            <w:r>
-              <w:rPr>
-                <w:sz w:val="18"/>
-              </w:rPr>
-              <w:t xml:space="preserve"> </w:t>
-            </w:r>
-            <w:proofErr w:type="spellStart"/>
-            <w:r>
-              <w:rPr>
-                <w:sz w:val="18"/>
-              </w:rPr>
-              <w:t>Prediction</w:t>
-            </w:r>
-            <w:proofErr w:type="spellEnd"/>
-            <w:r>
-              <w:rPr>
-                <w:sz w:val="18"/>
-              </w:rPr>
-              <w:t xml:space="preserve"> o Regresión.</w:t>
+              <w:t>Seleccionar Value Prediction o Regresión.</w:t>
             </w:r>
           </w:p>
         </w:tc>
@@ -2467,21 +1604,7 @@
               <w:rPr>
                 <w:sz w:val="18"/>
               </w:rPr>
-              <w:t xml:space="preserve">Seleccionar </w:t>
-            </w:r>
-            <w:proofErr w:type="spellStart"/>
-            <w:r>
-              <w:rPr>
-                <w:sz w:val="18"/>
-              </w:rPr>
-              <w:t>total_sales</w:t>
-            </w:r>
-            <w:proofErr w:type="spellEnd"/>
-            <w:r>
-              <w:rPr>
-                <w:sz w:val="18"/>
-              </w:rPr>
-              <w:t xml:space="preserve"> como columna a predecir.</w:t>
+              <w:t>Seleccionar total_sales como columna a predecir.</w:t>
             </w:r>
           </w:p>
         </w:tc>
@@ -2531,21 +1654,7 @@
               <w:rPr>
                 <w:sz w:val="18"/>
               </w:rPr>
-              <w:t xml:space="preserve">Permitir que Model </w:t>
-            </w:r>
-            <w:proofErr w:type="spellStart"/>
-            <w:r>
-              <w:rPr>
-                <w:sz w:val="18"/>
-              </w:rPr>
-              <w:t>Builder</w:t>
-            </w:r>
-            <w:proofErr w:type="spellEnd"/>
-            <w:r>
-              <w:rPr>
-                <w:sz w:val="18"/>
-              </w:rPr>
-              <w:t xml:space="preserve"> pruebe diferentes modelos automáticamente.</w:t>
+              <w:t>Permitir que Model Builder pruebe diferentes modelos automáticamente.</w:t>
             </w:r>
           </w:p>
         </w:tc>
@@ -2738,23 +1847,8 @@
         <w:rPr>
           <w:lang w:val="es-ES"/>
         </w:rPr>
-        <w:t xml:space="preserve"> </w:t>
+        <w:t xml:space="preserve"> SalesPredictionApp.csproj </w:t>
       </w:r>
-      <w:proofErr w:type="spellStart"/>
-      <w:r>
-        <w:rPr>
-          <w:lang w:val="es-ES"/>
-        </w:rPr>
-        <w:t>SalesPredictionApp.csproj</w:t>
-      </w:r>
-      <w:proofErr w:type="spellEnd"/>
-      <w:r>
-        <w:rPr>
-          <w:lang w:val="es-ES"/>
-        </w:rPr>
-        <w:t xml:space="preserve"> </w:t>
-      </w:r>
-      <w:proofErr w:type="gramStart"/>
       <w:r>
         <w:rPr>
           <w:lang w:val="es-ES"/>
@@ -2765,43 +1859,66 @@
         <w:rPr>
           <w:lang w:val="es-ES"/>
         </w:rPr>
-        <w:t xml:space="preserve"> crear</w:t>
+        <w:t xml:space="preserve"> crear la carpeta SalesPredictionApp.</w:t>
       </w:r>
-      <w:proofErr w:type="gramEnd"/>
+    </w:p>
+    <w:p>
+      <w:pPr>
+        <w:pStyle w:val="Heading1"/>
+        <w:ind w:left="720"/>
+      </w:pPr>
+      <w:r>
+        <w:t>7.</w:t>
+      </w:r>
+      <w:r>
+        <w:t>2. Agregar el Modelo de Machine Learning</w:t>
+      </w:r>
+    </w:p>
+    <w:p>
+      <w:pPr>
+        <w:rPr>
+          <w:lang w:val="es-ES"/>
+        </w:rPr>
+      </w:pPr>
       <w:r>
         <w:rPr>
           <w:lang w:val="es-ES"/>
         </w:rPr>
-        <w:t xml:space="preserve"> la carpeta </w:t>
+        <w:t>En el panel del Explorador de Soluciones (generalmente a la derecha), haz clic derecho sobre el proyecto SalesPredictionApp.</w:t>
       </w:r>
-      <w:proofErr w:type="spellStart"/>
+    </w:p>
+    <w:p>
+      <w:pPr>
+        <w:rPr>
+          <w:lang w:val="en-US"/>
+        </w:rPr>
+      </w:pPr>
+      <w:r>
+        <w:rPr>
+          <w:lang w:val="en-US"/>
+        </w:rPr>
+        <w:t>Selecciona Agregar &gt; Modelo de Machine Learning... (o Add &gt; Machine Learning Model).</w:t>
+      </w:r>
+    </w:p>
+    <w:p>
+      <w:pPr>
+        <w:rPr>
+          <w:lang w:val="es-ES"/>
+        </w:rPr>
+      </w:pPr>
       <w:r>
         <w:rPr>
           <w:lang w:val="es-ES"/>
         </w:rPr>
-        <w:t>SalesPredictionApp</w:t>
+        <w:t>Visual Studio te pedirá que le asignes un nombre al modelo. Puedes llamarlo SalesModel.mbconfig y darle a Agregar.</w:t>
       </w:r>
-      <w:proofErr w:type="spellEnd"/>
-      <w:r>
+    </w:p>
+    <w:p>
+      <w:pPr>
         <w:rPr>
           <w:lang w:val="es-ES"/>
         </w:rPr>
-        <w:t>.</w:t>
-      </w:r>
-    </w:p>
-    <w:p>
-      <w:pPr>
-        <w:pStyle w:val="Heading1"/>
-        <w:ind w:left="720"/>
-      </w:pPr>
-      <w:r>
-        <w:t xml:space="preserve">2. Agregar el Modelo de Machine </w:t>
-      </w:r>
-      <w:proofErr w:type="spellStart"/>
-      <w:r>
-        <w:t>Learning</w:t>
-      </w:r>
-      <w:proofErr w:type="spellEnd"/>
+      </w:pPr>
     </w:p>
     <w:p>
       <w:pPr>
@@ -2811,102 +1928,7 @@
       </w:pPr>
       <w:r>
         <w:rPr>
-          <w:lang w:val="es-ES"/>
-        </w:rPr>
-        <w:t xml:space="preserve">En el panel del Explorador de Soluciones (generalmente a la derecha), haz clic derecho sobre el proyecto </w:t>
-      </w:r>
-      <w:proofErr w:type="spellStart"/>
-      <w:r>
-        <w:rPr>
-          <w:lang w:val="es-ES"/>
-        </w:rPr>
-        <w:t>SalesPredictionApp</w:t>
-      </w:r>
-      <w:proofErr w:type="spellEnd"/>
-      <w:r>
-        <w:rPr>
-          <w:lang w:val="es-ES"/>
-        </w:rPr>
-        <w:t>.</w:t>
-      </w:r>
-    </w:p>
-    <w:p>
-      <w:pPr>
-        <w:rPr>
-          <w:lang w:val="en-US"/>
-        </w:rPr>
-      </w:pPr>
-      <w:proofErr w:type="spellStart"/>
-      <w:r>
-        <w:rPr>
-          <w:lang w:val="en-US"/>
-        </w:rPr>
-        <w:t>Selecciona</w:t>
-      </w:r>
-      <w:proofErr w:type="spellEnd"/>
-      <w:r>
-        <w:rPr>
-          <w:lang w:val="en-US"/>
-        </w:rPr>
-        <w:t xml:space="preserve"> </w:t>
-      </w:r>
-      <w:proofErr w:type="spellStart"/>
-      <w:r>
-        <w:rPr>
-          <w:lang w:val="en-US"/>
-        </w:rPr>
-        <w:t>Agregar</w:t>
-      </w:r>
-      <w:proofErr w:type="spellEnd"/>
-      <w:r>
-        <w:rPr>
-          <w:lang w:val="en-US"/>
-        </w:rPr>
-        <w:t xml:space="preserve"> &gt; Modelo de Machine Learning... (o Add &gt; Machine Learning Model).</w:t>
-      </w:r>
-    </w:p>
-    <w:p>
-      <w:pPr>
-        <w:rPr>
-          <w:lang w:val="es-ES"/>
-        </w:rPr>
-      </w:pPr>
-      <w:r>
-        <w:rPr>
-          <w:lang w:val="es-ES"/>
-        </w:rPr>
-        <w:t xml:space="preserve">Visual Studio te pedirá que le asignes un nombre al modelo. Puedes llamarlo </w:t>
-      </w:r>
-      <w:proofErr w:type="spellStart"/>
-      <w:r>
-        <w:rPr>
-          <w:lang w:val="es-ES"/>
-        </w:rPr>
-        <w:t>SalesModel.mbconfig</w:t>
-      </w:r>
-      <w:proofErr w:type="spellEnd"/>
-      <w:r>
-        <w:rPr>
-          <w:lang w:val="es-ES"/>
-        </w:rPr>
-        <w:t xml:space="preserve"> y darle a Agregar.</w:t>
-      </w:r>
-    </w:p>
-    <w:p>
-      <w:pPr>
-        <w:rPr>
-          <w:lang w:val="es-ES"/>
-        </w:rPr>
-      </w:pPr>
-    </w:p>
-    <w:p>
-      <w:pPr>
-        <w:rPr>
-          <w:lang w:val="es-ES"/>
-        </w:rPr>
-      </w:pPr>
-      <w:r>
-        <w:rPr>
+          <w:noProof/>
           <w:lang w:val="es-ES"/>
         </w:rPr>
         <w:drawing>
@@ -2925,7 +1947,7 @@
                     <pic:cNvPicPr/>
                   </pic:nvPicPr>
                   <pic:blipFill>
-                    <a:blip r:embed="rId9"/>
+                    <a:blip r:embed="rId10"/>
                     <a:stretch>
                       <a:fillRect/>
                     </a:stretch>
@@ -2952,15 +1974,10 @@
         <w:ind w:left="720"/>
       </w:pPr>
       <w:r>
-        <w:t>3. Elegir el Escenario (</w:t>
+        <w:t>7.</w:t>
       </w:r>
-      <w:proofErr w:type="spellStart"/>
       <w:r>
-        <w:t>Scenario</w:t>
-      </w:r>
-      <w:proofErr w:type="spellEnd"/>
-      <w:r>
-        <w:t>)</w:t>
+        <w:t>3. Elegir el Escenario (Scenario)</w:t>
       </w:r>
     </w:p>
     <w:p/>
@@ -2974,62 +1991,20 @@
         <w:rPr>
           <w:lang w:val="es-ES"/>
         </w:rPr>
-        <w:t xml:space="preserve">Se abrirá la interfaz del Model </w:t>
+        <w:t>Se abrirá la interfaz del Model Builder.</w:t>
       </w:r>
-      <w:proofErr w:type="spellStart"/>
+    </w:p>
+    <w:p>
+      <w:pPr>
+        <w:rPr>
+          <w:lang w:val="es-ES"/>
+        </w:rPr>
+      </w:pPr>
       <w:r>
         <w:rPr>
           <w:lang w:val="es-ES"/>
         </w:rPr>
-        <w:t>Builder</w:t>
-      </w:r>
-      <w:proofErr w:type="spellEnd"/>
-      <w:r>
-        <w:rPr>
-          <w:lang w:val="es-ES"/>
-        </w:rPr>
-        <w:t>.</w:t>
-      </w:r>
-    </w:p>
-    <w:p>
-      <w:pPr>
-        <w:rPr>
-          <w:lang w:val="es-ES"/>
-        </w:rPr>
-      </w:pPr>
-      <w:r>
-        <w:rPr>
-          <w:lang w:val="es-ES"/>
-        </w:rPr>
-        <w:t>En la pantalla de escenarios, selecciona Predicción de valor (</w:t>
-      </w:r>
-      <w:proofErr w:type="spellStart"/>
-      <w:r>
-        <w:rPr>
-          <w:lang w:val="es-ES"/>
-        </w:rPr>
-        <w:t>Value</w:t>
-      </w:r>
-      <w:proofErr w:type="spellEnd"/>
-      <w:r>
-        <w:rPr>
-          <w:lang w:val="es-ES"/>
-        </w:rPr>
-        <w:t xml:space="preserve"> </w:t>
-      </w:r>
-      <w:proofErr w:type="spellStart"/>
-      <w:r>
-        <w:rPr>
-          <w:lang w:val="es-ES"/>
-        </w:rPr>
-        <w:t>Prediction</w:t>
-      </w:r>
-      <w:proofErr w:type="spellEnd"/>
-      <w:r>
-        <w:rPr>
-          <w:lang w:val="es-ES"/>
-        </w:rPr>
-        <w:t xml:space="preserve"> / Regresión). Esto se debe a que queremos predecir un valor numérico continuo (el total de las ventas).</w:t>
+        <w:t>En la pantalla de escenarios, selecciona Predicción de valor (Value Prediction / Regresión). Esto se debe a que queremos predecir un valor numérico continuo (el total de las ventas).</w:t>
       </w:r>
     </w:p>
     <w:p>
@@ -3066,7 +2041,7 @@
                     <pic:cNvPicPr/>
                   </pic:nvPicPr>
                   <pic:blipFill>
-                    <a:blip r:embed="rId10"/>
+                    <a:blip r:embed="rId11"/>
                     <a:stretch>
                       <a:fillRect/>
                     </a:stretch>
@@ -3093,15 +2068,10 @@
         <w:ind w:left="720"/>
       </w:pPr>
       <w:r>
-        <w:t>4. Entorno de Entrenamiento (</w:t>
+        <w:t>7.</w:t>
       </w:r>
-      <w:proofErr w:type="spellStart"/>
       <w:r>
-        <w:t>Environment</w:t>
-      </w:r>
-      <w:proofErr w:type="spellEnd"/>
-      <w:r>
-        <w:t>)</w:t>
+        <w:t>4. Entorno de Entrenamiento (Environment)</w:t>
       </w:r>
     </w:p>
     <w:p>
@@ -3151,7 +2121,7 @@
                     <pic:cNvPicPr/>
                   </pic:nvPicPr>
                   <pic:blipFill>
-                    <a:blip r:embed="rId11"/>
+                    <a:blip r:embed="rId12"/>
                     <a:stretch>
                       <a:fillRect/>
                     </a:stretch>
@@ -3178,6 +2148,9 @@
         <w:ind w:left="720"/>
       </w:pPr>
       <w:r>
+        <w:t>7.</w:t>
+      </w:r>
+      <w:r>
         <w:t>5. Cargar los Datos (Data)</w:t>
       </w:r>
     </w:p>
@@ -3204,75 +2177,33 @@
         <w:rPr>
           <w:lang w:val="es-ES"/>
         </w:rPr>
-        <w:t>Haz clic en Examinar (</w:t>
+        <w:t>Haz clic en Examinar (Browse) y selecciona el archivo ventas_sinteticas_2025.csv que generamos en el paso anterior.</w:t>
       </w:r>
-      <w:proofErr w:type="spellStart"/>
+    </w:p>
+    <w:p>
+      <w:pPr>
+        <w:rPr>
+          <w:lang w:val="es-ES"/>
+        </w:rPr>
+      </w:pPr>
       <w:r>
         <w:rPr>
           <w:lang w:val="es-ES"/>
         </w:rPr>
-        <w:t>Browse</w:t>
+        <w:t>El Model Builder cargará una vista previa de las columnas.</w:t>
       </w:r>
-      <w:proofErr w:type="spellEnd"/>
+    </w:p>
+    <w:p>
+      <w:pPr>
+        <w:rPr>
+          <w:lang w:val="es-ES"/>
+        </w:rPr>
+      </w:pPr>
       <w:r>
         <w:rPr>
           <w:lang w:val="es-ES"/>
         </w:rPr>
-        <w:t>) y selecciona el archivo ventas_sinteticas_2025.csv que generamos en el paso anterior.</w:t>
-      </w:r>
-    </w:p>
-    <w:p>
-      <w:pPr>
-        <w:rPr>
-          <w:lang w:val="es-ES"/>
-        </w:rPr>
-      </w:pPr>
-      <w:r>
-        <w:rPr>
-          <w:lang w:val="es-ES"/>
-        </w:rPr>
-        <w:t xml:space="preserve">El Model </w:t>
-      </w:r>
-      <w:proofErr w:type="spellStart"/>
-      <w:r>
-        <w:rPr>
-          <w:lang w:val="es-ES"/>
-        </w:rPr>
-        <w:t>Builder</w:t>
-      </w:r>
-      <w:proofErr w:type="spellEnd"/>
-      <w:r>
-        <w:rPr>
-          <w:lang w:val="es-ES"/>
-        </w:rPr>
-        <w:t xml:space="preserve"> cargará una vista previa de las columnas.</w:t>
-      </w:r>
-    </w:p>
-    <w:p>
-      <w:pPr>
-        <w:rPr>
-          <w:lang w:val="es-ES"/>
-        </w:rPr>
-      </w:pPr>
-      <w:r>
-        <w:rPr>
-          <w:lang w:val="es-ES"/>
-        </w:rPr>
-        <w:t xml:space="preserve">En el menú desplegable "Columna que se va a predecir (Label)", selecciona la columna </w:t>
-      </w:r>
-      <w:proofErr w:type="spellStart"/>
-      <w:r>
-        <w:rPr>
-          <w:lang w:val="es-ES"/>
-        </w:rPr>
-        <w:t>total_sales</w:t>
-      </w:r>
-      <w:proofErr w:type="spellEnd"/>
-      <w:r>
-        <w:rPr>
-          <w:lang w:val="es-ES"/>
-        </w:rPr>
-        <w:t>.</w:t>
+        <w:t>En el menú desplegable "Columna que se va a predecir (Label)", selecciona la columna total_sales.</w:t>
       </w:r>
     </w:p>
     <w:p>
@@ -3301,7 +2232,7 @@
                     <pic:cNvPicPr/>
                   </pic:nvPicPr>
                   <pic:blipFill>
-                    <a:blip r:embed="rId12"/>
+                    <a:blip r:embed="rId13"/>
                     <a:stretch>
                       <a:fillRect/>
                     </a:stretch>
@@ -3336,6 +2267,9 @@
       </w:pPr>
       <w:r>
         <w:lastRenderedPageBreak/>
+        <w:t>7.</w:t>
+      </w:r>
+      <w:r>
         <w:t>6. Entrenar el Modelo (Train)</w:t>
       </w:r>
     </w:p>
@@ -3375,49 +2309,7 @@
         <w:rPr>
           <w:lang w:val="es-ES"/>
         </w:rPr>
-        <w:t xml:space="preserve">ML.NET probará internamente varios algoritmos de regresión (como </w:t>
-      </w:r>
-      <w:proofErr w:type="spellStart"/>
-      <w:r>
-        <w:rPr>
-          <w:lang w:val="es-ES"/>
-        </w:rPr>
-        <w:t>LightGBM</w:t>
-      </w:r>
-      <w:proofErr w:type="spellEnd"/>
-      <w:r>
-        <w:rPr>
-          <w:lang w:val="es-ES"/>
-        </w:rPr>
-        <w:t xml:space="preserve">, </w:t>
-      </w:r>
-      <w:proofErr w:type="spellStart"/>
-      <w:r>
-        <w:rPr>
-          <w:lang w:val="es-ES"/>
-        </w:rPr>
-        <w:t>FastTree</w:t>
-      </w:r>
-      <w:proofErr w:type="spellEnd"/>
-      <w:r>
-        <w:rPr>
-          <w:lang w:val="es-ES"/>
-        </w:rPr>
-        <w:t xml:space="preserve">, </w:t>
-      </w:r>
-      <w:proofErr w:type="spellStart"/>
-      <w:r>
-        <w:rPr>
-          <w:lang w:val="es-ES"/>
-        </w:rPr>
-        <w:t>LbfgsPoissonRegression</w:t>
-      </w:r>
-      <w:proofErr w:type="spellEnd"/>
-      <w:r>
-        <w:rPr>
-          <w:lang w:val="es-ES"/>
-        </w:rPr>
-        <w:t>, etc.) y escogerá automáticamente el que tenga mejor rendimiento.</w:t>
+        <w:t>ML.NET probará internamente varios algoritmos de regresión (como LightGBM, FastTree, LbfgsPoissonRegression, etc.) y escogerá automáticamente el que tenga mejor rendimiento.</w:t>
       </w:r>
     </w:p>
     <w:p>
@@ -3453,7 +2345,7 @@
                     <pic:cNvPicPr/>
                   </pic:nvPicPr>
                   <pic:blipFill>
-                    <a:blip r:embed="rId13"/>
+                    <a:blip r:embed="rId14"/>
                     <a:stretch>
                       <a:fillRect/>
                     </a:stretch>
@@ -3487,15 +2379,10 @@
         <w:ind w:left="720"/>
       </w:pPr>
       <w:r>
-        <w:t>7. Evaluar (</w:t>
+        <w:t>7.</w:t>
       </w:r>
-      <w:proofErr w:type="spellStart"/>
       <w:r>
-        <w:t>Evaluate</w:t>
-      </w:r>
-      <w:proofErr w:type="spellEnd"/>
-      <w:r>
-        <w:t>)</w:t>
+        <w:t>7. Evaluar (Evaluate)</w:t>
       </w:r>
     </w:p>
     <w:p>
@@ -3534,48 +2421,20 @@
         <w:rPr>
           <w:lang w:val="es-ES"/>
         </w:rPr>
-        <w:t>R-cuadrado (R-</w:t>
+        <w:t>R-cuadrado (R-Squared): Mide la precisión general (mientras más cercano a 1, mejor). Debería ser alto ya que nuestra data sintética sigue reglas lógicas fuertes.</w:t>
       </w:r>
-      <w:proofErr w:type="spellStart"/>
+    </w:p>
+    <w:p>
+      <w:pPr>
+        <w:rPr>
+          <w:lang w:val="es-ES"/>
+        </w:rPr>
+      </w:pPr>
       <w:r>
         <w:rPr>
           <w:lang w:val="es-ES"/>
         </w:rPr>
-        <w:t>Squared</w:t>
-      </w:r>
-      <w:proofErr w:type="spellEnd"/>
-      <w:r>
-        <w:rPr>
-          <w:lang w:val="es-ES"/>
-        </w:rPr>
-        <w:t>): Mide la precisión general (mientras más cercano a 1, mejor). Debería ser alto ya que nuestra data sintética sigue reglas lógicas fuertes.</w:t>
-      </w:r>
-    </w:p>
-    <w:p>
-      <w:pPr>
-        <w:rPr>
-          <w:lang w:val="es-ES"/>
-        </w:rPr>
-      </w:pPr>
-      <w:r>
-        <w:rPr>
-          <w:lang w:val="es-ES"/>
-        </w:rPr>
-        <w:t>Error cuadrático medio (</w:t>
-      </w:r>
-      <w:proofErr w:type="spellStart"/>
-      <w:r>
-        <w:rPr>
-          <w:lang w:val="es-ES"/>
-        </w:rPr>
-        <w:t>RSquared</w:t>
-      </w:r>
-      <w:proofErr w:type="spellEnd"/>
-      <w:r>
-        <w:rPr>
-          <w:lang w:val="es-ES"/>
-        </w:rPr>
-        <w:t xml:space="preserve"> / RMSE): Mide la desviación de las predicciones en la moneda del problema.</w:t>
+        <w:t>Error cuadrático medio (RSquared / RMSE): Mide la desviación de las predicciones en la moneda del problema.</w:t>
       </w:r>
     </w:p>
     <w:p>
@@ -3588,7 +2447,6 @@
         <w:rPr>
           <w:noProof/>
         </w:rPr>
-        <w:lastRenderedPageBreak/>
         <w:drawing>
           <wp:inline distT="0" distB="0" distL="0" distR="0" wp14:anchorId="25467BCB" wp14:editId="3FCD8E5F">
             <wp:extent cx="6400800" cy="2908935"/>
@@ -3605,7 +2463,7 @@
                     <pic:cNvPicPr/>
                   </pic:nvPicPr>
                   <pic:blipFill>
-                    <a:blip r:embed="rId14"/>
+                    <a:blip r:embed="rId15"/>
                     <a:stretch>
                       <a:fillRect/>
                     </a:stretch>
@@ -3632,6 +2490,9 @@
         <w:ind w:left="720"/>
       </w:pPr>
       <w:r>
+        <w:t>7.</w:t>
+      </w:r>
+      <w:r>
         <w:t>8. Usar el Modelo (Consume)</w:t>
       </w:r>
     </w:p>
@@ -3658,62 +2519,20 @@
         <w:rPr>
           <w:lang w:val="es-ES"/>
         </w:rPr>
-        <w:t xml:space="preserve">Visual Studio automáticamente agregará un par de archivos a tu proyecto (ej. </w:t>
+        <w:t>Visual Studio automáticamente agregará un par de archivos a tu proyecto (ej. SalesModel.consumption.cs y SalesModel.training.cs).</w:t>
       </w:r>
-      <w:proofErr w:type="spellStart"/>
+    </w:p>
+    <w:p>
+      <w:pPr>
+        <w:rPr>
+          <w:lang w:val="es-ES"/>
+        </w:rPr>
+      </w:pPr>
       <w:r>
         <w:rPr>
           <w:lang w:val="es-ES"/>
         </w:rPr>
-        <w:t>SalesModel.consumption.cs</w:t>
-      </w:r>
-      <w:proofErr w:type="spellEnd"/>
-      <w:r>
-        <w:rPr>
-          <w:lang w:val="es-ES"/>
-        </w:rPr>
-        <w:t xml:space="preserve"> y </w:t>
-      </w:r>
-      <w:proofErr w:type="spellStart"/>
-      <w:r>
-        <w:rPr>
-          <w:lang w:val="es-ES"/>
-        </w:rPr>
-        <w:t>SalesModel.training.cs</w:t>
-      </w:r>
-      <w:proofErr w:type="spellEnd"/>
-      <w:r>
-        <w:rPr>
-          <w:lang w:val="es-ES"/>
-        </w:rPr>
-        <w:t>).</w:t>
-      </w:r>
-    </w:p>
-    <w:p>
-      <w:pPr>
-        <w:rPr>
-          <w:lang w:val="es-ES"/>
-        </w:rPr>
-      </w:pPr>
-      <w:r>
-        <w:rPr>
-          <w:lang w:val="es-ES"/>
-        </w:rPr>
-        <w:t xml:space="preserve">Puedes copiar el bloque de código de ejemplo que te da la herramienta, pegarlo en tu archivo </w:t>
-      </w:r>
-      <w:proofErr w:type="spellStart"/>
-      <w:r>
-        <w:rPr>
-          <w:lang w:val="es-ES"/>
-        </w:rPr>
-        <w:t>Program.cs</w:t>
-      </w:r>
-      <w:proofErr w:type="spellEnd"/>
-      <w:r>
-        <w:rPr>
-          <w:lang w:val="es-ES"/>
-        </w:rPr>
-        <w:t xml:space="preserve"> y modificar los valores para hacer una prueba manual rápida, o generar el archivo de salida con todo el listado de ventas (Requisito #8 de la tarea).</w:t>
+        <w:t>Puedes copiar el bloque de código de ejemplo que te da la herramienta, pegarlo en tu archivo Program.cs y modificar los valores para hacer una prueba manual rápida, o generar el archivo de salida con todo el listado de ventas (Requisito #8 de la tarea).</w:t>
       </w:r>
     </w:p>
     <w:p>
@@ -3784,7 +2603,6 @@
             <w:vAlign w:val="center"/>
           </w:tcPr>
           <w:p>
-            <w:proofErr w:type="spellStart"/>
             <w:r>
               <w:rPr>
                 <w:b/>
@@ -3793,7 +2611,6 @@
               </w:rPr>
               <w:t>sale_date</w:t>
             </w:r>
-            <w:proofErr w:type="spellEnd"/>
           </w:p>
         </w:tc>
         <w:tc>
@@ -3803,7 +2620,6 @@
             <w:vAlign w:val="center"/>
           </w:tcPr>
           <w:p>
-            <w:proofErr w:type="spellStart"/>
             <w:r>
               <w:rPr>
                 <w:b/>
@@ -3812,7 +2628,6 @@
               </w:rPr>
               <w:t>product_name</w:t>
             </w:r>
-            <w:proofErr w:type="spellEnd"/>
           </w:p>
         </w:tc>
         <w:tc>
@@ -3822,7 +2637,6 @@
             <w:vAlign w:val="center"/>
           </w:tcPr>
           <w:p>
-            <w:proofErr w:type="spellStart"/>
             <w:r>
               <w:rPr>
                 <w:b/>
@@ -3831,7 +2645,6 @@
               </w:rPr>
               <w:t>category_name</w:t>
             </w:r>
-            <w:proofErr w:type="spellEnd"/>
           </w:p>
         </w:tc>
         <w:tc>
@@ -3841,7 +2654,6 @@
             <w:vAlign w:val="center"/>
           </w:tcPr>
           <w:p>
-            <w:proofErr w:type="spellStart"/>
             <w:r>
               <w:rPr>
                 <w:b/>
@@ -3850,7 +2662,6 @@
               </w:rPr>
               <w:t>zone_name</w:t>
             </w:r>
-            <w:proofErr w:type="spellEnd"/>
           </w:p>
         </w:tc>
         <w:tc>
@@ -3860,7 +2671,6 @@
             <w:vAlign w:val="center"/>
           </w:tcPr>
           <w:p>
-            <w:proofErr w:type="spellStart"/>
             <w:r>
               <w:rPr>
                 <w:b/>
@@ -3869,7 +2679,6 @@
               </w:rPr>
               <w:t>salesman_name</w:t>
             </w:r>
-            <w:proofErr w:type="spellEnd"/>
           </w:p>
         </w:tc>
         <w:tc>
@@ -3879,7 +2688,6 @@
             <w:vAlign w:val="center"/>
           </w:tcPr>
           <w:p>
-            <w:proofErr w:type="spellStart"/>
             <w:r>
               <w:rPr>
                 <w:b/>
@@ -3888,7 +2696,6 @@
               </w:rPr>
               <w:t>warehouse_name</w:t>
             </w:r>
-            <w:proofErr w:type="spellEnd"/>
           </w:p>
         </w:tc>
         <w:tc>
@@ -3898,7 +2705,6 @@
             <w:vAlign w:val="center"/>
           </w:tcPr>
           <w:p>
-            <w:proofErr w:type="spellStart"/>
             <w:r>
               <w:rPr>
                 <w:b/>
@@ -3907,7 +2713,6 @@
               </w:rPr>
               <w:t>real_sales</w:t>
             </w:r>
-            <w:proofErr w:type="spellEnd"/>
           </w:p>
         </w:tc>
         <w:tc>
@@ -3917,7 +2722,6 @@
             <w:vAlign w:val="center"/>
           </w:tcPr>
           <w:p>
-            <w:proofErr w:type="spellStart"/>
             <w:r>
               <w:rPr>
                 <w:b/>
@@ -3926,7 +2730,6 @@
               </w:rPr>
               <w:t>predicted_sales</w:t>
             </w:r>
-            <w:proofErr w:type="spellEnd"/>
           </w:p>
         </w:tc>
         <w:tc>
@@ -3936,7 +2739,6 @@
             <w:vAlign w:val="center"/>
           </w:tcPr>
           <w:p>
-            <w:proofErr w:type="spellStart"/>
             <w:r>
               <w:rPr>
                 <w:b/>
@@ -3945,7 +2747,6 @@
               </w:rPr>
               <w:t>difference</w:t>
             </w:r>
-            <w:proofErr w:type="spellEnd"/>
           </w:p>
         </w:tc>
         <w:tc>
@@ -3955,7 +2756,6 @@
             <w:vAlign w:val="center"/>
           </w:tcPr>
           <w:p>
-            <w:proofErr w:type="spellStart"/>
             <w:r>
               <w:rPr>
                 <w:b/>
@@ -3964,7 +2764,6 @@
               </w:rPr>
               <w:t>percentage_error</w:t>
             </w:r>
-            <w:proofErr w:type="spellEnd"/>
           </w:p>
         </w:tc>
       </w:tr>
@@ -4223,13 +3022,8 @@
       <w:pPr>
         <w:pStyle w:val="ListBullet"/>
       </w:pPr>
-      <w:proofErr w:type="spellStart"/>
       <w:r>
-        <w:t>Prompt</w:t>
-      </w:r>
-      <w:proofErr w:type="spellEnd"/>
-      <w:r>
-        <w:t xml:space="preserve"> utilizado para generar la data sintética.</w:t>
+        <w:t>Prompt utilizado para generar la data sintética.</w:t>
       </w:r>
     </w:p>
     <w:p>
@@ -4245,15 +3039,7 @@
         <w:pStyle w:val="ListBullet"/>
       </w:pPr>
       <w:r>
-        <w:t xml:space="preserve">Capturas del proceso de entrenamiento en ML.NET Model </w:t>
-      </w:r>
-      <w:proofErr w:type="spellStart"/>
-      <w:r>
-        <w:t>Builder</w:t>
-      </w:r>
-      <w:proofErr w:type="spellEnd"/>
-      <w:r>
-        <w:t>.</w:t>
+        <w:t>Capturas del proceso de entrenamiento en ML.NET Model Builder.</w:t>
       </w:r>
     </w:p>
     <w:p>
@@ -4289,35 +3075,13 @@
         <w:rPr>
           <w:lang w:val="en-US"/>
         </w:rPr>
-        <w:t xml:space="preserve"> </w:t>
+        <w:t xml:space="preserve"> Html ,</w:t>
       </w:r>
-      <w:proofErr w:type="gramStart"/>
       <w:r>
         <w:rPr>
           <w:lang w:val="en-US"/>
         </w:rPr>
-        <w:t>Html ,</w:t>
-      </w:r>
-      <w:proofErr w:type="gramEnd"/>
-      <w:r>
-        <w:rPr>
-          <w:lang w:val="en-US"/>
-        </w:rPr>
-        <w:t xml:space="preserve"> Excel </w:t>
-      </w:r>
-      <w:proofErr w:type="gramStart"/>
-      <w:r>
-        <w:rPr>
-          <w:lang w:val="en-US"/>
-        </w:rPr>
-        <w:t>o Power</w:t>
-      </w:r>
-      <w:proofErr w:type="gramEnd"/>
-      <w:r>
-        <w:rPr>
-          <w:lang w:val="en-US"/>
-        </w:rPr>
-        <w:t xml:space="preserve"> BI.</w:t>
+        <w:t xml:space="preserve"> Excel o Power BI.</w:t>
       </w:r>
     </w:p>
     <w:p>
@@ -4341,6 +3105,7 @@
         <w:pStyle w:val="Heading1"/>
       </w:pPr>
       <w:r>
+        <w:lastRenderedPageBreak/>
         <w:t>1</w:t>
       </w:r>
       <w:r>
@@ -4395,16 +3160,7 @@
         <w:pStyle w:val="ListBullet"/>
       </w:pPr>
       <w:r>
-        <w:lastRenderedPageBreak/>
-        <w:t xml:space="preserve">¿Qué decisiones podría tomar la empresa con base en el </w:t>
-      </w:r>
-      <w:proofErr w:type="spellStart"/>
-      <w:r>
-        <w:t>dashboard</w:t>
-      </w:r>
-      <w:proofErr w:type="spellEnd"/>
-      <w:r>
-        <w:t>?</w:t>
+        <w:t>¿Qué decisiones podría tomar la empresa con base en el dashboard?</w:t>
       </w:r>
     </w:p>
     <w:p>
@@ -4525,23 +3281,13 @@
             <w:vAlign w:val="center"/>
           </w:tcPr>
           <w:p>
-            <w:proofErr w:type="spellStart"/>
             <w:r>
               <w:rPr>
                 <w:b/>
                 <w:color w:val="1F4E79"/>
                 <w:sz w:val="16"/>
               </w:rPr>
-              <w:t>Prompt</w:t>
-            </w:r>
-            <w:proofErr w:type="spellEnd"/>
-            <w:r>
-              <w:rPr>
-                <w:b/>
-                <w:color w:val="1F4E79"/>
-                <w:sz w:val="16"/>
-              </w:rPr>
-              <w:t xml:space="preserve"> y generación de datos</w:t>
+              <w:t>Prompt y generación de datos</w:t>
             </w:r>
           </w:p>
         </w:tc>
@@ -4565,19 +3311,11 @@
             <w:vAlign w:val="center"/>
           </w:tcPr>
           <w:p>
-            <w:proofErr w:type="spellStart"/>
             <w:r>
               <w:rPr>
                 <w:sz w:val="16"/>
               </w:rPr>
-              <w:t>Prompt</w:t>
-            </w:r>
-            <w:proofErr w:type="spellEnd"/>
-            <w:r>
-              <w:rPr>
-                <w:sz w:val="16"/>
-              </w:rPr>
-              <w:t xml:space="preserve"> claro, completo y data realista.</w:t>
+              <w:t>Prompt claro, completo y data realista.</w:t>
             </w:r>
           </w:p>
         </w:tc>
@@ -4587,19 +3325,11 @@
             <w:vAlign w:val="center"/>
           </w:tcPr>
           <w:p>
-            <w:proofErr w:type="spellStart"/>
             <w:r>
               <w:rPr>
                 <w:sz w:val="16"/>
               </w:rPr>
-              <w:t>Prompt</w:t>
-            </w:r>
-            <w:proofErr w:type="spellEnd"/>
-            <w:r>
-              <w:rPr>
-                <w:sz w:val="16"/>
-              </w:rPr>
-              <w:t xml:space="preserve"> básico con data suficiente.</w:t>
+              <w:t>Prompt básico con data suficiente.</w:t>
             </w:r>
           </w:p>
         </w:tc>
@@ -4683,18 +3413,8 @@
                 <w:color w:val="1F4E79"/>
                 <w:sz w:val="16"/>
               </w:rPr>
-              <w:t xml:space="preserve">Uso de ML.NET Model </w:t>
+              <w:t>Uso de ML.NET Model Builder</w:t>
             </w:r>
-            <w:proofErr w:type="spellStart"/>
-            <w:r>
-              <w:rPr>
-                <w:b/>
-                <w:color w:val="1F4E79"/>
-                <w:sz w:val="16"/>
-              </w:rPr>
-              <w:t>Builder</w:t>
-            </w:r>
-            <w:proofErr w:type="spellEnd"/>
           </w:p>
         </w:tc>
         <w:tc>
@@ -4813,7 +3533,6 @@
             <w:vAlign w:val="center"/>
           </w:tcPr>
           <w:p>
-            <w:proofErr w:type="spellStart"/>
             <w:r>
               <w:rPr>
                 <w:b/>
@@ -4822,7 +3541,6 @@
               </w:rPr>
               <w:t>Dashboard</w:t>
             </w:r>
-            <w:proofErr w:type="spellEnd"/>
           </w:p>
         </w:tc>
         <w:tc>
@@ -4859,19 +3577,11 @@
             <w:vAlign w:val="center"/>
           </w:tcPr>
           <w:p>
-            <w:proofErr w:type="spellStart"/>
             <w:r>
               <w:rPr>
                 <w:sz w:val="16"/>
               </w:rPr>
-              <w:t>Dashboard</w:t>
-            </w:r>
-            <w:proofErr w:type="spellEnd"/>
-            <w:r>
-              <w:rPr>
-                <w:sz w:val="16"/>
-              </w:rPr>
-              <w:t xml:space="preserve"> básico con gráficos generales.</w:t>
+              <w:t>Dashboard básico con gráficos generales.</w:t>
             </w:r>
           </w:p>
         </w:tc>
@@ -4976,23 +3686,7 @@
         <w:pStyle w:val="ListBullet"/>
       </w:pPr>
       <w:r>
-        <w:t xml:space="preserve">El </w:t>
-      </w:r>
-      <w:proofErr w:type="spellStart"/>
-      <w:r>
-        <w:t>dashboard</w:t>
-      </w:r>
-      <w:proofErr w:type="spellEnd"/>
-      <w:r>
-        <w:t xml:space="preserve"> debe estar en formato .xlsx o .</w:t>
-      </w:r>
-      <w:proofErr w:type="spellStart"/>
-      <w:r>
-        <w:t>pbix</w:t>
-      </w:r>
-      <w:proofErr w:type="spellEnd"/>
-      <w:r>
-        <w:t>.</w:t>
+        <w:t>El dashboard debe estar en formato .xlsx o .pbix.</w:t>
       </w:r>
     </w:p>
     <w:p>
@@ -5062,49 +3756,7 @@
               <w:rPr>
                 <w:sz w:val="18"/>
               </w:rPr>
-              <w:t xml:space="preserve">En esta tarea, los estudiantes deberán generar una base de datos sintética de ventas mediante un </w:t>
-            </w:r>
-            <w:proofErr w:type="spellStart"/>
-            <w:r>
-              <w:rPr>
-                <w:sz w:val="18"/>
-              </w:rPr>
-              <w:t>prompt</w:t>
-            </w:r>
-            <w:proofErr w:type="spellEnd"/>
-            <w:r>
-              <w:rPr>
-                <w:sz w:val="18"/>
-              </w:rPr>
-              <w:t xml:space="preserve"> de inteligencia artificial. Luego usarán ML.NET Model </w:t>
-            </w:r>
-            <w:proofErr w:type="spellStart"/>
-            <w:r>
-              <w:rPr>
-                <w:sz w:val="18"/>
-              </w:rPr>
-              <w:t>Builder</w:t>
-            </w:r>
-            <w:proofErr w:type="spellEnd"/>
-            <w:r>
-              <w:rPr>
-                <w:sz w:val="18"/>
-              </w:rPr>
-              <w:t xml:space="preserve"> en Visual Studio para entrenar visualmente un modelo de predicción de ventas, sin necesidad de programación avanzada. Finalmente, deberán construir un </w:t>
-            </w:r>
-            <w:proofErr w:type="spellStart"/>
-            <w:r>
-              <w:rPr>
-                <w:sz w:val="18"/>
-              </w:rPr>
-              <w:t>dashboard</w:t>
-            </w:r>
-            <w:proofErr w:type="spellEnd"/>
-            <w:r>
-              <w:rPr>
-                <w:sz w:val="18"/>
-              </w:rPr>
-              <w:t xml:space="preserve"> en Excel o Power BI que compare ventas reales y ventas predichas, identificando tendencias, errores y recomendaciones de negocio.</w:t>
+              <w:t>En esta tarea, los estudiantes deberán generar una base de datos sintética de ventas mediante un prompt de inteligencia artificial. Luego usarán ML.NET Model Builder en Visual Studio para entrenar visualmente un modelo de predicción de ventas, sin necesidad de programación avanzada. Finalmente, deberán construir un dashboard en Excel o Power BI que compare ventas reales y ventas predichas, identificando tendencias, errores y recomendaciones de negocio.</w:t>
             </w:r>
           </w:p>
         </w:tc>
@@ -5112,8 +3764,8 @@
     </w:tbl>
     <w:p/>
     <w:sectPr>
-      <w:headerReference w:type="default" r:id="rId15"/>
-      <w:footerReference w:type="default" r:id="rId16"/>
+      <w:headerReference w:type="default" r:id="rId16"/>
+      <w:footerReference w:type="default" r:id="rId17"/>
       <w:pgSz w:w="12240" w:h="15840"/>
       <w:pgMar w:top="936" w:right="1080" w:bottom="936" w:left="1080" w:header="720" w:footer="720" w:gutter="0"/>
       <w:cols w:space="720"/>
@@ -5606,41 +4258,13 @@
               <w:szCs w:val="14"/>
             </w:rPr>
           </w:pPr>
-          <w:proofErr w:type="spellStart"/>
           <w:r>
             <w:rPr>
               <w:color w:val="000000"/>
               <w:sz w:val="14"/>
               <w:szCs w:val="14"/>
             </w:rPr>
-            <w:t>Nº</w:t>
-          </w:r>
-          <w:proofErr w:type="spellEnd"/>
-          <w:r>
-            <w:rPr>
-              <w:color w:val="000000"/>
-              <w:sz w:val="14"/>
-              <w:szCs w:val="14"/>
-            </w:rPr>
-            <w:t xml:space="preserve"> de </w:t>
-          </w:r>
-          <w:proofErr w:type="spellStart"/>
-          <w:r>
-            <w:rPr>
-              <w:color w:val="000000"/>
-              <w:sz w:val="14"/>
-              <w:szCs w:val="14"/>
-            </w:rPr>
-            <w:t>Revision</w:t>
-          </w:r>
-          <w:proofErr w:type="spellEnd"/>
-          <w:r>
-            <w:rPr>
-              <w:color w:val="000000"/>
-              <w:sz w:val="14"/>
-              <w:szCs w:val="14"/>
-            </w:rPr>
-            <w:t>:</w:t>
+            <w:t>Nº de Revision:</w:t>
           </w:r>
         </w:p>
       </w:tc>

</xml_diff>